<commit_message>
Code Finalized + Report Finalized
</commit_message>
<xml_diff>
--- a/Multivariate_Data_Analysis_Project/AMD_Report_fc58163_fc57490_fc66459.docx
+++ b/Multivariate_Data_Analysis_Project/AMD_Report_fc58163_fc57490_fc66459.docx
@@ -1521,7 +1521,19 @@
         <w:rPr>
           <w:rFonts w:ascii="Times New Roman" w:eastAsia="Times New Roman" w:hAnsi="Times New Roman" w:cs="Times New Roman"/>
         </w:rPr>
-        <w:t>In the current days, the air quality has become a big problem worldwide. Especially in the cities, air pollution has become a significant public health concern.</w:t>
+        <w:t xml:space="preserve">In the current days, the air quality has become a </w:t>
+      </w:r>
+      <w:r>
+        <w:rPr>
+          <w:rFonts w:ascii="Times New Roman" w:eastAsia="Times New Roman" w:hAnsi="Times New Roman" w:cs="Times New Roman"/>
+        </w:rPr>
+        <w:t>significant</w:t>
+      </w:r>
+      <w:r>
+        <w:rPr>
+          <w:rFonts w:ascii="Times New Roman" w:eastAsia="Times New Roman" w:hAnsi="Times New Roman" w:cs="Times New Roman"/>
+        </w:rPr>
+        <w:t xml:space="preserve"> problem worldwide. Especially in the cities, air pollution has become a significant public health concern.</w:t>
       </w:r>
     </w:p>
     <w:p>
@@ -1714,7 +1726,25 @@
         <w:rPr>
           <w:rFonts w:ascii="Times New Roman" w:eastAsia="Times New Roman" w:hAnsi="Times New Roman" w:cs="Times New Roman"/>
         </w:rPr>
-        <w:t>Through a preliminary analysis, we can explore the relationships between all the variables and gain an initial understanding of how these factors may influence air pollution. By applying a principal component analysis (PCA), we aim to reduce the dimensionality of the dataset and determine which combination of variables explains most of the variability in pollution levels [2]. At the end, using cluster analysis, we can group cities or regions with similar environmental and industrial profiles, allowing us to detect patterns regarding the areas more prone to higher SO2 concentrations.</w:t>
+        <w:t>Through a preliminary analysis, we can explore the relationships between all the variables and gain an initial understanding of how these factors may influen</w:t>
+      </w:r>
+      <w:r>
+        <w:rPr>
+          <w:rFonts w:ascii="Times New Roman" w:eastAsia="Times New Roman" w:hAnsi="Times New Roman" w:cs="Times New Roman"/>
+        </w:rPr>
+        <w:t xml:space="preserve">ce air pollution. By applying </w:t>
+      </w:r>
+      <w:r>
+        <w:rPr>
+          <w:rFonts w:ascii="Times New Roman" w:eastAsia="Times New Roman" w:hAnsi="Times New Roman" w:cs="Times New Roman"/>
+        </w:rPr>
+        <w:t xml:space="preserve">a </w:t>
+      </w:r>
+      <w:r>
+        <w:rPr>
+          <w:rFonts w:ascii="Times New Roman" w:eastAsia="Times New Roman" w:hAnsi="Times New Roman" w:cs="Times New Roman"/>
+        </w:rPr>
+        <w:t>principal component analysis (PCA), we aim to reduce the dimensionality of the dataset and determine which combination of variables explains most of the variability in pollution levels [2]. At the end, using cluster analysis, we can group cities or regions with similar environmental and industrial profiles, allowing us to detect patterns regarding the areas more prone to higher SO2 concentrations.</w:t>
       </w:r>
     </w:p>
     <w:p>
@@ -1726,6 +1756,8 @@
           <w:lang w:val="en-GB"/>
         </w:rPr>
       </w:pPr>
+      <w:bookmarkStart w:id="3" w:name="_GoBack"/>
+      <w:bookmarkEnd w:id="3"/>
       <w:r>
         <w:rPr>
           <w:rFonts w:eastAsia="Times New Roman"/>
@@ -1984,7 +2016,31 @@
         <w:rPr>
           <w:rFonts w:ascii="Times New Roman" w:eastAsia="Times New Roman" w:hAnsi="Times New Roman" w:cs="Times New Roman"/>
         </w:rPr>
-        <w:t xml:space="preserve">Until the 1970s, the regulation of air pollution was more specific, by states, for example, which caused the air quality to vary a lot between regions, depending on whether or not those regions had many industries and on the population density levels [4]. Over time, as scientists were trying to understand air pollution, and the emissions of pollutants were increasing, the development of air pollution legislation was also growing at all levels, mainly at the state level and city level [4]. </w:t>
+        <w:t>Until the 1970s, the regulation of air pollution was more specific, by states, for example, which caused the air quality to vary a lot between regions, depending on whether or not those regions had many industries and on the population density levels [4]. Over time, as scientists were trying to understand air pollution, and the emissions of pollutants were increasing, the development of air pollution legislation was also growing at all levels</w:t>
+      </w:r>
+      <w:r>
+        <w:rPr>
+          <w:rFonts w:ascii="Times New Roman" w:eastAsia="Times New Roman" w:hAnsi="Times New Roman" w:cs="Times New Roman"/>
+        </w:rPr>
+        <w:t xml:space="preserve">, mainly at the state and </w:t>
+      </w:r>
+      <w:r>
+        <w:rPr>
+          <w:rFonts w:ascii="Times New Roman" w:eastAsia="Times New Roman" w:hAnsi="Times New Roman" w:cs="Times New Roman"/>
+        </w:rPr>
+        <w:t>city level</w:t>
+      </w:r>
+      <w:r>
+        <w:rPr>
+          <w:rFonts w:ascii="Times New Roman" w:eastAsia="Times New Roman" w:hAnsi="Times New Roman" w:cs="Times New Roman"/>
+        </w:rPr>
+        <w:t>s</w:t>
+      </w:r>
+      <w:r>
+        <w:rPr>
+          <w:rFonts w:ascii="Times New Roman" w:eastAsia="Times New Roman" w:hAnsi="Times New Roman" w:cs="Times New Roman"/>
+        </w:rPr>
+        <w:t xml:space="preserve"> [4]. </w:t>
       </w:r>
     </w:p>
     <w:p>
@@ -2052,7 +2108,7 @@
           <w:lang w:val="en-GB"/>
         </w:rPr>
       </w:pPr>
-      <w:bookmarkStart w:id="3" w:name="_Toc216253559"/>
+      <w:bookmarkStart w:id="4" w:name="_Toc216253559"/>
       <w:r>
         <w:rPr>
           <w:rFonts w:eastAsia="Times New Roman"/>
@@ -2061,7 +2117,7 @@
         <w:lastRenderedPageBreak/>
         <w:t>Preliminary Data Analysis &amp; Pre-Processing</w:t>
       </w:r>
-      <w:bookmarkEnd w:id="3"/>
+      <w:bookmarkEnd w:id="4"/>
     </w:p>
     <w:p>
       <w:pPr>
@@ -2218,7 +2274,19 @@
         <w:rPr>
           <w:rFonts w:ascii="Times New Roman" w:eastAsia="Times New Roman" w:hAnsi="Times New Roman" w:cs="Times New Roman"/>
         </w:rPr>
-        <w:t>The standard deviation of `</w:t>
+        <w:t>The standard deviation</w:t>
+      </w:r>
+      <w:r>
+        <w:rPr>
+          <w:rFonts w:ascii="Times New Roman" w:eastAsia="Times New Roman" w:hAnsi="Times New Roman" w:cs="Times New Roman"/>
+        </w:rPr>
+        <w:t>s</w:t>
+      </w:r>
+      <w:r>
+        <w:rPr>
+          <w:rFonts w:ascii="Times New Roman" w:eastAsia="Times New Roman" w:hAnsi="Times New Roman" w:cs="Times New Roman"/>
+        </w:rPr>
+        <w:t xml:space="preserve"> of `</w:t>
       </w:r>
       <w:r>
         <w:rPr>
@@ -2527,8 +2595,6 @@
         </w:rPr>
         <w:br w:type="page"/>
       </w:r>
-      <w:bookmarkStart w:id="4" w:name="_GoBack"/>
-      <w:bookmarkEnd w:id="4"/>
     </w:p>
     <w:p>
       <w:pPr>
@@ -3966,7 +4032,21 @@
           <w:rFonts w:ascii="Times New Roman" w:eastAsia="Times New Roman" w:hAnsi="Times New Roman" w:cs="Times New Roman"/>
           <w:color w:val="1F1F1F"/>
         </w:rPr>
-        <w:t xml:space="preserve">, we can see variables that represent </w:t>
+        <w:t>, we can see variables that represent</w:t>
+      </w:r>
+      <w:r>
+        <w:rPr>
+          <w:rFonts w:ascii="Times New Roman" w:eastAsia="Times New Roman" w:hAnsi="Times New Roman" w:cs="Times New Roman"/>
+          <w:color w:val="1F1F1F"/>
+        </w:rPr>
+        <w:t xml:space="preserve"> the</w:t>
+      </w:r>
+      <w:r>
+        <w:rPr>
+          <w:rFonts w:ascii="Times New Roman" w:eastAsia="Times New Roman" w:hAnsi="Times New Roman" w:cs="Times New Roman"/>
+          <w:color w:val="1F1F1F"/>
+        </w:rPr>
+        <w:t xml:space="preserve"> </w:t>
       </w:r>
       <w:r>
         <w:rPr>
@@ -5316,15 +5396,273 @@
         </w:rPr>
         <w:t xml:space="preserve">Industrial and </w:t>
       </w:r>
+      <w:r>
+        <w:rPr>
+          <w:rFonts w:ascii="Times New Roman" w:eastAsia="Times New Roman" w:hAnsi="Times New Roman" w:cs="Times New Roman"/>
+          <w:i/>
+          <w:iCs/>
+          <w:color w:val="1F1F1F"/>
+        </w:rPr>
+        <w:t>Urbanization</w:t>
+      </w:r>
+      <w:r>
+        <w:rPr>
+          <w:rFonts w:ascii="Times New Roman" w:eastAsia="Times New Roman" w:hAnsi="Times New Roman" w:cs="Times New Roman"/>
+          <w:color w:val="1F1F1F"/>
+        </w:rPr>
+        <w:t xml:space="preserve">, Chicago was a big metropolitan area with an important industrial </w:t>
+      </w:r>
+      <w:r>
+        <w:rPr>
+          <w:rFonts w:ascii="Times New Roman" w:eastAsia="Times New Roman" w:hAnsi="Times New Roman" w:cs="Times New Roman"/>
+          <w:color w:val="1F1F1F"/>
+        </w:rPr>
+        <w:t>center</w:t>
+      </w:r>
+      <w:r>
+        <w:rPr>
+          <w:rFonts w:ascii="Times New Roman" w:eastAsia="Times New Roman" w:hAnsi="Times New Roman" w:cs="Times New Roman"/>
+          <w:color w:val="1F1F1F"/>
+        </w:rPr>
+        <w:t xml:space="preserve"> in 1970. Followed by Philadelphia as the second most important and industrial city, </w:t>
+      </w:r>
+      <w:r>
+        <w:rPr>
+          <w:rFonts w:ascii="Times New Roman" w:eastAsia="Times New Roman" w:hAnsi="Times New Roman" w:cs="Times New Roman"/>
+          <w:color w:val="1F1F1F"/>
+        </w:rPr>
+        <w:t xml:space="preserve">as </w:t>
+      </w:r>
+      <w:r>
+        <w:rPr>
+          <w:rFonts w:ascii="Times New Roman" w:eastAsia="Times New Roman" w:hAnsi="Times New Roman" w:cs="Times New Roman"/>
+          <w:color w:val="1F1F1F"/>
+        </w:rPr>
+        <w:t xml:space="preserve">explained by the PC1. On the other hand, cities like Albuquerque, Phoenix, and San Francisco show a negative score regarding the PC1 and </w:t>
+      </w:r>
+      <w:r>
+        <w:rPr>
+          <w:rFonts w:ascii="Times New Roman" w:eastAsia="Times New Roman" w:hAnsi="Times New Roman" w:cs="Times New Roman"/>
+          <w:color w:val="1F1F1F"/>
+        </w:rPr>
+        <w:lastRenderedPageBreak/>
+        <w:t>PC2, which means a low value in `</w:t>
+      </w:r>
+      <w:r>
+        <w:rPr>
+          <w:rFonts w:ascii="Times New Roman" w:eastAsia="Times New Roman" w:hAnsi="Times New Roman" w:cs="Times New Roman"/>
+          <w:b/>
+          <w:bCs/>
+          <w:color w:val="1F1F1F"/>
+        </w:rPr>
+        <w:t>pop`</w:t>
+      </w:r>
+      <w:r>
+        <w:rPr>
+          <w:rFonts w:ascii="Times New Roman" w:eastAsia="Times New Roman" w:hAnsi="Times New Roman" w:cs="Times New Roman"/>
+          <w:color w:val="1F1F1F"/>
+        </w:rPr>
+        <w:t>, `</w:t>
+      </w:r>
       <w:proofErr w:type="spellStart"/>
       <w:r>
         <w:rPr>
           <w:rFonts w:ascii="Times New Roman" w:eastAsia="Times New Roman" w:hAnsi="Times New Roman" w:cs="Times New Roman"/>
+          <w:b/>
+          <w:bCs/>
+          <w:color w:val="1F1F1F"/>
+        </w:rPr>
+        <w:t>manuf</w:t>
+      </w:r>
+      <w:proofErr w:type="spellEnd"/>
+      <w:r>
+        <w:rPr>
+          <w:rFonts w:ascii="Times New Roman" w:eastAsia="Times New Roman" w:hAnsi="Times New Roman" w:cs="Times New Roman"/>
+          <w:b/>
+          <w:bCs/>
+          <w:color w:val="1F1F1F"/>
+        </w:rPr>
+        <w:t>`</w:t>
+      </w:r>
+      <w:r>
+        <w:rPr>
+          <w:rFonts w:ascii="Times New Roman" w:eastAsia="Times New Roman" w:hAnsi="Times New Roman" w:cs="Times New Roman"/>
+          <w:color w:val="1F1F1F"/>
+        </w:rPr>
+        <w:t xml:space="preserve"> and `</w:t>
+      </w:r>
+      <w:proofErr w:type="spellStart"/>
+      <w:r>
+        <w:rPr>
+          <w:rFonts w:ascii="Times New Roman" w:eastAsia="Times New Roman" w:hAnsi="Times New Roman" w:cs="Times New Roman"/>
+          <w:b/>
+          <w:bCs/>
+          <w:color w:val="1F1F1F"/>
+        </w:rPr>
+        <w:t>precip</w:t>
+      </w:r>
+      <w:proofErr w:type="spellEnd"/>
+      <w:r>
+        <w:rPr>
+          <w:rFonts w:ascii="Times New Roman" w:eastAsia="Times New Roman" w:hAnsi="Times New Roman" w:cs="Times New Roman"/>
+          <w:b/>
+          <w:bCs/>
+          <w:color w:val="1F1F1F"/>
+        </w:rPr>
+        <w:t>`</w:t>
+      </w:r>
+      <w:r>
+        <w:rPr>
+          <w:rFonts w:ascii="Times New Roman" w:eastAsia="Times New Roman" w:hAnsi="Times New Roman" w:cs="Times New Roman"/>
+          <w:color w:val="1F1F1F"/>
+        </w:rPr>
+        <w:t xml:space="preserve"> and days respectively. This negative correlation means that in the 1970s</w:t>
+      </w:r>
+      <w:r>
+        <w:rPr>
+          <w:rFonts w:ascii="Times New Roman" w:eastAsia="Times New Roman" w:hAnsi="Times New Roman" w:cs="Times New Roman"/>
+          <w:color w:val="1F1F1F"/>
+        </w:rPr>
+        <w:t>,</w:t>
+      </w:r>
+      <w:r>
+        <w:rPr>
+          <w:rFonts w:ascii="Times New Roman" w:eastAsia="Times New Roman" w:hAnsi="Times New Roman" w:cs="Times New Roman"/>
+          <w:color w:val="1F1F1F"/>
+        </w:rPr>
+        <w:t xml:space="preserve"> these cities were less populated and smaller cities, with fewer industrial complexes and environmental impact.</w:t>
+      </w:r>
+    </w:p>
+    <w:p>
+      <w:pPr>
+        <w:jc w:val="both"/>
+        <w:rPr>
+          <w:rFonts w:ascii="Times New Roman" w:eastAsia="Times New Roman" w:hAnsi="Times New Roman" w:cs="Times New Roman"/>
+          <w:color w:val="1F1F1F"/>
+        </w:rPr>
+      </w:pPr>
+    </w:p>
+    <w:p>
+      <w:pPr>
+        <w:jc w:val="both"/>
+        <w:rPr>
+          <w:rFonts w:ascii="Times New Roman" w:eastAsia="Times New Roman" w:hAnsi="Times New Roman" w:cs="Times New Roman"/>
+          <w:color w:val="1F1F1F"/>
+        </w:rPr>
+      </w:pPr>
+      <w:r>
+        <w:rPr>
+          <w:rFonts w:ascii="Times New Roman" w:eastAsia="Times New Roman" w:hAnsi="Times New Roman" w:cs="Times New Roman"/>
+          <w:color w:val="1F1F1F"/>
+        </w:rPr>
+        <w:t>Other important cities in this case for the PC2 were Miami, Charleston, Norfolk and Buffalo. Their score regarding the PC1 was negative, implying that these cities were less populated and with a low industrial complex. However, their high score in PC2 near 2 means a high value of `</w:t>
+      </w:r>
+      <w:proofErr w:type="spellStart"/>
+      <w:r>
+        <w:rPr>
+          <w:rFonts w:ascii="Times New Roman" w:eastAsia="Times New Roman" w:hAnsi="Times New Roman" w:cs="Times New Roman"/>
+          <w:b/>
+          <w:bCs/>
+          <w:color w:val="1F1F1F"/>
+        </w:rPr>
+        <w:t>precip</w:t>
+      </w:r>
+      <w:proofErr w:type="spellEnd"/>
+      <w:r>
+        <w:rPr>
+          <w:rFonts w:ascii="Times New Roman" w:eastAsia="Times New Roman" w:hAnsi="Times New Roman" w:cs="Times New Roman"/>
+          <w:b/>
+          <w:bCs/>
+          <w:color w:val="1F1F1F"/>
+        </w:rPr>
+        <w:t>`</w:t>
+      </w:r>
+      <w:r>
+        <w:rPr>
+          <w:rFonts w:ascii="Times New Roman" w:eastAsia="Times New Roman" w:hAnsi="Times New Roman" w:cs="Times New Roman"/>
+          <w:color w:val="1F1F1F"/>
+        </w:rPr>
+        <w:t xml:space="preserve"> and `</w:t>
+      </w:r>
+      <w:r>
+        <w:rPr>
+          <w:rFonts w:ascii="Times New Roman" w:eastAsia="Times New Roman" w:hAnsi="Times New Roman" w:cs="Times New Roman"/>
+          <w:b/>
+          <w:bCs/>
+          <w:color w:val="1F1F1F"/>
+        </w:rPr>
+        <w:t>days`</w:t>
+      </w:r>
+      <w:r>
+        <w:rPr>
+          <w:rFonts w:ascii="Times New Roman" w:eastAsia="Times New Roman" w:hAnsi="Times New Roman" w:cs="Times New Roman"/>
+          <w:color w:val="1F1F1F"/>
+        </w:rPr>
+        <w:t xml:space="preserve"> in the 1970s.</w:t>
+      </w:r>
+    </w:p>
+    <w:p>
+      <w:pPr>
+        <w:jc w:val="both"/>
+        <w:rPr>
+          <w:rFonts w:ascii="Times New Roman" w:eastAsia="Times New Roman" w:hAnsi="Times New Roman" w:cs="Times New Roman"/>
+          <w:color w:val="1F1F1F"/>
+        </w:rPr>
+      </w:pPr>
+    </w:p>
+    <w:p>
+      <w:pPr>
+        <w:jc w:val="both"/>
+        <w:rPr>
+          <w:rFonts w:ascii="Times New Roman" w:eastAsia="Times New Roman" w:hAnsi="Times New Roman" w:cs="Times New Roman"/>
+          <w:color w:val="1F1F1F"/>
+        </w:rPr>
+      </w:pPr>
+      <w:r>
+        <w:rPr>
+          <w:rFonts w:ascii="Times New Roman" w:eastAsia="Times New Roman" w:hAnsi="Times New Roman" w:cs="Times New Roman"/>
+          <w:b/>
+          <w:bCs/>
           <w:i/>
           <w:iCs/>
           <w:color w:val="1F1F1F"/>
         </w:rPr>
-        <w:t>Urbanisation</w:t>
+        <w:t>Figure</w:t>
+      </w:r>
+      <w:r>
+        <w:rPr>
+          <w:rFonts w:ascii="Times New Roman" w:eastAsia="Times New Roman" w:hAnsi="Times New Roman" w:cs="Times New Roman"/>
+          <w:b/>
+          <w:bCs/>
+          <w:color w:val="1F1F1F"/>
+        </w:rPr>
+        <w:t xml:space="preserve"> </w:t>
+      </w:r>
+      <w:r>
+        <w:rPr>
+          <w:rFonts w:ascii="Times New Roman" w:eastAsia="Times New Roman" w:hAnsi="Times New Roman" w:cs="Times New Roman"/>
+          <w:b/>
+          <w:bCs/>
+          <w:i/>
+          <w:iCs/>
+          <w:color w:val="1F1F1F"/>
+        </w:rPr>
+        <w:t>4 (b)</w:t>
+      </w:r>
+      <w:r>
+        <w:rPr>
+          <w:rFonts w:ascii="Times New Roman" w:eastAsia="Times New Roman" w:hAnsi="Times New Roman" w:cs="Times New Roman"/>
+          <w:color w:val="1F1F1F"/>
+        </w:rPr>
+        <w:t xml:space="preserve"> PC1 </w:t>
+      </w:r>
+      <w:proofErr w:type="spellStart"/>
+      <w:r>
+        <w:rPr>
+          <w:rFonts w:ascii="Times New Roman" w:eastAsia="Times New Roman" w:hAnsi="Times New Roman" w:cs="Times New Roman"/>
+          <w:color w:val="1F1F1F"/>
+        </w:rPr>
+        <w:t>vs</w:t>
       </w:r>
       <w:proofErr w:type="spellEnd"/>
       <w:r>
@@ -5332,31 +5670,86 @@
           <w:rFonts w:ascii="Times New Roman" w:eastAsia="Times New Roman" w:hAnsi="Times New Roman" w:cs="Times New Roman"/>
           <w:color w:val="1F1F1F"/>
         </w:rPr>
-        <w:t xml:space="preserve">, Chicago was a big metropolitan area with an important industrial </w:t>
+        <w:t xml:space="preserve"> PC3 (Temperature), we have a positive score close to 3, for cities like Miami, being one of the main outliers for PC3. Followed by Chicago, New Orleans and Houston. Based on this, a high value in PC3 scores means high </w:t>
+      </w:r>
+      <w:r>
+        <w:rPr>
+          <w:rFonts w:ascii="Times New Roman" w:eastAsia="Times New Roman" w:hAnsi="Times New Roman" w:cs="Times New Roman"/>
+          <w:b/>
+          <w:bCs/>
+          <w:color w:val="1F1F1F"/>
+        </w:rPr>
+        <w:t>`temp`</w:t>
+      </w:r>
+      <w:r>
+        <w:rPr>
+          <w:rFonts w:ascii="Times New Roman" w:eastAsia="Times New Roman" w:hAnsi="Times New Roman" w:cs="Times New Roman"/>
+          <w:color w:val="1F1F1F"/>
+        </w:rPr>
+        <w:t xml:space="preserve"> and</w:t>
+      </w:r>
+      <w:r>
+        <w:rPr>
+          <w:rFonts w:ascii="Times New Roman" w:eastAsia="Times New Roman" w:hAnsi="Times New Roman" w:cs="Times New Roman"/>
+          <w:b/>
+          <w:bCs/>
+          <w:color w:val="1F1F1F"/>
+        </w:rPr>
+        <w:t xml:space="preserve"> `</w:t>
       </w:r>
       <w:proofErr w:type="spellStart"/>
       <w:r>
         <w:rPr>
           <w:rFonts w:ascii="Times New Roman" w:eastAsia="Times New Roman" w:hAnsi="Times New Roman" w:cs="Times New Roman"/>
-          <w:color w:val="1F1F1F"/>
-        </w:rPr>
-        <w:t>centre</w:t>
+          <w:b/>
+          <w:bCs/>
+          <w:color w:val="1F1F1F"/>
+        </w:rPr>
+        <w:t>precip</w:t>
       </w:r>
       <w:proofErr w:type="spellEnd"/>
       <w:r>
         <w:rPr>
           <w:rFonts w:ascii="Times New Roman" w:eastAsia="Times New Roman" w:hAnsi="Times New Roman" w:cs="Times New Roman"/>
-          <w:color w:val="1F1F1F"/>
-        </w:rPr>
-        <w:t xml:space="preserve"> in 1970. Followed by Philadelphia as the second most important and industrial city, explained by the PC1. On the other hand, cities like Albuquerque, Phoenix, and San Francisco show a negative score regarding the PC1 and PC2, </w:t>
-      </w:r>
-      <w:r>
-        <w:rPr>
-          <w:rFonts w:ascii="Times New Roman" w:eastAsia="Times New Roman" w:hAnsi="Times New Roman" w:cs="Times New Roman"/>
-          <w:color w:val="1F1F1F"/>
-        </w:rPr>
-        <w:lastRenderedPageBreak/>
-        <w:t>which means a low value in `</w:t>
+          <w:b/>
+          <w:bCs/>
+          <w:color w:val="1F1F1F"/>
+        </w:rPr>
+        <w:t>`</w:t>
+      </w:r>
+      <w:r>
+        <w:rPr>
+          <w:rFonts w:ascii="Times New Roman" w:eastAsia="Times New Roman" w:hAnsi="Times New Roman" w:cs="Times New Roman"/>
+          <w:color w:val="1F1F1F"/>
+        </w:rPr>
+        <w:t>. There is a notorious difference between the weather of Miami, New Orleans, Houston and Chicago; the difference in their climates makes it strange that all of them share a high score in the PC3 axis. It seems to be a contradiction that can be explained due to the fact of the other two more important variables of the PC3, which are `</w:t>
+      </w:r>
+      <w:proofErr w:type="spellStart"/>
+      <w:r>
+        <w:rPr>
+          <w:rFonts w:ascii="Times New Roman" w:eastAsia="Times New Roman" w:hAnsi="Times New Roman" w:cs="Times New Roman"/>
+          <w:b/>
+          <w:bCs/>
+          <w:color w:val="1F1F1F"/>
+        </w:rPr>
+        <w:t>manuf</w:t>
+      </w:r>
+      <w:proofErr w:type="spellEnd"/>
+      <w:r>
+        <w:rPr>
+          <w:rFonts w:ascii="Times New Roman" w:eastAsia="Times New Roman" w:hAnsi="Times New Roman" w:cs="Times New Roman"/>
+          <w:b/>
+          <w:bCs/>
+          <w:color w:val="1F1F1F"/>
+        </w:rPr>
+        <w:t>`</w:t>
+      </w:r>
+      <w:r>
+        <w:rPr>
+          <w:rFonts w:ascii="Times New Roman" w:eastAsia="Times New Roman" w:hAnsi="Times New Roman" w:cs="Times New Roman"/>
+          <w:color w:val="1F1F1F"/>
+        </w:rPr>
+        <w:t xml:space="preserve"> (0.32) and `</w:t>
       </w:r>
       <w:r>
         <w:rPr>
@@ -5372,148 +5765,8 @@
           <w:rFonts w:ascii="Times New Roman" w:eastAsia="Times New Roman" w:hAnsi="Times New Roman" w:cs="Times New Roman"/>
           <w:color w:val="1F1F1F"/>
         </w:rPr>
-        <w:t>, `</w:t>
-      </w:r>
-      <w:proofErr w:type="spellStart"/>
-      <w:r>
-        <w:rPr>
-          <w:rFonts w:ascii="Times New Roman" w:eastAsia="Times New Roman" w:hAnsi="Times New Roman" w:cs="Times New Roman"/>
-          <w:b/>
-          <w:bCs/>
-          <w:color w:val="1F1F1F"/>
-        </w:rPr>
-        <w:t>manuf</w:t>
-      </w:r>
-      <w:proofErr w:type="spellEnd"/>
-      <w:r>
-        <w:rPr>
-          <w:rFonts w:ascii="Times New Roman" w:eastAsia="Times New Roman" w:hAnsi="Times New Roman" w:cs="Times New Roman"/>
-          <w:b/>
-          <w:bCs/>
-          <w:color w:val="1F1F1F"/>
-        </w:rPr>
-        <w:t>`</w:t>
-      </w:r>
-      <w:r>
-        <w:rPr>
-          <w:rFonts w:ascii="Times New Roman" w:eastAsia="Times New Roman" w:hAnsi="Times New Roman" w:cs="Times New Roman"/>
-          <w:color w:val="1F1F1F"/>
-        </w:rPr>
-        <w:t xml:space="preserve"> and `</w:t>
-      </w:r>
-      <w:proofErr w:type="spellStart"/>
-      <w:r>
-        <w:rPr>
-          <w:rFonts w:ascii="Times New Roman" w:eastAsia="Times New Roman" w:hAnsi="Times New Roman" w:cs="Times New Roman"/>
-          <w:b/>
-          <w:bCs/>
-          <w:color w:val="1F1F1F"/>
-        </w:rPr>
-        <w:t>precip</w:t>
-      </w:r>
-      <w:proofErr w:type="spellEnd"/>
-      <w:r>
-        <w:rPr>
-          <w:rFonts w:ascii="Times New Roman" w:eastAsia="Times New Roman" w:hAnsi="Times New Roman" w:cs="Times New Roman"/>
-          <w:b/>
-          <w:bCs/>
-          <w:color w:val="1F1F1F"/>
-        </w:rPr>
-        <w:t>`</w:t>
-      </w:r>
-      <w:r>
-        <w:rPr>
-          <w:rFonts w:ascii="Times New Roman" w:eastAsia="Times New Roman" w:hAnsi="Times New Roman" w:cs="Times New Roman"/>
-          <w:color w:val="1F1F1F"/>
-        </w:rPr>
-        <w:t xml:space="preserve"> and days respectively. This negative correlation means that in the 1970s these cities were less populated and smaller cities, with fewer industrial complexes and environmental impact.</w:t>
-      </w:r>
-    </w:p>
-    <w:p>
-      <w:pPr>
-        <w:jc w:val="both"/>
-        <w:rPr>
-          <w:rFonts w:ascii="Times New Roman" w:eastAsia="Times New Roman" w:hAnsi="Times New Roman" w:cs="Times New Roman"/>
-          <w:color w:val="1F1F1F"/>
-        </w:rPr>
-      </w:pPr>
-    </w:p>
-    <w:p>
-      <w:pPr>
-        <w:jc w:val="both"/>
-        <w:rPr>
-          <w:rFonts w:ascii="Times New Roman" w:eastAsia="Times New Roman" w:hAnsi="Times New Roman" w:cs="Times New Roman"/>
-          <w:color w:val="1F1F1F"/>
-        </w:rPr>
-      </w:pPr>
-      <w:r>
-        <w:rPr>
-          <w:rFonts w:ascii="Times New Roman" w:eastAsia="Times New Roman" w:hAnsi="Times New Roman" w:cs="Times New Roman"/>
-          <w:color w:val="1F1F1F"/>
-        </w:rPr>
-        <w:t>Other important cities in this case for the PC2 were Miami, Charleston, Norfolk and Buffalo. Their score regarding the PC1 was negative, implying that these cities were less populated and with a low industrial complex. However, their high score in PC2 near 2 means a high value of `</w:t>
-      </w:r>
-      <w:proofErr w:type="spellStart"/>
-      <w:r>
-        <w:rPr>
-          <w:rFonts w:ascii="Times New Roman" w:eastAsia="Times New Roman" w:hAnsi="Times New Roman" w:cs="Times New Roman"/>
-          <w:b/>
-          <w:bCs/>
-          <w:color w:val="1F1F1F"/>
-        </w:rPr>
-        <w:t>precip</w:t>
-      </w:r>
-      <w:proofErr w:type="spellEnd"/>
-      <w:r>
-        <w:rPr>
-          <w:rFonts w:ascii="Times New Roman" w:eastAsia="Times New Roman" w:hAnsi="Times New Roman" w:cs="Times New Roman"/>
-          <w:b/>
-          <w:bCs/>
-          <w:color w:val="1F1F1F"/>
-        </w:rPr>
-        <w:t>`</w:t>
-      </w:r>
-      <w:r>
-        <w:rPr>
-          <w:rFonts w:ascii="Times New Roman" w:eastAsia="Times New Roman" w:hAnsi="Times New Roman" w:cs="Times New Roman"/>
-          <w:color w:val="1F1F1F"/>
-        </w:rPr>
-        <w:t xml:space="preserve"> and `</w:t>
-      </w:r>
-      <w:r>
-        <w:rPr>
-          <w:rFonts w:ascii="Times New Roman" w:eastAsia="Times New Roman" w:hAnsi="Times New Roman" w:cs="Times New Roman"/>
-          <w:b/>
-          <w:bCs/>
-          <w:color w:val="1F1F1F"/>
-        </w:rPr>
-        <w:t>days`</w:t>
-      </w:r>
-      <w:r>
-        <w:rPr>
-          <w:rFonts w:ascii="Times New Roman" w:eastAsia="Times New Roman" w:hAnsi="Times New Roman" w:cs="Times New Roman"/>
-          <w:color w:val="1F1F1F"/>
-        </w:rPr>
-        <w:t xml:space="preserve"> in the 1970s.</w:t>
-      </w:r>
-    </w:p>
-    <w:p>
-      <w:pPr>
-        <w:jc w:val="both"/>
-        <w:rPr>
-          <w:rFonts w:ascii="Times New Roman" w:eastAsia="Times New Roman" w:hAnsi="Times New Roman" w:cs="Times New Roman"/>
-          <w:color w:val="1F1F1F"/>
-        </w:rPr>
-      </w:pPr>
-    </w:p>
-    <w:p>
-      <w:pPr>
-        <w:jc w:val="both"/>
-        <w:rPr>
-          <w:rFonts w:ascii="Times New Roman" w:eastAsia="Times New Roman" w:hAnsi="Times New Roman" w:cs="Times New Roman"/>
-          <w:color w:val="1F1F1F"/>
-        </w:rPr>
-      </w:pPr>
+        <w:t xml:space="preserve"> (0.41). Chicago is an outlier, as we saw in </w:t>
+      </w:r>
       <w:r>
         <w:rPr>
           <w:rFonts w:ascii="Times New Roman" w:eastAsia="Times New Roman" w:hAnsi="Times New Roman" w:cs="Times New Roman"/>
@@ -5530,149 +5783,11 @@
           <w:rFonts w:ascii="Times New Roman" w:eastAsia="Times New Roman" w:hAnsi="Times New Roman" w:cs="Times New Roman"/>
           <w:b/>
           <w:bCs/>
-          <w:color w:val="1F1F1F"/>
-        </w:rPr>
-        <w:t xml:space="preserve"> </w:t>
-      </w:r>
-      <w:r>
-        <w:rPr>
-          <w:rFonts w:ascii="Times New Roman" w:eastAsia="Times New Roman" w:hAnsi="Times New Roman" w:cs="Times New Roman"/>
-          <w:b/>
-          <w:bCs/>
           <w:i/>
           <w:iCs/>
           <w:color w:val="1F1F1F"/>
         </w:rPr>
-        <w:t>4 (b)</w:t>
-      </w:r>
-      <w:r>
-        <w:rPr>
-          <w:rFonts w:ascii="Times New Roman" w:eastAsia="Times New Roman" w:hAnsi="Times New Roman" w:cs="Times New Roman"/>
-          <w:color w:val="1F1F1F"/>
-        </w:rPr>
-        <w:t xml:space="preserve"> PC1 </w:t>
-      </w:r>
-      <w:proofErr w:type="spellStart"/>
-      <w:r>
-        <w:rPr>
-          <w:rFonts w:ascii="Times New Roman" w:eastAsia="Times New Roman" w:hAnsi="Times New Roman" w:cs="Times New Roman"/>
-          <w:color w:val="1F1F1F"/>
-        </w:rPr>
-        <w:t>vs</w:t>
-      </w:r>
-      <w:proofErr w:type="spellEnd"/>
-      <w:r>
-        <w:rPr>
-          <w:rFonts w:ascii="Times New Roman" w:eastAsia="Times New Roman" w:hAnsi="Times New Roman" w:cs="Times New Roman"/>
-          <w:color w:val="1F1F1F"/>
-        </w:rPr>
-        <w:t xml:space="preserve"> PC3 (Temperature), we have a positive score close to 3, for cities like Miami, being one of the main outliers for PC3. Followed by Chicago, New Orleans and Houston. Based on this, a high value in PC3 scores means high </w:t>
-      </w:r>
-      <w:r>
-        <w:rPr>
-          <w:rFonts w:ascii="Times New Roman" w:eastAsia="Times New Roman" w:hAnsi="Times New Roman" w:cs="Times New Roman"/>
-          <w:b/>
-          <w:bCs/>
-          <w:color w:val="1F1F1F"/>
-        </w:rPr>
-        <w:t>`temp`</w:t>
-      </w:r>
-      <w:r>
-        <w:rPr>
-          <w:rFonts w:ascii="Times New Roman" w:eastAsia="Times New Roman" w:hAnsi="Times New Roman" w:cs="Times New Roman"/>
-          <w:color w:val="1F1F1F"/>
-        </w:rPr>
-        <w:t xml:space="preserve"> and</w:t>
-      </w:r>
-      <w:r>
-        <w:rPr>
-          <w:rFonts w:ascii="Times New Roman" w:eastAsia="Times New Roman" w:hAnsi="Times New Roman" w:cs="Times New Roman"/>
-          <w:b/>
-          <w:bCs/>
-          <w:color w:val="1F1F1F"/>
-        </w:rPr>
-        <w:t xml:space="preserve"> `</w:t>
-      </w:r>
-      <w:proofErr w:type="spellStart"/>
-      <w:r>
-        <w:rPr>
-          <w:rFonts w:ascii="Times New Roman" w:eastAsia="Times New Roman" w:hAnsi="Times New Roman" w:cs="Times New Roman"/>
-          <w:b/>
-          <w:bCs/>
-          <w:color w:val="1F1F1F"/>
-        </w:rPr>
-        <w:t>precip</w:t>
-      </w:r>
-      <w:proofErr w:type="spellEnd"/>
-      <w:r>
-        <w:rPr>
-          <w:rFonts w:ascii="Times New Roman" w:eastAsia="Times New Roman" w:hAnsi="Times New Roman" w:cs="Times New Roman"/>
-          <w:b/>
-          <w:bCs/>
-          <w:color w:val="1F1F1F"/>
-        </w:rPr>
-        <w:t>`</w:t>
-      </w:r>
-      <w:r>
-        <w:rPr>
-          <w:rFonts w:ascii="Times New Roman" w:eastAsia="Times New Roman" w:hAnsi="Times New Roman" w:cs="Times New Roman"/>
-          <w:color w:val="1F1F1F"/>
-        </w:rPr>
-        <w:t>. There is a notorious difference between the weather of Miami, New Orleans, Houston and Chicago; the difference in their climates makes it strange that all of them share a high score in the PC3 axis. It seems to be a contradiction that can be explained due to the fact of the other two more important variables of the PC3, which are `</w:t>
-      </w:r>
-      <w:proofErr w:type="spellStart"/>
-      <w:r>
-        <w:rPr>
-          <w:rFonts w:ascii="Times New Roman" w:eastAsia="Times New Roman" w:hAnsi="Times New Roman" w:cs="Times New Roman"/>
-          <w:b/>
-          <w:bCs/>
-          <w:color w:val="1F1F1F"/>
-        </w:rPr>
-        <w:t>manuf</w:t>
-      </w:r>
-      <w:proofErr w:type="spellEnd"/>
-      <w:r>
-        <w:rPr>
-          <w:rFonts w:ascii="Times New Roman" w:eastAsia="Times New Roman" w:hAnsi="Times New Roman" w:cs="Times New Roman"/>
-          <w:b/>
-          <w:bCs/>
-          <w:color w:val="1F1F1F"/>
-        </w:rPr>
-        <w:t>`</w:t>
-      </w:r>
-      <w:r>
-        <w:rPr>
-          <w:rFonts w:ascii="Times New Roman" w:eastAsia="Times New Roman" w:hAnsi="Times New Roman" w:cs="Times New Roman"/>
-          <w:color w:val="1F1F1F"/>
-        </w:rPr>
-        <w:t xml:space="preserve"> (0.32) and `</w:t>
-      </w:r>
-      <w:r>
-        <w:rPr>
-          <w:rFonts w:ascii="Times New Roman" w:eastAsia="Times New Roman" w:hAnsi="Times New Roman" w:cs="Times New Roman"/>
-          <w:b/>
-          <w:bCs/>
-          <w:color w:val="1F1F1F"/>
-        </w:rPr>
-        <w:t>pop`</w:t>
-      </w:r>
-      <w:r>
-        <w:rPr>
-          <w:rFonts w:ascii="Times New Roman" w:eastAsia="Times New Roman" w:hAnsi="Times New Roman" w:cs="Times New Roman"/>
-          <w:color w:val="1F1F1F"/>
-        </w:rPr>
-        <w:t xml:space="preserve"> (0.41). Chicago is an outlier, as we saw in </w:t>
-      </w:r>
-      <w:r>
-        <w:rPr>
-          <w:rFonts w:ascii="Times New Roman" w:eastAsia="Times New Roman" w:hAnsi="Times New Roman" w:cs="Times New Roman"/>
-          <w:b/>
-          <w:bCs/>
-          <w:i/>
-          <w:iCs/>
-          <w:color w:val="1F1F1F"/>
-        </w:rPr>
-        <w:t xml:space="preserve">Image 4 </w:t>
+        <w:t xml:space="preserve"> 4 </w:t>
       </w:r>
       <w:r>
         <w:rPr>
@@ -5996,6 +6111,7 @@
           <w:rFonts w:ascii="Times New Roman" w:eastAsia="Times New Roman" w:hAnsi="Times New Roman" w:cs="Times New Roman"/>
           <w:b/>
           <w:bCs/>
+          <w:i/>
           <w:color w:val="1F1F1F"/>
         </w:rPr>
         <w:t>Figure</w:t>
@@ -6003,6 +6119,7 @@
       <w:r>
         <w:rPr>
           <w:rFonts w:ascii="Times New Roman" w:eastAsia="Times New Roman" w:hAnsi="Times New Roman" w:cs="Times New Roman"/>
+          <w:i/>
           <w:color w:val="1F1F1F"/>
         </w:rPr>
         <w:t xml:space="preserve"> </w:t>
@@ -6012,6 +6129,7 @@
           <w:rFonts w:ascii="Times New Roman" w:eastAsia="Times New Roman" w:hAnsi="Times New Roman" w:cs="Times New Roman"/>
           <w:b/>
           <w:bCs/>
+          <w:i/>
           <w:color w:val="1F1F1F"/>
         </w:rPr>
         <w:t>4 (c)</w:t>
@@ -6019,34 +6137,70 @@
       <w:r>
         <w:rPr>
           <w:rFonts w:ascii="Times New Roman" w:eastAsia="Times New Roman" w:hAnsi="Times New Roman" w:cs="Times New Roman"/>
-          <w:color w:val="1F1F1F"/>
-        </w:rPr>
-        <w:t>. Because each observation has different characteristics, using the scores that adjust our observations to the new PC components axis will help us to group them and start to find patterns. Also, understanding the loadings, we identify some characteristics that will lead us to make new groups or clusters.</w:t>
-      </w:r>
-    </w:p>
-    <w:p>
-      <w:pPr>
-        <w:jc w:val="both"/>
-        <w:rPr>
-          <w:rFonts w:ascii="Times New Roman" w:eastAsia="Times New Roman" w:hAnsi="Times New Roman" w:cs="Times New Roman"/>
-          <w:color w:val="1F1F1F"/>
-        </w:rPr>
-      </w:pPr>
-    </w:p>
-    <w:p>
-      <w:pPr>
-        <w:jc w:val="both"/>
-        <w:rPr>
-          <w:rFonts w:ascii="Times New Roman" w:eastAsia="Times New Roman" w:hAnsi="Times New Roman" w:cs="Times New Roman"/>
-          <w:color w:val="1F1F1F"/>
-        </w:rPr>
-      </w:pPr>
-      <w:r>
-        <w:rPr>
-          <w:rFonts w:ascii="Times New Roman" w:eastAsia="Times New Roman" w:hAnsi="Times New Roman" w:cs="Times New Roman"/>
-          <w:color w:val="1F1F1F"/>
-        </w:rPr>
-        <w:t>Concluding, for the cluster analysis, we can use the scores that we found for these three PCs, however we can also use the 7 variables. But the first option offers a more robust analysis because it already removed the noise associated with variables that are deeply correlated or that at the end will explain the same phenomena as `</w:t>
+          <w:i/>
+          <w:color w:val="1F1F1F"/>
+        </w:rPr>
+        <w:t>.</w:t>
+      </w:r>
+      <w:r>
+        <w:rPr>
+          <w:rFonts w:ascii="Times New Roman" w:eastAsia="Times New Roman" w:hAnsi="Times New Roman" w:cs="Times New Roman"/>
+          <w:color w:val="1F1F1F"/>
+        </w:rPr>
+        <w:t xml:space="preserve"> Because each observation has different characteristics, using the scores that adjust our observations to the new PC components axis will help us to group them and start to find patterns. Also, understanding the loadings, we identify some characteristics that will lead us to make new groups or clusters.</w:t>
+      </w:r>
+    </w:p>
+    <w:p>
+      <w:pPr>
+        <w:jc w:val="both"/>
+        <w:rPr>
+          <w:rFonts w:ascii="Times New Roman" w:eastAsia="Times New Roman" w:hAnsi="Times New Roman" w:cs="Times New Roman"/>
+          <w:color w:val="1F1F1F"/>
+        </w:rPr>
+      </w:pPr>
+    </w:p>
+    <w:p>
+      <w:pPr>
+        <w:jc w:val="both"/>
+        <w:rPr>
+          <w:rFonts w:ascii="Times New Roman" w:eastAsia="Times New Roman" w:hAnsi="Times New Roman" w:cs="Times New Roman"/>
+          <w:color w:val="1F1F1F"/>
+        </w:rPr>
+      </w:pPr>
+      <w:r>
+        <w:rPr>
+          <w:rFonts w:ascii="Times New Roman" w:eastAsia="Times New Roman" w:hAnsi="Times New Roman" w:cs="Times New Roman"/>
+          <w:color w:val="1F1F1F"/>
+        </w:rPr>
+        <w:t xml:space="preserve">Concluding, for the cluster analysis, we can use the scores that we found for these three PCs, however we can also use the 7 variables. But the first option offers a more robust analysis because it already removed the noise associated with variables that </w:t>
+      </w:r>
+      <w:r>
+        <w:rPr>
+          <w:rFonts w:ascii="Times New Roman" w:eastAsia="Times New Roman" w:hAnsi="Times New Roman" w:cs="Times New Roman"/>
+          <w:color w:val="1F1F1F"/>
+        </w:rPr>
+        <w:t>are deeply correlated or that, in</w:t>
+      </w:r>
+      <w:r>
+        <w:rPr>
+          <w:rFonts w:ascii="Times New Roman" w:eastAsia="Times New Roman" w:hAnsi="Times New Roman" w:cs="Times New Roman"/>
+          <w:color w:val="1F1F1F"/>
+        </w:rPr>
+        <w:t xml:space="preserve"> the end</w:t>
+      </w:r>
+      <w:r>
+        <w:rPr>
+          <w:rFonts w:ascii="Times New Roman" w:eastAsia="Times New Roman" w:hAnsi="Times New Roman" w:cs="Times New Roman"/>
+          <w:color w:val="1F1F1F"/>
+        </w:rPr>
+        <w:t>,</w:t>
+      </w:r>
+      <w:r>
+        <w:rPr>
+          <w:rFonts w:ascii="Times New Roman" w:eastAsia="Times New Roman" w:hAnsi="Times New Roman" w:cs="Times New Roman"/>
+          <w:color w:val="1F1F1F"/>
+        </w:rPr>
+        <w:t xml:space="preserve"> will explain the same phenomena as `</w:t>
       </w:r>
       <w:r>
         <w:rPr>
@@ -6102,21 +6256,26 @@
         </w:rPr>
         <w:t xml:space="preserve"> so grouping them will let us discover more data that can be jeopardized for these two variables. Another reason is that we can group and cluster the observations, using their weather, as we have two components that are strongly correlated with the climate changes of the observations. So using the scores, we can already start to separate the groups of variables, and with the loadings as we saw before the variables with a close angle between them tend to explain the same phenomena. But we will experiment with both approaches -the 7 variables and the </w:t>
       </w:r>
-      <w:proofErr w:type="spellStart"/>
-      <w:r>
-        <w:rPr>
-          <w:rFonts w:ascii="Times New Roman" w:eastAsia="Times New Roman" w:hAnsi="Times New Roman" w:cs="Times New Roman"/>
-          <w:color w:val="1F1F1F"/>
-        </w:rPr>
-        <w:t>pca</w:t>
-      </w:r>
-      <w:proofErr w:type="spellEnd"/>
-      <w:r>
-        <w:rPr>
-          <w:rFonts w:ascii="Times New Roman" w:eastAsia="Times New Roman" w:hAnsi="Times New Roman" w:cs="Times New Roman"/>
-          <w:color w:val="1F1F1F"/>
-        </w:rPr>
-        <w:t xml:space="preserve"> scores- to verify which the best one is.</w:t>
+      <w:r>
+        <w:rPr>
+          <w:rFonts w:ascii="Times New Roman" w:eastAsia="Times New Roman" w:hAnsi="Times New Roman" w:cs="Times New Roman"/>
+          <w:color w:val="1F1F1F"/>
+        </w:rPr>
+        <w:t>PCA S</w:t>
+      </w:r>
+      <w:r>
+        <w:rPr>
+          <w:rFonts w:ascii="Times New Roman" w:eastAsia="Times New Roman" w:hAnsi="Times New Roman" w:cs="Times New Roman"/>
+          <w:color w:val="1F1F1F"/>
+        </w:rPr>
+        <w:t xml:space="preserve">cores- to verify which </w:t>
+      </w:r>
+      <w:r>
+        <w:rPr>
+          <w:rFonts w:ascii="Times New Roman" w:eastAsia="Times New Roman" w:hAnsi="Times New Roman" w:cs="Times New Roman"/>
+          <w:color w:val="1F1F1F"/>
+        </w:rPr>
+        <w:t>one is the best.</w:t>
       </w:r>
     </w:p>
     <w:p>
@@ -6304,7 +6463,21 @@
           <w:rFonts w:ascii="Times New Roman" w:eastAsia="Times New Roman" w:hAnsi="Times New Roman" w:cs="Times New Roman"/>
           <w:color w:val="1F1F1F"/>
         </w:rPr>
-        <w:t xml:space="preserve"> PC scores. This will test our hypothesis that PCA-based clustering yields superior results by reducing noise and handling </w:t>
+        <w:t xml:space="preserve"> PC</w:t>
+      </w:r>
+      <w:r>
+        <w:rPr>
+          <w:rFonts w:ascii="Times New Roman" w:eastAsia="Times New Roman" w:hAnsi="Times New Roman" w:cs="Times New Roman"/>
+          <w:color w:val="1F1F1F"/>
+        </w:rPr>
+        <w:t>A</w:t>
+      </w:r>
+      <w:r>
+        <w:rPr>
+          <w:rFonts w:ascii="Times New Roman" w:eastAsia="Times New Roman" w:hAnsi="Times New Roman" w:cs="Times New Roman"/>
+          <w:color w:val="1F1F1F"/>
+        </w:rPr>
+        <w:t xml:space="preserve"> scores. This will test our hypothesis that PCA-based clustering yields superior results by reducing noise and handling </w:t>
       </w:r>
       <w:proofErr w:type="spellStart"/>
       <w:r>
@@ -6487,7 +6660,21 @@
           <w:rFonts w:ascii="Times New Roman" w:eastAsia="Times New Roman" w:hAnsi="Times New Roman" w:cs="Times New Roman"/>
           <w:color w:val="1F1F1F"/>
         </w:rPr>
-        <w:t>dendogram</w:t>
+        <w:t>dend</w:t>
+      </w:r>
+      <w:r>
+        <w:rPr>
+          <w:rFonts w:ascii="Times New Roman" w:eastAsia="Times New Roman" w:hAnsi="Times New Roman" w:cs="Times New Roman"/>
+          <w:color w:val="1F1F1F"/>
+        </w:rPr>
+        <w:t>r</w:t>
+      </w:r>
+      <w:r>
+        <w:rPr>
+          <w:rFonts w:ascii="Times New Roman" w:eastAsia="Times New Roman" w:hAnsi="Times New Roman" w:cs="Times New Roman"/>
+          <w:color w:val="1F1F1F"/>
+        </w:rPr>
+        <w:t>ogram</w:t>
       </w:r>
       <w:proofErr w:type="spellEnd"/>
       <w:r>
@@ -6503,7 +6690,21 @@
           <w:rFonts w:ascii="Times New Roman" w:eastAsia="Times New Roman" w:hAnsi="Times New Roman" w:cs="Times New Roman"/>
           <w:color w:val="1F1F1F"/>
         </w:rPr>
-        <w:t>dendogram</w:t>
+        <w:t>dend</w:t>
+      </w:r>
+      <w:r>
+        <w:rPr>
+          <w:rFonts w:ascii="Times New Roman" w:eastAsia="Times New Roman" w:hAnsi="Times New Roman" w:cs="Times New Roman"/>
+          <w:color w:val="1F1F1F"/>
+        </w:rPr>
+        <w:t>r</w:t>
+      </w:r>
+      <w:r>
+        <w:rPr>
+          <w:rFonts w:ascii="Times New Roman" w:eastAsia="Times New Roman" w:hAnsi="Times New Roman" w:cs="Times New Roman"/>
+          <w:color w:val="1F1F1F"/>
+        </w:rPr>
+        <w:t>ogram</w:t>
       </w:r>
       <w:proofErr w:type="spellEnd"/>
       <w:r>
@@ -6790,15 +6991,13 @@
         </w:rPr>
         <w:t xml:space="preserve">, which uses the covariance matrix as the core of its calculation to correct these problems, is notoriously sensitive to outliers. Extreme observations like Chicago or Phoenix will affect the calculation. For this reason, we will discard it and we will move forward with the Euclidean Distance for </w:t>
       </w:r>
-      <w:proofErr w:type="spellStart"/>
-      <w:r>
-        <w:rPr>
-          <w:rFonts w:ascii="Times New Roman" w:eastAsia="Times New Roman" w:hAnsi="Times New Roman" w:cs="Times New Roman"/>
-          <w:color w:val="1F1F1F"/>
-        </w:rPr>
-        <w:t>standardised</w:t>
-      </w:r>
-      <w:proofErr w:type="spellEnd"/>
+      <w:r>
+        <w:rPr>
+          <w:rFonts w:ascii="Times New Roman" w:eastAsia="Times New Roman" w:hAnsi="Times New Roman" w:cs="Times New Roman"/>
+          <w:color w:val="1F1F1F"/>
+        </w:rPr>
+        <w:t>standardized</w:t>
+      </w:r>
       <w:r>
         <w:rPr>
           <w:rFonts w:ascii="Times New Roman" w:eastAsia="Times New Roman" w:hAnsi="Times New Roman" w:cs="Times New Roman"/>
@@ -7110,9 +7309,8 @@
           <w:sz w:val="20"/>
           <w:highlight w:val="white"/>
         </w:rPr>
-        <w:t>dendograms</w:t>
-      </w:r>
-      <w:proofErr w:type="spellEnd"/>
+        <w:t>dend</w:t>
+      </w:r>
       <w:r>
         <w:rPr>
           <w:rFonts w:ascii="Times New Roman" w:eastAsia="Times New Roman" w:hAnsi="Times New Roman" w:cs="Times New Roman"/>
@@ -7122,21 +7320,20 @@
           <w:sz w:val="20"/>
           <w:highlight w:val="white"/>
         </w:rPr>
-        <w:t xml:space="preserve"> of different linkage methods. We can see the use of Single Linkage, Complete Linkage and Ward. </w:t>
-      </w:r>
-      <w:r>
-        <w:rPr>
-          <w:rFonts w:ascii="Times New Roman" w:eastAsia="Times New Roman" w:hAnsi="Times New Roman" w:cs="Times New Roman"/>
-          <w:b/>
-          <w:bCs/>
+        <w:t>r</w:t>
+      </w:r>
+      <w:r>
+        <w:rPr>
+          <w:rFonts w:ascii="Times New Roman" w:eastAsia="Times New Roman" w:hAnsi="Times New Roman" w:cs="Times New Roman"/>
           <w:i/>
           <w:iCs/>
           <w:color w:val="2F5496" w:themeColor="accent5" w:themeShade="BF"/>
           <w:sz w:val="20"/>
           <w:highlight w:val="white"/>
         </w:rPr>
-        <w:t>(a)</w:t>
-      </w:r>
+        <w:t>ograms</w:t>
+      </w:r>
+      <w:proofErr w:type="spellEnd"/>
       <w:r>
         <w:rPr>
           <w:rFonts w:ascii="Times New Roman" w:eastAsia="Times New Roman" w:hAnsi="Times New Roman" w:cs="Times New Roman"/>
@@ -7146,21 +7343,21 @@
           <w:sz w:val="20"/>
           <w:highlight w:val="white"/>
         </w:rPr>
-        <w:t xml:space="preserve"> The dataset used to build this </w:t>
-      </w:r>
-      <w:proofErr w:type="spellStart"/>
-      <w:r>
-        <w:rPr>
-          <w:rFonts w:ascii="Times New Roman" w:eastAsia="Times New Roman" w:hAnsi="Times New Roman" w:cs="Times New Roman"/>
+        <w:t xml:space="preserve"> of different linkage methods. We can see the use of Single Linkage, Complete Linkage and Ward. </w:t>
+      </w:r>
+      <w:r>
+        <w:rPr>
+          <w:rFonts w:ascii="Times New Roman" w:eastAsia="Times New Roman" w:hAnsi="Times New Roman" w:cs="Times New Roman"/>
+          <w:b/>
+          <w:bCs/>
           <w:i/>
           <w:iCs/>
           <w:color w:val="2F5496" w:themeColor="accent5" w:themeShade="BF"/>
           <w:sz w:val="20"/>
           <w:highlight w:val="white"/>
         </w:rPr>
-        <w:t>dendogram</w:t>
-      </w:r>
-      <w:proofErr w:type="spellEnd"/>
+        <w:t>(a)</w:t>
+      </w:r>
       <w:r>
         <w:rPr>
           <w:rFonts w:ascii="Times New Roman" w:eastAsia="Times New Roman" w:hAnsi="Times New Roman" w:cs="Times New Roman"/>
@@ -7170,20 +7367,19 @@
           <w:sz w:val="20"/>
           <w:highlight w:val="white"/>
         </w:rPr>
-        <w:t xml:space="preserve"> was the standardized raw variables, using the Euclidean distance. On the other hand, part </w:t>
-      </w:r>
-      <w:r>
-        <w:rPr>
-          <w:rFonts w:ascii="Times New Roman" w:eastAsia="Times New Roman" w:hAnsi="Times New Roman" w:cs="Times New Roman"/>
-          <w:b/>
-          <w:bCs/>
+        <w:t xml:space="preserve"> The dataset used to build this </w:t>
+      </w:r>
+      <w:proofErr w:type="spellStart"/>
+      <w:r>
+        <w:rPr>
+          <w:rFonts w:ascii="Times New Roman" w:eastAsia="Times New Roman" w:hAnsi="Times New Roman" w:cs="Times New Roman"/>
           <w:i/>
           <w:iCs/>
           <w:color w:val="2F5496" w:themeColor="accent5" w:themeShade="BF"/>
           <w:sz w:val="20"/>
           <w:highlight w:val="white"/>
         </w:rPr>
-        <w:t>(b)</w:t>
+        <w:t>dend</w:t>
       </w:r>
       <w:r>
         <w:rPr>
@@ -7194,9 +7390,8 @@
           <w:sz w:val="20"/>
           <w:highlight w:val="white"/>
         </w:rPr>
-        <w:t xml:space="preserve"> shows the use of the PCA scores to build the </w:t>
-      </w:r>
-      <w:proofErr w:type="spellStart"/>
+        <w:t>r</w:t>
+      </w:r>
       <w:r>
         <w:rPr>
           <w:rFonts w:ascii="Times New Roman" w:eastAsia="Times New Roman" w:hAnsi="Times New Roman" w:cs="Times New Roman"/>
@@ -7206,7 +7401,7 @@
           <w:sz w:val="20"/>
           <w:highlight w:val="white"/>
         </w:rPr>
-        <w:t>dendograms</w:t>
+        <w:t>ogram</w:t>
       </w:r>
       <w:proofErr w:type="spellEnd"/>
       <w:r>
@@ -7218,6 +7413,76 @@
           <w:sz w:val="20"/>
           <w:highlight w:val="white"/>
         </w:rPr>
+        <w:t xml:space="preserve"> was the standardized raw variables, using the Euclidean distance. On the other hand, part </w:t>
+      </w:r>
+      <w:r>
+        <w:rPr>
+          <w:rFonts w:ascii="Times New Roman" w:eastAsia="Times New Roman" w:hAnsi="Times New Roman" w:cs="Times New Roman"/>
+          <w:b/>
+          <w:bCs/>
+          <w:i/>
+          <w:iCs/>
+          <w:color w:val="2F5496" w:themeColor="accent5" w:themeShade="BF"/>
+          <w:sz w:val="20"/>
+          <w:highlight w:val="white"/>
+        </w:rPr>
+        <w:t>(b)</w:t>
+      </w:r>
+      <w:r>
+        <w:rPr>
+          <w:rFonts w:ascii="Times New Roman" w:eastAsia="Times New Roman" w:hAnsi="Times New Roman" w:cs="Times New Roman"/>
+          <w:i/>
+          <w:iCs/>
+          <w:color w:val="2F5496" w:themeColor="accent5" w:themeShade="BF"/>
+          <w:sz w:val="20"/>
+          <w:highlight w:val="white"/>
+        </w:rPr>
+        <w:t xml:space="preserve"> shows the use of the PCA scores to build the </w:t>
+      </w:r>
+      <w:proofErr w:type="spellStart"/>
+      <w:r>
+        <w:rPr>
+          <w:rFonts w:ascii="Times New Roman" w:eastAsia="Times New Roman" w:hAnsi="Times New Roman" w:cs="Times New Roman"/>
+          <w:i/>
+          <w:iCs/>
+          <w:color w:val="2F5496" w:themeColor="accent5" w:themeShade="BF"/>
+          <w:sz w:val="20"/>
+          <w:highlight w:val="white"/>
+        </w:rPr>
+        <w:t>dend</w:t>
+      </w:r>
+      <w:r>
+        <w:rPr>
+          <w:rFonts w:ascii="Times New Roman" w:eastAsia="Times New Roman" w:hAnsi="Times New Roman" w:cs="Times New Roman"/>
+          <w:i/>
+          <w:iCs/>
+          <w:color w:val="2F5496" w:themeColor="accent5" w:themeShade="BF"/>
+          <w:sz w:val="20"/>
+          <w:highlight w:val="white"/>
+        </w:rPr>
+        <w:t>r</w:t>
+      </w:r>
+      <w:r>
+        <w:rPr>
+          <w:rFonts w:ascii="Times New Roman" w:eastAsia="Times New Roman" w:hAnsi="Times New Roman" w:cs="Times New Roman"/>
+          <w:i/>
+          <w:iCs/>
+          <w:color w:val="2F5496" w:themeColor="accent5" w:themeShade="BF"/>
+          <w:sz w:val="20"/>
+          <w:highlight w:val="white"/>
+        </w:rPr>
+        <w:t>ograms</w:t>
+      </w:r>
+      <w:proofErr w:type="spellEnd"/>
+      <w:r>
+        <w:rPr>
+          <w:rFonts w:ascii="Times New Roman" w:eastAsia="Times New Roman" w:hAnsi="Times New Roman" w:cs="Times New Roman"/>
+          <w:i/>
+          <w:iCs/>
+          <w:color w:val="2F5496" w:themeColor="accent5" w:themeShade="BF"/>
+          <w:sz w:val="20"/>
+          <w:highlight w:val="white"/>
+        </w:rPr>
         <w:t xml:space="preserve">. </w:t>
       </w:r>
     </w:p>
@@ -7347,7 +7612,23 @@
           <w:color w:val="333333"/>
           <w:highlight w:val="white"/>
         </w:rPr>
-        <w:t>dendogram</w:t>
+        <w:t>dend</w:t>
+      </w:r>
+      <w:r>
+        <w:rPr>
+          <w:rFonts w:ascii="Times New Roman" w:eastAsia="Times New Roman" w:hAnsi="Times New Roman" w:cs="Times New Roman"/>
+          <w:color w:val="333333"/>
+          <w:highlight w:val="white"/>
+        </w:rPr>
+        <w:t>r</w:t>
+      </w:r>
+      <w:r>
+        <w:rPr>
+          <w:rFonts w:ascii="Times New Roman" w:eastAsia="Times New Roman" w:hAnsi="Times New Roman" w:cs="Times New Roman"/>
+          <w:color w:val="333333"/>
+          <w:highlight w:val="white"/>
+        </w:rPr>
+        <w:t>ogram</w:t>
       </w:r>
       <w:proofErr w:type="spellEnd"/>
       <w:r>
@@ -7834,9 +8115,8 @@
           <w:sz w:val="20"/>
           <w:highlight w:val="white"/>
         </w:rPr>
-        <w:t>dendogram</w:t>
-      </w:r>
-      <w:proofErr w:type="spellEnd"/>
+        <w:t>dend</w:t>
+      </w:r>
       <w:r>
         <w:rPr>
           <w:rFonts w:ascii="Times New Roman" w:eastAsia="Times New Roman" w:hAnsi="Times New Roman" w:cs="Times New Roman"/>
@@ -7846,6 +8126,29 @@
           <w:sz w:val="20"/>
           <w:highlight w:val="white"/>
         </w:rPr>
+        <w:t>r</w:t>
+      </w:r>
+      <w:r>
+        <w:rPr>
+          <w:rFonts w:ascii="Times New Roman" w:eastAsia="Times New Roman" w:hAnsi="Times New Roman" w:cs="Times New Roman"/>
+          <w:i/>
+          <w:iCs/>
+          <w:color w:val="2F5496" w:themeColor="accent5" w:themeShade="BF"/>
+          <w:sz w:val="20"/>
+          <w:highlight w:val="white"/>
+        </w:rPr>
+        <w:t>ogram</w:t>
+      </w:r>
+      <w:proofErr w:type="spellEnd"/>
+      <w:r>
+        <w:rPr>
+          <w:rFonts w:ascii="Times New Roman" w:eastAsia="Times New Roman" w:hAnsi="Times New Roman" w:cs="Times New Roman"/>
+          <w:i/>
+          <w:iCs/>
+          <w:color w:val="2F5496" w:themeColor="accent5" w:themeShade="BF"/>
+          <w:sz w:val="20"/>
+          <w:highlight w:val="white"/>
+        </w:rPr>
         <w:t xml:space="preserve"> preserves the original pairwise distances, respectively. </w:t>
       </w:r>
     </w:p>
@@ -7883,7 +8186,23 @@
           <w:color w:val="333333"/>
           <w:highlight w:val="white"/>
         </w:rPr>
-        <w:t>dendograms</w:t>
+        <w:t>dend</w:t>
+      </w:r>
+      <w:r>
+        <w:rPr>
+          <w:rFonts w:ascii="Times New Roman" w:eastAsia="Times New Roman" w:hAnsi="Times New Roman" w:cs="Times New Roman"/>
+          <w:color w:val="333333"/>
+          <w:highlight w:val="white"/>
+        </w:rPr>
+        <w:t>r</w:t>
+      </w:r>
+      <w:r>
+        <w:rPr>
+          <w:rFonts w:ascii="Times New Roman" w:eastAsia="Times New Roman" w:hAnsi="Times New Roman" w:cs="Times New Roman"/>
+          <w:color w:val="333333"/>
+          <w:highlight w:val="white"/>
+        </w:rPr>
+        <w:t>ograms</w:t>
       </w:r>
       <w:proofErr w:type="spellEnd"/>
       <w:r>
@@ -8499,7 +8818,23 @@
           <w:color w:val="333333"/>
           <w:highlight w:val="white"/>
         </w:rPr>
-        <w:t>dendogram</w:t>
+        <w:t>dend</w:t>
+      </w:r>
+      <w:r>
+        <w:rPr>
+          <w:rFonts w:ascii="Times New Roman" w:eastAsia="Times New Roman" w:hAnsi="Times New Roman" w:cs="Times New Roman"/>
+          <w:color w:val="333333"/>
+          <w:highlight w:val="white"/>
+        </w:rPr>
+        <w:t>r</w:t>
+      </w:r>
+      <w:r>
+        <w:rPr>
+          <w:rFonts w:ascii="Times New Roman" w:eastAsia="Times New Roman" w:hAnsi="Times New Roman" w:cs="Times New Roman"/>
+          <w:color w:val="333333"/>
+          <w:highlight w:val="white"/>
+        </w:rPr>
+        <w:t>ogram</w:t>
       </w:r>
       <w:proofErr w:type="spellEnd"/>
       <w:r>
@@ -9161,7 +9496,29 @@
           <w:highlight w:val="white"/>
           <w:lang w:val="en-GB"/>
         </w:rPr>
-        <w:t>Dendograms</w:t>
+        <w:t>Dend</w:t>
+      </w:r>
+      <w:r>
+        <w:rPr>
+          <w:rFonts w:ascii="Times New Roman" w:eastAsia="Times New Roman" w:hAnsi="Times New Roman" w:cs="Times New Roman"/>
+          <w:i/>
+          <w:color w:val="2F5496" w:themeColor="accent5" w:themeShade="BF"/>
+          <w:sz w:val="20"/>
+          <w:highlight w:val="white"/>
+          <w:lang w:val="en-GB"/>
+        </w:rPr>
+        <w:t>r</w:t>
+      </w:r>
+      <w:r>
+        <w:rPr>
+          <w:rFonts w:ascii="Times New Roman" w:eastAsia="Times New Roman" w:hAnsi="Times New Roman" w:cs="Times New Roman"/>
+          <w:i/>
+          <w:color w:val="2F5496" w:themeColor="accent5" w:themeShade="BF"/>
+          <w:sz w:val="20"/>
+          <w:highlight w:val="white"/>
+          <w:lang w:val="en-GB"/>
+        </w:rPr>
+        <w:t>ograms</w:t>
       </w:r>
       <w:proofErr w:type="spellEnd"/>
       <w:r>
@@ -9984,6 +10341,15 @@
           <w:highlight w:val="white"/>
           <w:lang w:val="en-GB"/>
         </w:rPr>
+        <w:t>r</w:t>
+      </w:r>
+      <w:r>
+        <w:rPr>
+          <w:rFonts w:ascii="Times New Roman" w:eastAsia="Times New Roman" w:hAnsi="Times New Roman" w:cs="Times New Roman"/>
+          <w:color w:val="333333"/>
+          <w:highlight w:val="white"/>
+          <w:lang w:val="en-GB"/>
+        </w:rPr>
         <w:t>ograms</w:t>
       </w:r>
       <w:proofErr w:type="spellEnd"/>
@@ -10613,7 +10979,6 @@
         <w:jc w:val="both"/>
         <w:rPr>
           <w:rFonts w:ascii="Times New Roman" w:hAnsi="Times New Roman" w:cs="Times New Roman"/>
-          <w:i/>
           <w:lang w:val="en-GB"/>
         </w:rPr>
       </w:pPr>
@@ -10698,10 +11063,9 @@
       <w:r>
         <w:rPr>
           <w:rFonts w:ascii="Times New Roman" w:hAnsi="Times New Roman" w:cs="Times New Roman"/>
-          <w:i/>
-          <w:lang w:val="en-GB"/>
-        </w:rPr>
-        <w:t xml:space="preserve"> </w:t>
+          <w:lang w:val="en-GB"/>
+        </w:rPr>
+        <w:t>.</w:t>
       </w:r>
     </w:p>
     <w:p>
@@ -11483,7 +11847,7 @@
             <w:noProof/>
             <w:lang w:val="pt-PT"/>
           </w:rPr>
-          <w:t>2</w:t>
+          <w:t>18</w:t>
         </w:r>
         <w:r>
           <w:fldChar w:fldCharType="end"/>
@@ -12822,6 +13186,18 @@
       <w:contextualSpacing/>
     </w:pPr>
   </w:style>
+  <w:style w:type="character" w:styleId="Hiperligaovisitada">
+    <w:name w:val="FollowedHyperlink"/>
+    <w:basedOn w:val="Tipodeletrapredefinidodopargrafo"/>
+    <w:uiPriority w:val="99"/>
+    <w:semiHidden/>
+    <w:unhideWhenUsed/>
+    <w:rsid w:val="00563BF1"/>
+    <w:rPr>
+      <w:color w:val="954F72" w:themeColor="followedHyperlink"/>
+      <w:u w:val="single"/>
+    </w:rPr>
+  </w:style>
 </w:styles>
 </file>
 
@@ -12973,9 +13349,12 @@
   </w:compat>
   <w:rsids>
     <w:rsidRoot w:val="0085669D"/>
+    <w:rsid w:val="000A619B"/>
     <w:rsid w:val="000E158D"/>
+    <w:rsid w:val="001E7146"/>
     <w:rsid w:val="002A7831"/>
     <w:rsid w:val="00434003"/>
+    <w:rsid w:val="00643747"/>
     <w:rsid w:val="0085669D"/>
     <w:rsid w:val="00DB769D"/>
   </w:rsids>
@@ -13705,7 +14084,7 @@
 </file>
 
 <file path=customXml/itemProps1.xml><?xml version="1.0" encoding="utf-8"?>
-<ds:datastoreItem xmlns:ds="http://schemas.openxmlformats.org/officeDocument/2006/customXml" ds:itemID="{9AE1B027-903E-4878-8F9A-FDD71BF30B34}">
+<ds:datastoreItem xmlns:ds="http://schemas.openxmlformats.org/officeDocument/2006/customXml" ds:itemID="{51AD3938-D65C-4F72-B0BE-CB263273745B}">
   <ds:schemaRefs>
     <ds:schemaRef ds:uri="http://schemas.openxmlformats.org/officeDocument/2006/bibliography"/>
   </ds:schemaRefs>

</xml_diff>

<commit_message>
final touches on the report
</commit_message>
<xml_diff>
--- a/Multivariate_Data_Analysis_Project/AMD_Report_fc58163_fc57490_fc66459.docx
+++ b/Multivariate_Data_Analysis_Project/AMD_Report_fc58163_fc57490_fc66459.docx
@@ -229,7 +229,6 @@
                   <w:szCs w:val="28"/>
                 </w:rPr>
               </w:pPr>
-              <w:proofErr w:type="spellStart"/>
               <w:r>
                 <w:rPr>
                   <w:color w:val="5B9BD5" w:themeColor="accent1"/>
@@ -237,37 +236,7 @@
                   <w:szCs w:val="28"/>
                   <w:lang w:eastAsia="en-US"/>
                 </w:rPr>
-                <w:t>Multivariate</w:t>
-              </w:r>
-              <w:proofErr w:type="spellEnd"/>
-              <w:r>
-                <w:rPr>
-                  <w:color w:val="5B9BD5" w:themeColor="accent1"/>
-                  <w:sz w:val="28"/>
-                  <w:szCs w:val="28"/>
-                  <w:lang w:eastAsia="en-US"/>
-                </w:rPr>
-                <w:t xml:space="preserve"> Data </w:t>
-              </w:r>
-              <w:proofErr w:type="spellStart"/>
-              <w:r>
-                <w:rPr>
-                  <w:color w:val="5B9BD5" w:themeColor="accent1"/>
-                  <w:sz w:val="28"/>
-                  <w:szCs w:val="28"/>
-                  <w:lang w:eastAsia="en-US"/>
-                </w:rPr>
-                <w:t>Analysis</w:t>
-              </w:r>
-              <w:proofErr w:type="spellEnd"/>
-              <w:r>
-                <w:rPr>
-                  <w:color w:val="5B9BD5" w:themeColor="accent1"/>
-                  <w:sz w:val="28"/>
-                  <w:szCs w:val="28"/>
-                  <w:lang w:eastAsia="en-US"/>
-                </w:rPr>
-                <w:t xml:space="preserve"> Project</w:t>
+                <w:t>Multivariate Data Analysis Project</w:t>
               </w:r>
             </w:p>
           </w:sdtContent>
@@ -404,7 +373,6 @@
                                     <w:lang w:val="pt-PT"/>
                                   </w:rPr>
                                 </w:pPr>
-                                <w:proofErr w:type="spellStart"/>
                                 <w:r>
                                   <w:rPr>
                                     <w:b/>
@@ -412,7 +380,6 @@
                                   </w:rPr>
                                   <w:t>Students</w:t>
                                 </w:r>
-                                <w:proofErr w:type="spellEnd"/>
                                 <w:r>
                                   <w:rPr>
                                     <w:lang w:val="pt-PT"/>
@@ -436,21 +403,7 @@
                                   <w:rPr>
                                     <w:lang w:val="pt-PT"/>
                                   </w:rPr>
-                                  <w:t xml:space="preserve"> </w:t>
-                                </w:r>
-                                <w:proofErr w:type="gramStart"/>
-                                <w:r>
-                                  <w:rPr>
-                                    <w:lang w:val="pt-PT"/>
-                                  </w:rPr>
-                                  <w:t>FC58163  |</w:t>
-                                </w:r>
-                                <w:proofErr w:type="gramEnd"/>
-                                <w:r>
-                                  <w:rPr>
-                                    <w:lang w:val="pt-PT"/>
-                                  </w:rPr>
-                                  <w:t xml:space="preserve">  R</w:t>
+                                  <w:t xml:space="preserve"> FC58163  |  R</w:t>
                                 </w:r>
                                 <w:r>
                                   <w:rPr>
@@ -528,21 +481,7 @@
                                   <w:rPr>
                                     <w:lang w:val="en-GB"/>
                                   </w:rPr>
-                                  <w:t xml:space="preserve">Master in </w:t>
-                                </w:r>
-                                <w:proofErr w:type="spellStart"/>
-                                <w:r>
-                                  <w:rPr>
-                                    <w:lang w:val="en-GB"/>
-                                  </w:rPr>
-                                  <w:t>Bioinformatic</w:t>
-                                </w:r>
-                                <w:proofErr w:type="spellEnd"/>
-                                <w:r>
-                                  <w:rPr>
-                                    <w:lang w:val="en-GB"/>
-                                  </w:rPr>
-                                  <w:t xml:space="preserve"> and Computational Biology</w:t>
+                                  <w:t>Master in Bioinformatic and Computational Biology</w:t>
                                 </w:r>
                               </w:p>
                               <w:p>
@@ -556,16 +495,8 @@
                                   <w:rPr>
                                     <w:lang w:val="pt-PT"/>
                                   </w:rPr>
-                                  <w:t xml:space="preserve">Master in </w:t>
+                                  <w:t>Master in Biostatistics</w:t>
                                 </w:r>
-                                <w:proofErr w:type="spellStart"/>
-                                <w:r>
-                                  <w:rPr>
-                                    <w:lang w:val="pt-PT"/>
-                                  </w:rPr>
-                                  <w:t>Biostatistics</w:t>
-                                </w:r>
-                                <w:proofErr w:type="spellEnd"/>
                               </w:p>
                             </w:txbxContent>
                           </wps:txbx>
@@ -1548,21 +1479,7 @@
         <w:rPr>
           <w:rFonts w:ascii="Times New Roman" w:eastAsia="Times New Roman" w:hAnsi="Times New Roman" w:cs="Times New Roman"/>
         </w:rPr>
-        <w:t xml:space="preserve">As urban areas continue to expand and industrial activities intensify, the concentration of harmful pollutants in the atmosphere has increased dramatically. Pollutants like carbon monoxide, ozone and </w:t>
-      </w:r>
-      <w:proofErr w:type="spellStart"/>
-      <w:r>
-        <w:rPr>
-          <w:rFonts w:ascii="Times New Roman" w:eastAsia="Times New Roman" w:hAnsi="Times New Roman" w:cs="Times New Roman"/>
-        </w:rPr>
-        <w:t>sulphur</w:t>
-      </w:r>
-      <w:proofErr w:type="spellEnd"/>
-      <w:r>
-        <w:rPr>
-          <w:rFonts w:ascii="Times New Roman" w:eastAsia="Times New Roman" w:hAnsi="Times New Roman" w:cs="Times New Roman"/>
-        </w:rPr>
-        <w:t xml:space="preserve"> dioxide can have a severe impact not only on the environment but also on human health, contributing to respiratory diseases and cardiovascular problems, amongst others. These health complications that shorten life expectancy exist in both economically developing and developed countries [1].</w:t>
+        <w:t>As urban areas continue to expand and industrial activities intensify, the concentration of harmful pollutants in the atmosphere has increased dramatically. Pollutants like carbon monoxide, ozone and sulphur dioxide can have a severe impact not only on the environment but also on human health, contributing to respiratory diseases and cardiovascular problems, amongst others. These health complications that shorten life expectancy exist in both economically developing and developed countries [1].</w:t>
       </w:r>
     </w:p>
     <w:p>
@@ -1607,21 +1524,7 @@
         <w:rPr>
           <w:rFonts w:ascii="Times New Roman" w:eastAsia="Times New Roman" w:hAnsi="Times New Roman" w:cs="Times New Roman"/>
         </w:rPr>
-        <w:t xml:space="preserve">Making a preliminary analysis of the data, conducting a principal component analysis and conducting a cluster analysis are different types of analytical approaches that can help researchers better understand the complexity of air </w:t>
-      </w:r>
-      <w:proofErr w:type="gramStart"/>
-      <w:r>
-        <w:rPr>
-          <w:rFonts w:ascii="Times New Roman" w:eastAsia="Times New Roman" w:hAnsi="Times New Roman" w:cs="Times New Roman"/>
-        </w:rPr>
-        <w:t>pollution.</w:t>
-      </w:r>
-      <w:proofErr w:type="gramEnd"/>
-      <w:r>
-        <w:rPr>
-          <w:rFonts w:ascii="Times New Roman" w:eastAsia="Times New Roman" w:hAnsi="Times New Roman" w:cs="Times New Roman"/>
-        </w:rPr>
-        <w:t xml:space="preserve"> These techniques allow the identification of hidden patterns, the reduction of data dimensionality and the grouping of the variables that most contribute to the pollution. By applying these statistical methods, it becomes possible to distinguish the main factors that contribute to poor air quality, detect pollution hotspots and assess how different pollutants interact with each other. Ultimately, these analyses provide valuable insights that support policy development, environmental planning and the creation of targeted interventions aimed at improving air quality and protecting public health.</w:t>
+        <w:t>Making a preliminary analysis of the data, conducting a principal component analysis and conducting a cluster analysis are different types of analytical approaches that can help researchers better understand the complexity of air pollution. These techniques allow the identification of hidden patterns, the reduction of data dimensionality and the grouping of the variables that most contribute to the pollution. By applying these statistical methods, it becomes possible to distinguish the main factors that contribute to poor air quality, detect pollution hotspots and assess how different pollutants interact with each other. Ultimately, these analyses provide valuable insights that support policy development, environmental planning and the creation of targeted interventions aimed at improving air quality and protecting public health.</w:t>
       </w:r>
     </w:p>
     <w:p>
@@ -1756,8 +1659,6 @@
           <w:lang w:val="en-GB"/>
         </w:rPr>
       </w:pPr>
-      <w:bookmarkStart w:id="3" w:name="_GoBack"/>
-      <w:bookmarkEnd w:id="3"/>
       <w:r>
         <w:rPr>
           <w:rFonts w:eastAsia="Times New Roman"/>
@@ -1784,39 +1685,7 @@
           <w:rFonts w:ascii="Times New Roman" w:eastAsia="Times New Roman" w:hAnsi="Times New Roman" w:cs="Times New Roman"/>
           <w:color w:val="333333"/>
         </w:rPr>
-        <w:t xml:space="preserve">The analysis is based on a dataset containing seven variables for each of the 41 cities: the </w:t>
-      </w:r>
-      <w:proofErr w:type="spellStart"/>
-      <w:r>
-        <w:rPr>
-          <w:rFonts w:ascii="Times New Roman" w:eastAsia="Times New Roman" w:hAnsi="Times New Roman" w:cs="Times New Roman"/>
-          <w:color w:val="333333"/>
-        </w:rPr>
-        <w:t>sulphur</w:t>
-      </w:r>
-      <w:proofErr w:type="spellEnd"/>
-      <w:r>
-        <w:rPr>
-          <w:rFonts w:ascii="Times New Roman" w:eastAsia="Times New Roman" w:hAnsi="Times New Roman" w:cs="Times New Roman"/>
-          <w:color w:val="333333"/>
-        </w:rPr>
-        <w:t xml:space="preserve"> dioxide content (</w:t>
-      </w:r>
-      <w:proofErr w:type="spellStart"/>
-      <w:r>
-        <w:rPr>
-          <w:rFonts w:ascii="Times New Roman" w:eastAsia="Times New Roman" w:hAnsi="Times New Roman" w:cs="Times New Roman"/>
-          <w:color w:val="333333"/>
-        </w:rPr>
-        <w:t>μg</w:t>
-      </w:r>
-      <w:proofErr w:type="spellEnd"/>
-      <w:r>
-        <w:rPr>
-          <w:rFonts w:ascii="Times New Roman" w:eastAsia="Times New Roman" w:hAnsi="Times New Roman" w:cs="Times New Roman"/>
-          <w:color w:val="333333"/>
-        </w:rPr>
-        <w:t xml:space="preserve">/m³) </w:t>
+        <w:t xml:space="preserve">The analysis is based on a dataset containing seven variables for each of the 41 cities: the sulphur dioxide content (μg/m³) </w:t>
       </w:r>
       <w:r>
         <w:rPr>
@@ -1850,25 +1719,14 @@
         </w:rPr>
         <w:t>, the number of manufacturing enterprises (</w:t>
       </w:r>
-      <w:proofErr w:type="spellStart"/>
-      <w:r>
-        <w:rPr>
-          <w:rFonts w:ascii="Times New Roman" w:eastAsia="Times New Roman" w:hAnsi="Times New Roman" w:cs="Times New Roman"/>
-          <w:b/>
-          <w:bCs/>
-          <w:color w:val="333333"/>
-        </w:rPr>
-        <w:t>Manuf</w:t>
-      </w:r>
-      <w:proofErr w:type="spellEnd"/>
-      <w:r>
-        <w:rPr>
-          <w:rFonts w:ascii="Times New Roman" w:eastAsia="Times New Roman" w:hAnsi="Times New Roman" w:cs="Times New Roman"/>
-          <w:b/>
-          <w:bCs/>
-          <w:color w:val="333333"/>
-        </w:rPr>
-        <w:t>)</w:t>
+      <w:r>
+        <w:rPr>
+          <w:rFonts w:ascii="Times New Roman" w:eastAsia="Times New Roman" w:hAnsi="Times New Roman" w:cs="Times New Roman"/>
+          <w:b/>
+          <w:bCs/>
+          <w:color w:val="333333"/>
+        </w:rPr>
+        <w:t>Manuf)</w:t>
       </w:r>
       <w:r>
         <w:rPr>
@@ -1916,27 +1774,7 @@
           <w:bCs/>
           <w:color w:val="333333"/>
         </w:rPr>
-        <w:t>(</w:t>
-      </w:r>
-      <w:proofErr w:type="spellStart"/>
-      <w:r>
-        <w:rPr>
-          <w:rFonts w:ascii="Times New Roman" w:eastAsia="Times New Roman" w:hAnsi="Times New Roman" w:cs="Times New Roman"/>
-          <w:b/>
-          <w:bCs/>
-          <w:color w:val="333333"/>
-        </w:rPr>
-        <w:t>Precip</w:t>
-      </w:r>
-      <w:proofErr w:type="spellEnd"/>
-      <w:r>
-        <w:rPr>
-          <w:rFonts w:ascii="Times New Roman" w:eastAsia="Times New Roman" w:hAnsi="Times New Roman" w:cs="Times New Roman"/>
-          <w:b/>
-          <w:bCs/>
-          <w:color w:val="333333"/>
-        </w:rPr>
-        <w:t>)</w:t>
+        <w:t>(Precip)</w:t>
       </w:r>
       <w:r>
         <w:rPr>
@@ -1966,21 +1804,7 @@
         <w:rPr>
           <w:rFonts w:ascii="Times New Roman" w:eastAsia="Times New Roman" w:hAnsi="Times New Roman" w:cs="Times New Roman"/>
         </w:rPr>
-        <w:t xml:space="preserve">The analysis is based on a dataset that contains the </w:t>
-      </w:r>
-      <w:proofErr w:type="spellStart"/>
-      <w:r>
-        <w:rPr>
-          <w:rFonts w:ascii="Times New Roman" w:eastAsia="Times New Roman" w:hAnsi="Times New Roman" w:cs="Times New Roman"/>
-        </w:rPr>
-        <w:t>sulphur</w:t>
-      </w:r>
-      <w:proofErr w:type="spellEnd"/>
-      <w:r>
-        <w:rPr>
-          <w:rFonts w:ascii="Times New Roman" w:eastAsia="Times New Roman" w:hAnsi="Times New Roman" w:cs="Times New Roman"/>
-        </w:rPr>
-        <w:t xml:space="preserve"> dioxide levels for 41 cities in the United States, and other 6 variables related to pollution, from a census carried out in 1970.</w:t>
+        <w:t>The analysis is based on a dataset that contains the sulphur dioxide levels for 41 cities in the United States, and other 6 variables related to pollution, from a census carried out in 1970.</w:t>
       </w:r>
     </w:p>
     <w:p>
@@ -2056,21 +1880,7 @@
         <w:rPr>
           <w:rFonts w:ascii="Times New Roman" w:eastAsia="Times New Roman" w:hAnsi="Times New Roman" w:cs="Times New Roman"/>
         </w:rPr>
-        <w:t xml:space="preserve">With this dataset and specific variables, the analysis that will be carried out in this specific study will allow us to identify the main environmental, demographic and industrial factors associated with </w:t>
-      </w:r>
-      <w:proofErr w:type="spellStart"/>
-      <w:r>
-        <w:rPr>
-          <w:rFonts w:ascii="Times New Roman" w:eastAsia="Times New Roman" w:hAnsi="Times New Roman" w:cs="Times New Roman"/>
-        </w:rPr>
-        <w:t>sulphur</w:t>
-      </w:r>
-      <w:proofErr w:type="spellEnd"/>
-      <w:r>
-        <w:rPr>
-          <w:rFonts w:ascii="Times New Roman" w:eastAsia="Times New Roman" w:hAnsi="Times New Roman" w:cs="Times New Roman"/>
-        </w:rPr>
-        <w:t xml:space="preserve"> dioxide levels, for this specific time.</w:t>
+        <w:t>With this dataset and specific variables, the analysis that will be carried out in this specific study will allow us to identify the main environmental, demographic and industrial factors associated with sulphur dioxide levels, for this specific time.</w:t>
       </w:r>
     </w:p>
     <w:p>
@@ -2108,7 +1918,7 @@
           <w:lang w:val="en-GB"/>
         </w:rPr>
       </w:pPr>
-      <w:bookmarkStart w:id="4" w:name="_Toc216253559"/>
+      <w:bookmarkStart w:id="3" w:name="_Toc216253559"/>
       <w:r>
         <w:rPr>
           <w:rFonts w:eastAsia="Times New Roman"/>
@@ -2117,7 +1927,7 @@
         <w:lastRenderedPageBreak/>
         <w:t>Preliminary Data Analysis &amp; Pre-Processing</w:t>
       </w:r>
-      <w:bookmarkEnd w:id="4"/>
+      <w:bookmarkEnd w:id="3"/>
     </w:p>
     <w:p>
       <w:pPr>
@@ -2302,7 +2112,6 @@
         </w:rPr>
         <w:t>` and `</w:t>
       </w:r>
-      <w:proofErr w:type="spellStart"/>
       <w:r>
         <w:rPr>
           <w:rFonts w:ascii="Times New Roman" w:eastAsia="Times New Roman" w:hAnsi="Times New Roman" w:cs="Times New Roman"/>
@@ -2311,7 +2120,6 @@
         </w:rPr>
         <w:t>manuf</w:t>
       </w:r>
-      <w:proofErr w:type="spellEnd"/>
       <w:r>
         <w:rPr>
           <w:rFonts w:ascii="Times New Roman" w:eastAsia="Times New Roman" w:hAnsi="Times New Roman" w:cs="Times New Roman"/>
@@ -2332,7 +2140,6 @@
         </w:rPr>
         <w:t>` or `</w:t>
       </w:r>
-      <w:proofErr w:type="spellStart"/>
       <w:r>
         <w:rPr>
           <w:rFonts w:ascii="Times New Roman" w:eastAsia="Times New Roman" w:hAnsi="Times New Roman" w:cs="Times New Roman"/>
@@ -2341,7 +2148,6 @@
         </w:rPr>
         <w:t>precip</w:t>
       </w:r>
-      <w:proofErr w:type="spellEnd"/>
       <w:r>
         <w:rPr>
           <w:rFonts w:ascii="Times New Roman" w:eastAsia="Times New Roman" w:hAnsi="Times New Roman" w:cs="Times New Roman"/>
@@ -2368,9 +2174,64 @@
           <w:b/>
           <w:bCs/>
         </w:rPr>
-        <w:t>`</w:t>
-      </w:r>
-      <w:proofErr w:type="spellStart"/>
+        <w:t>`manuf`</w:t>
+      </w:r>
+      <w:r>
+        <w:rPr>
+          <w:rFonts w:ascii="Times New Roman" w:eastAsia="Times New Roman" w:hAnsi="Times New Roman" w:cs="Times New Roman"/>
+        </w:rPr>
+        <w:t xml:space="preserve"> exhibit significant right-skew, which means that they are larger than their medians.</w:t>
+      </w:r>
+    </w:p>
+    <w:p>
+      <w:pPr>
+        <w:jc w:val="both"/>
+        <w:rPr>
+          <w:rFonts w:ascii="Times New Roman" w:eastAsia="Times New Roman" w:hAnsi="Times New Roman" w:cs="Times New Roman"/>
+        </w:rPr>
+      </w:pPr>
+    </w:p>
+    <w:p>
+      <w:pPr>
+        <w:jc w:val="both"/>
+        <w:rPr>
+          <w:rFonts w:ascii="Times New Roman" w:eastAsia="Times New Roman" w:hAnsi="Times New Roman" w:cs="Times New Roman"/>
+        </w:rPr>
+      </w:pPr>
+      <w:r>
+        <w:rPr>
+          <w:rFonts w:ascii="Times New Roman" w:eastAsia="Times New Roman" w:hAnsi="Times New Roman" w:cs="Times New Roman"/>
+        </w:rPr>
+        <w:t xml:space="preserve">These observations are the first step to guide our analysis, because performing a </w:t>
+      </w:r>
+      <w:r>
+        <w:rPr>
+          <w:rFonts w:ascii="Times New Roman" w:eastAsia="Times New Roman" w:hAnsi="Times New Roman" w:cs="Times New Roman"/>
+          <w:b/>
+          <w:bCs/>
+        </w:rPr>
+        <w:t>PCA</w:t>
+      </w:r>
+      <w:r>
+        <w:rPr>
+          <w:rFonts w:ascii="Times New Roman" w:eastAsia="Times New Roman" w:hAnsi="Times New Roman" w:cs="Times New Roman"/>
+        </w:rPr>
+        <w:t xml:space="preserve"> on the raw dataset would lead to a completely invalid result. The first principal component would be dominated by the variables with the largest variance, which in our case are `</w:t>
+      </w:r>
+      <w:r>
+        <w:rPr>
+          <w:rFonts w:ascii="Times New Roman" w:eastAsia="Times New Roman" w:hAnsi="Times New Roman" w:cs="Times New Roman"/>
+          <w:b/>
+          <w:bCs/>
+        </w:rPr>
+        <w:t>pop</w:t>
+      </w:r>
+      <w:r>
+        <w:rPr>
+          <w:rFonts w:ascii="Times New Roman" w:eastAsia="Times New Roman" w:hAnsi="Times New Roman" w:cs="Times New Roman"/>
+        </w:rPr>
+        <w:t>` and `</w:t>
+      </w:r>
       <w:r>
         <w:rPr>
           <w:rFonts w:ascii="Times New Roman" w:eastAsia="Times New Roman" w:hAnsi="Times New Roman" w:cs="Times New Roman"/>
@@ -2379,81 +2240,6 @@
         </w:rPr>
         <w:t>manuf</w:t>
       </w:r>
-      <w:proofErr w:type="spellEnd"/>
-      <w:r>
-        <w:rPr>
-          <w:rFonts w:ascii="Times New Roman" w:eastAsia="Times New Roman" w:hAnsi="Times New Roman" w:cs="Times New Roman"/>
-          <w:b/>
-          <w:bCs/>
-        </w:rPr>
-        <w:t>`</w:t>
-      </w:r>
-      <w:r>
-        <w:rPr>
-          <w:rFonts w:ascii="Times New Roman" w:eastAsia="Times New Roman" w:hAnsi="Times New Roman" w:cs="Times New Roman"/>
-        </w:rPr>
-        <w:t xml:space="preserve"> exhibit significant right-skew, which means that they are larger than their medians.</w:t>
-      </w:r>
-    </w:p>
-    <w:p>
-      <w:pPr>
-        <w:jc w:val="both"/>
-        <w:rPr>
-          <w:rFonts w:ascii="Times New Roman" w:eastAsia="Times New Roman" w:hAnsi="Times New Roman" w:cs="Times New Roman"/>
-        </w:rPr>
-      </w:pPr>
-    </w:p>
-    <w:p>
-      <w:pPr>
-        <w:jc w:val="both"/>
-        <w:rPr>
-          <w:rFonts w:ascii="Times New Roman" w:eastAsia="Times New Roman" w:hAnsi="Times New Roman" w:cs="Times New Roman"/>
-        </w:rPr>
-      </w:pPr>
-      <w:r>
-        <w:rPr>
-          <w:rFonts w:ascii="Times New Roman" w:eastAsia="Times New Roman" w:hAnsi="Times New Roman" w:cs="Times New Roman"/>
-        </w:rPr>
-        <w:t xml:space="preserve">These observations are the first step to guide our analysis, because performing a </w:t>
-      </w:r>
-      <w:r>
-        <w:rPr>
-          <w:rFonts w:ascii="Times New Roman" w:eastAsia="Times New Roman" w:hAnsi="Times New Roman" w:cs="Times New Roman"/>
-          <w:b/>
-          <w:bCs/>
-        </w:rPr>
-        <w:t>PCA</w:t>
-      </w:r>
-      <w:r>
-        <w:rPr>
-          <w:rFonts w:ascii="Times New Roman" w:eastAsia="Times New Roman" w:hAnsi="Times New Roman" w:cs="Times New Roman"/>
-        </w:rPr>
-        <w:t xml:space="preserve"> on the raw dataset would lead to a completely invalid result. The first principal component would be dominated by the variables with the largest variance, which in our case are `</w:t>
-      </w:r>
-      <w:r>
-        <w:rPr>
-          <w:rFonts w:ascii="Times New Roman" w:eastAsia="Times New Roman" w:hAnsi="Times New Roman" w:cs="Times New Roman"/>
-          <w:b/>
-          <w:bCs/>
-        </w:rPr>
-        <w:t>pop</w:t>
-      </w:r>
-      <w:r>
-        <w:rPr>
-          <w:rFonts w:ascii="Times New Roman" w:eastAsia="Times New Roman" w:hAnsi="Times New Roman" w:cs="Times New Roman"/>
-        </w:rPr>
-        <w:t>` and `</w:t>
-      </w:r>
-      <w:proofErr w:type="spellStart"/>
-      <w:r>
-        <w:rPr>
-          <w:rFonts w:ascii="Times New Roman" w:eastAsia="Times New Roman" w:hAnsi="Times New Roman" w:cs="Times New Roman"/>
-          <w:b/>
-          <w:bCs/>
-        </w:rPr>
-        <w:t>manuf</w:t>
-      </w:r>
-      <w:proofErr w:type="spellEnd"/>
       <w:r>
         <w:rPr>
           <w:rFonts w:ascii="Times New Roman" w:eastAsia="Times New Roman" w:hAnsi="Times New Roman" w:cs="Times New Roman"/>
@@ -2465,23 +2251,7 @@
           <w:rFonts w:ascii="Times New Roman" w:eastAsia="Times New Roman" w:hAnsi="Times New Roman" w:cs="Times New Roman"/>
           <w:b/>
         </w:rPr>
-        <w:t>`</w:t>
-      </w:r>
-      <w:proofErr w:type="spellStart"/>
-      <w:r>
-        <w:rPr>
-          <w:rFonts w:ascii="Times New Roman" w:eastAsia="Times New Roman" w:hAnsi="Times New Roman" w:cs="Times New Roman"/>
-          <w:b/>
-        </w:rPr>
-        <w:t>precip</w:t>
-      </w:r>
-      <w:proofErr w:type="spellEnd"/>
-      <w:r>
-        <w:rPr>
-          <w:rFonts w:ascii="Times New Roman" w:eastAsia="Times New Roman" w:hAnsi="Times New Roman" w:cs="Times New Roman"/>
-          <w:b/>
-        </w:rPr>
-        <w:t>`</w:t>
+        <w:t>`precip`</w:t>
       </w:r>
       <w:r>
         <w:rPr>
@@ -2642,7 +2412,6 @@
         </w:rPr>
         <w:t xml:space="preserve"> and a </w:t>
       </w:r>
-      <w:proofErr w:type="spellStart"/>
       <w:r>
         <w:rPr>
           <w:rFonts w:ascii="Times New Roman" w:eastAsia="Times New Roman" w:hAnsi="Times New Roman" w:cs="Times New Roman"/>
@@ -2651,7 +2420,6 @@
         </w:rPr>
         <w:t>HeatMap</w:t>
       </w:r>
-      <w:proofErr w:type="spellEnd"/>
       <w:r>
         <w:rPr>
           <w:rFonts w:ascii="Times New Roman" w:eastAsia="Times New Roman" w:hAnsi="Times New Roman" w:cs="Times New Roman"/>
@@ -2765,21 +2533,7 @@
         <w:rPr>
           <w:sz w:val="20"/>
         </w:rPr>
-        <w:t xml:space="preserve"> - Correlation structure of the data that shows how the variables are correlated. We can see that there are some strong correlations, like pop/</w:t>
-      </w:r>
-      <w:proofErr w:type="spellStart"/>
-      <w:r>
-        <w:rPr>
-          <w:sz w:val="20"/>
-        </w:rPr>
-        <w:t>manuf</w:t>
-      </w:r>
-      <w:proofErr w:type="spellEnd"/>
-      <w:r>
-        <w:rPr>
-          <w:sz w:val="20"/>
-        </w:rPr>
-        <w:t xml:space="preserve"> that is close to 0.95 and negative correlations like the S02 production and the temperature, indicating</w:t>
+        <w:t xml:space="preserve"> - Correlation structure of the data that shows how the variables are correlated. We can see that there are some strong correlations, like pop/manuf that is close to 0.95 and negative correlations like the S02 production and the temperature, indicating</w:t>
       </w:r>
     </w:p>
     <w:p>
@@ -2829,25 +2583,7 @@
           <w:b/>
           <w:bCs/>
         </w:rPr>
-        <w:t>`</w:t>
-      </w:r>
-      <w:proofErr w:type="spellStart"/>
-      <w:r>
-        <w:rPr>
-          <w:rFonts w:ascii="Times New Roman" w:eastAsia="Times New Roman" w:hAnsi="Times New Roman" w:cs="Times New Roman"/>
-          <w:b/>
-          <w:bCs/>
-        </w:rPr>
-        <w:t>manuf</w:t>
-      </w:r>
-      <w:proofErr w:type="spellEnd"/>
-      <w:r>
-        <w:rPr>
-          <w:rFonts w:ascii="Times New Roman" w:eastAsia="Times New Roman" w:hAnsi="Times New Roman" w:cs="Times New Roman"/>
-          <w:b/>
-          <w:bCs/>
-        </w:rPr>
-        <w:t>`</w:t>
+        <w:t>`manuf`</w:t>
       </w:r>
       <w:r>
         <w:rPr>
@@ -2939,25 +2675,7 @@
           <w:b/>
           <w:bCs/>
         </w:rPr>
-        <w:t>`</w:t>
-      </w:r>
-      <w:proofErr w:type="spellStart"/>
-      <w:r>
-        <w:rPr>
-          <w:rFonts w:ascii="Times New Roman" w:eastAsia="Times New Roman" w:hAnsi="Times New Roman" w:cs="Times New Roman"/>
-          <w:b/>
-          <w:bCs/>
-        </w:rPr>
-        <w:t>manuf</w:t>
-      </w:r>
-      <w:proofErr w:type="spellEnd"/>
-      <w:r>
-        <w:rPr>
-          <w:rFonts w:ascii="Times New Roman" w:eastAsia="Times New Roman" w:hAnsi="Times New Roman" w:cs="Times New Roman"/>
-          <w:b/>
-          <w:bCs/>
-        </w:rPr>
-        <w:t>`</w:t>
+        <w:t>`manuf`</w:t>
       </w:r>
       <w:r>
         <w:rPr>
@@ -3027,25 +2745,7 @@
           <w:b/>
           <w:bCs/>
         </w:rPr>
-        <w:t>`</w:t>
-      </w:r>
-      <w:proofErr w:type="spellStart"/>
-      <w:r>
-        <w:rPr>
-          <w:rFonts w:ascii="Times New Roman" w:eastAsia="Times New Roman" w:hAnsi="Times New Roman" w:cs="Times New Roman"/>
-          <w:b/>
-          <w:bCs/>
-        </w:rPr>
-        <w:t>precip</w:t>
-      </w:r>
-      <w:proofErr w:type="spellEnd"/>
-      <w:r>
-        <w:rPr>
-          <w:rFonts w:ascii="Times New Roman" w:eastAsia="Times New Roman" w:hAnsi="Times New Roman" w:cs="Times New Roman"/>
-          <w:b/>
-          <w:bCs/>
-        </w:rPr>
-        <w:t>`</w:t>
+        <w:t>`precip`</w:t>
       </w:r>
       <w:r>
         <w:rPr>
@@ -3087,25 +2787,7 @@
           <w:b/>
           <w:bCs/>
         </w:rPr>
-        <w:t>`</w:t>
-      </w:r>
-      <w:proofErr w:type="spellStart"/>
-      <w:r>
-        <w:rPr>
-          <w:rFonts w:ascii="Times New Roman" w:eastAsia="Times New Roman" w:hAnsi="Times New Roman" w:cs="Times New Roman"/>
-          <w:b/>
-          <w:bCs/>
-        </w:rPr>
-        <w:t>precip</w:t>
-      </w:r>
-      <w:proofErr w:type="spellEnd"/>
-      <w:r>
-        <w:rPr>
-          <w:rFonts w:ascii="Times New Roman" w:eastAsia="Times New Roman" w:hAnsi="Times New Roman" w:cs="Times New Roman"/>
-          <w:b/>
-          <w:bCs/>
-        </w:rPr>
-        <w:t>`</w:t>
+        <w:t>`precip`</w:t>
       </w:r>
       <w:r>
         <w:rPr>
@@ -3224,21 +2906,7 @@
         <w:rPr>
           <w:sz w:val="20"/>
         </w:rPr>
-        <w:t xml:space="preserve"> - </w:t>
-      </w:r>
-      <w:proofErr w:type="spellStart"/>
-      <w:r>
-        <w:rPr>
-          <w:sz w:val="20"/>
-        </w:rPr>
-        <w:t>HeatMap</w:t>
-      </w:r>
-      <w:proofErr w:type="spellEnd"/>
-      <w:r>
-        <w:rPr>
-          <w:sz w:val="20"/>
-        </w:rPr>
-        <w:t xml:space="preserve"> that shows the correlation between the variables, like the graphic in Figure 1</w:t>
+        <w:t xml:space="preserve"> - HeatMap that shows the correlation between the variables, like the graphic in Figure 1</w:t>
       </w:r>
     </w:p>
     <w:p>
@@ -3249,7 +2917,7 @@
           <w:lang w:val="en-GB"/>
         </w:rPr>
       </w:pPr>
-      <w:bookmarkStart w:id="5" w:name="_Toc216253560"/>
+      <w:bookmarkStart w:id="4" w:name="_Toc216253560"/>
       <w:r>
         <w:rPr>
           <w:rFonts w:eastAsia="Times New Roman"/>
@@ -3258,7 +2926,7 @@
         <w:lastRenderedPageBreak/>
         <w:t>Principal Component Analysis (PCA)</w:t>
       </w:r>
-      <w:bookmarkEnd w:id="5"/>
+      <w:bookmarkEnd w:id="4"/>
     </w:p>
     <w:p>
       <w:pPr>
@@ -4064,25 +3732,14 @@
         </w:rPr>
         <w:t>This component confirms the hypothesis that we have set in the previous section, in our preliminary analysis. We have 3 strong positive loadings for `</w:t>
       </w:r>
-      <w:proofErr w:type="spellStart"/>
-      <w:r>
-        <w:rPr>
-          <w:rFonts w:ascii="Times New Roman" w:eastAsia="Times New Roman" w:hAnsi="Times New Roman" w:cs="Times New Roman"/>
-          <w:b/>
-          <w:bCs/>
-          <w:color w:val="1F1F1F"/>
-        </w:rPr>
-        <w:t>manuf</w:t>
-      </w:r>
-      <w:proofErr w:type="spellEnd"/>
-      <w:r>
-        <w:rPr>
-          <w:rFonts w:ascii="Times New Roman" w:eastAsia="Times New Roman" w:hAnsi="Times New Roman" w:cs="Times New Roman"/>
-          <w:b/>
-          <w:bCs/>
-          <w:color w:val="1F1F1F"/>
-        </w:rPr>
-        <w:t>`</w:t>
+      <w:r>
+        <w:rPr>
+          <w:rFonts w:ascii="Times New Roman" w:eastAsia="Times New Roman" w:hAnsi="Times New Roman" w:cs="Times New Roman"/>
+          <w:b/>
+          <w:bCs/>
+          <w:color w:val="1F1F1F"/>
+        </w:rPr>
+        <w:t>manuf`</w:t>
       </w:r>
       <w:r>
         <w:rPr>
@@ -4205,25 +3862,14 @@
         </w:rPr>
         <w:t xml:space="preserve"> and `</w:t>
       </w:r>
-      <w:proofErr w:type="spellStart"/>
-      <w:r>
-        <w:rPr>
-          <w:rFonts w:ascii="Times New Roman" w:eastAsia="Times New Roman" w:hAnsi="Times New Roman" w:cs="Times New Roman"/>
-          <w:b/>
-          <w:bCs/>
-          <w:color w:val="1F1F1F"/>
-        </w:rPr>
-        <w:t>precip</w:t>
-      </w:r>
-      <w:proofErr w:type="spellEnd"/>
-      <w:r>
-        <w:rPr>
-          <w:rFonts w:ascii="Times New Roman" w:eastAsia="Times New Roman" w:hAnsi="Times New Roman" w:cs="Times New Roman"/>
-          <w:b/>
-          <w:bCs/>
-          <w:color w:val="1F1F1F"/>
-        </w:rPr>
-        <w:t>`</w:t>
+      <w:r>
+        <w:rPr>
+          <w:rFonts w:ascii="Times New Roman" w:eastAsia="Times New Roman" w:hAnsi="Times New Roman" w:cs="Times New Roman"/>
+          <w:b/>
+          <w:bCs/>
+          <w:color w:val="1F1F1F"/>
+        </w:rPr>
+        <w:t>precip`</w:t>
       </w:r>
       <w:r>
         <w:rPr>
@@ -4321,25 +3967,14 @@
         </w:rPr>
         <w:t xml:space="preserve"> of 0.80. It also shows a moderate positive loading for `</w:t>
       </w:r>
-      <w:proofErr w:type="spellStart"/>
-      <w:r>
-        <w:rPr>
-          <w:rFonts w:ascii="Times New Roman" w:eastAsia="Times New Roman" w:hAnsi="Times New Roman" w:cs="Times New Roman"/>
-          <w:b/>
-          <w:bCs/>
-          <w:color w:val="1F1F1F"/>
-        </w:rPr>
-        <w:t>precip</w:t>
-      </w:r>
-      <w:proofErr w:type="spellEnd"/>
-      <w:r>
-        <w:rPr>
-          <w:rFonts w:ascii="Times New Roman" w:eastAsia="Times New Roman" w:hAnsi="Times New Roman" w:cs="Times New Roman"/>
-          <w:b/>
-          <w:bCs/>
-          <w:color w:val="1F1F1F"/>
-        </w:rPr>
-        <w:t>`</w:t>
+      <w:r>
+        <w:rPr>
+          <w:rFonts w:ascii="Times New Roman" w:eastAsia="Times New Roman" w:hAnsi="Times New Roman" w:cs="Times New Roman"/>
+          <w:b/>
+          <w:bCs/>
+          <w:color w:val="1F1F1F"/>
+        </w:rPr>
+        <w:t>precip`</w:t>
       </w:r>
       <w:r>
         <w:rPr>
@@ -4397,27 +4032,7 @@
           <w:bCs/>
           <w:color w:val="1F1F1F"/>
         </w:rPr>
-        <w:t xml:space="preserve">Visualization PCA </w:t>
-      </w:r>
-      <w:proofErr w:type="spellStart"/>
-      <w:r>
-        <w:rPr>
-          <w:rFonts w:ascii="Times New Roman" w:eastAsia="Times New Roman" w:hAnsi="Times New Roman" w:cs="Times New Roman"/>
-          <w:b/>
-          <w:bCs/>
-          <w:color w:val="1F1F1F"/>
-        </w:rPr>
-        <w:t>Biplot</w:t>
-      </w:r>
-      <w:proofErr w:type="spellEnd"/>
-      <w:r>
-        <w:rPr>
-          <w:rFonts w:ascii="Times New Roman" w:eastAsia="Times New Roman" w:hAnsi="Times New Roman" w:cs="Times New Roman"/>
-          <w:b/>
-          <w:bCs/>
-          <w:color w:val="1F1F1F"/>
-        </w:rPr>
-        <w:t xml:space="preserve"> of US cities</w:t>
+        <w:t>Visualization PCA Biplot of US cities</w:t>
       </w:r>
     </w:p>
     <w:p>
@@ -4747,27 +4362,7 @@
           <w:color w:val="1F1F1F"/>
         </w:rPr>
         <w:tab/>
-        <w:t xml:space="preserve">      (</w:t>
-      </w:r>
-      <w:proofErr w:type="gramStart"/>
-      <w:r>
-        <w:rPr>
-          <w:rFonts w:ascii="Times New Roman" w:eastAsia="Times New Roman" w:hAnsi="Times New Roman" w:cs="Times New Roman"/>
-          <w:b/>
-          <w:bCs/>
-          <w:color w:val="1F1F1F"/>
-        </w:rPr>
-        <w:t>b</w:t>
-      </w:r>
-      <w:proofErr w:type="gramEnd"/>
-      <w:r>
-        <w:rPr>
-          <w:rFonts w:ascii="Times New Roman" w:eastAsia="Times New Roman" w:hAnsi="Times New Roman" w:cs="Times New Roman"/>
-          <w:b/>
-          <w:bCs/>
-          <w:color w:val="1F1F1F"/>
-        </w:rPr>
-        <w:t>)</w:t>
+        <w:t xml:space="preserve">      (b)</w:t>
       </w:r>
     </w:p>
     <w:p>
@@ -4961,19 +4556,19 @@
           <w:color w:val="2F5496" w:themeColor="accent5" w:themeShade="BF"/>
           <w:sz w:val="20"/>
         </w:rPr>
-        <w:t xml:space="preserve">shows three </w:t>
-      </w:r>
-      <w:proofErr w:type="spellStart"/>
-      <w:r>
-        <w:rPr>
-          <w:rFonts w:ascii="Times New Roman" w:eastAsia="Times New Roman" w:hAnsi="Times New Roman" w:cs="Times New Roman"/>
+        <w:t xml:space="preserve">shows three biplots (a) </w:t>
+      </w:r>
+      <w:r>
+        <w:rPr>
+          <w:rFonts w:ascii="Times New Roman" w:eastAsia="Times New Roman" w:hAnsi="Times New Roman" w:cs="Times New Roman"/>
+          <w:b/>
+          <w:bCs/>
           <w:i/>
           <w:color w:val="2F5496" w:themeColor="accent5" w:themeShade="BF"/>
           <w:sz w:val="20"/>
         </w:rPr>
-        <w:t>biplots</w:t>
-      </w:r>
-      <w:proofErr w:type="spellEnd"/>
+        <w:t>PC1 vs PC2</w:t>
+      </w:r>
       <w:r>
         <w:rPr>
           <w:rFonts w:ascii="Times New Roman" w:eastAsia="Times New Roman" w:hAnsi="Times New Roman" w:cs="Times New Roman"/>
@@ -4981,7 +4576,7 @@
           <w:color w:val="2F5496" w:themeColor="accent5" w:themeShade="BF"/>
           <w:sz w:val="20"/>
         </w:rPr>
-        <w:t xml:space="preserve"> (a) </w:t>
+        <w:t xml:space="preserve"> , (b) </w:t>
       </w:r>
       <w:r>
         <w:rPr>
@@ -4992,21 +4587,17 @@
           <w:color w:val="2F5496" w:themeColor="accent5" w:themeShade="BF"/>
           <w:sz w:val="20"/>
         </w:rPr>
-        <w:t xml:space="preserve">PC1 </w:t>
-      </w:r>
-      <w:proofErr w:type="spellStart"/>
-      <w:r>
-        <w:rPr>
-          <w:rFonts w:ascii="Times New Roman" w:eastAsia="Times New Roman" w:hAnsi="Times New Roman" w:cs="Times New Roman"/>
-          <w:b/>
-          <w:bCs/>
+        <w:t>PC2</w:t>
+      </w:r>
+      <w:r>
+        <w:rPr>
+          <w:rFonts w:ascii="Times New Roman" w:eastAsia="Times New Roman" w:hAnsi="Times New Roman" w:cs="Times New Roman"/>
           <w:i/>
           <w:color w:val="2F5496" w:themeColor="accent5" w:themeShade="BF"/>
           <w:sz w:val="20"/>
         </w:rPr>
-        <w:t>vs</w:t>
-      </w:r>
-      <w:proofErr w:type="spellEnd"/>
+        <w:t xml:space="preserve"> vs </w:t>
+      </w:r>
       <w:r>
         <w:rPr>
           <w:rFonts w:ascii="Times New Roman" w:eastAsia="Times New Roman" w:hAnsi="Times New Roman" w:cs="Times New Roman"/>
@@ -5016,30 +4607,28 @@
           <w:color w:val="2F5496" w:themeColor="accent5" w:themeShade="BF"/>
           <w:sz w:val="20"/>
         </w:rPr>
-        <w:t xml:space="preserve"> </w:t>
-      </w:r>
-      <w:proofErr w:type="gramStart"/>
-      <w:r>
-        <w:rPr>
-          <w:rFonts w:ascii="Times New Roman" w:eastAsia="Times New Roman" w:hAnsi="Times New Roman" w:cs="Times New Roman"/>
-          <w:b/>
-          <w:bCs/>
+        <w:t>PC3</w:t>
+      </w:r>
+      <w:r>
+        <w:rPr>
+          <w:rFonts w:ascii="Times New Roman" w:eastAsia="Times New Roman" w:hAnsi="Times New Roman" w:cs="Times New Roman"/>
           <w:i/>
           <w:color w:val="2F5496" w:themeColor="accent5" w:themeShade="BF"/>
           <w:sz w:val="20"/>
         </w:rPr>
-        <w:t>PC2</w:t>
-      </w:r>
-      <w:r>
-        <w:rPr>
-          <w:rFonts w:ascii="Times New Roman" w:eastAsia="Times New Roman" w:hAnsi="Times New Roman" w:cs="Times New Roman"/>
+        <w:t xml:space="preserve"> and (c) </w:t>
+      </w:r>
+      <w:r>
+        <w:rPr>
+          <w:rFonts w:ascii="Times New Roman" w:eastAsia="Times New Roman" w:hAnsi="Times New Roman" w:cs="Times New Roman"/>
+          <w:b/>
+          <w:bCs/>
           <w:i/>
           <w:color w:val="2F5496" w:themeColor="accent5" w:themeShade="BF"/>
           <w:sz w:val="20"/>
         </w:rPr>
-        <w:t xml:space="preserve"> ,</w:t>
-      </w:r>
-      <w:proofErr w:type="gramEnd"/>
+        <w:t>PC1</w:t>
+      </w:r>
       <w:r>
         <w:rPr>
           <w:rFonts w:ascii="Times New Roman" w:eastAsia="Times New Roman" w:hAnsi="Times New Roman" w:cs="Times New Roman"/>
@@ -5047,7 +4636,7 @@
           <w:color w:val="2F5496" w:themeColor="accent5" w:themeShade="BF"/>
           <w:sz w:val="20"/>
         </w:rPr>
-        <w:t xml:space="preserve"> (b) </w:t>
+        <w:t xml:space="preserve"> vs </w:t>
       </w:r>
       <w:r>
         <w:rPr>
@@ -5058,7 +4647,7 @@
           <w:color w:val="2F5496" w:themeColor="accent5" w:themeShade="BF"/>
           <w:sz w:val="20"/>
         </w:rPr>
-        <w:t>PC2</w:t>
+        <w:t>PC3</w:t>
       </w:r>
       <w:r>
         <w:rPr>
@@ -5067,19 +4656,19 @@
           <w:color w:val="2F5496" w:themeColor="accent5" w:themeShade="BF"/>
           <w:sz w:val="20"/>
         </w:rPr>
-        <w:t xml:space="preserve"> </w:t>
-      </w:r>
-      <w:proofErr w:type="spellStart"/>
-      <w:r>
-        <w:rPr>
-          <w:rFonts w:ascii="Times New Roman" w:eastAsia="Times New Roman" w:hAnsi="Times New Roman" w:cs="Times New Roman"/>
+        <w:t xml:space="preserve"> with variable loadings. Variable vectors originate at the origin; their direction indicates correlation with the components, and their length indicates the strength of the contribution. In panel </w:t>
+      </w:r>
+      <w:r>
+        <w:rPr>
+          <w:rFonts w:ascii="Times New Roman" w:eastAsia="Times New Roman" w:hAnsi="Times New Roman" w:cs="Times New Roman"/>
+          <w:b/>
+          <w:bCs/>
           <w:i/>
           <w:color w:val="2F5496" w:themeColor="accent5" w:themeShade="BF"/>
           <w:sz w:val="20"/>
         </w:rPr>
-        <w:t>vs</w:t>
-      </w:r>
-      <w:proofErr w:type="spellEnd"/>
+        <w:t>(a)</w:t>
+      </w:r>
       <w:r>
         <w:rPr>
           <w:rFonts w:ascii="Times New Roman" w:eastAsia="Times New Roman" w:hAnsi="Times New Roman" w:cs="Times New Roman"/>
@@ -5087,7 +4676,7 @@
           <w:color w:val="2F5496" w:themeColor="accent5" w:themeShade="BF"/>
           <w:sz w:val="20"/>
         </w:rPr>
-        <w:t xml:space="preserve"> </w:t>
+        <w:t xml:space="preserve"> the small angle between `</w:t>
       </w:r>
       <w:r>
         <w:rPr>
@@ -5098,7 +4687,7 @@
           <w:color w:val="2F5496" w:themeColor="accent5" w:themeShade="BF"/>
           <w:sz w:val="20"/>
         </w:rPr>
-        <w:t>PC3</w:t>
+        <w:t>manuf`</w:t>
       </w:r>
       <w:r>
         <w:rPr>
@@ -5107,7 +4696,7 @@
           <w:color w:val="2F5496" w:themeColor="accent5" w:themeShade="BF"/>
           <w:sz w:val="20"/>
         </w:rPr>
-        <w:t xml:space="preserve"> and (c) </w:t>
+        <w:t xml:space="preserve"> and `</w:t>
       </w:r>
       <w:r>
         <w:rPr>
@@ -5118,7 +4707,7 @@
           <w:color w:val="2F5496" w:themeColor="accent5" w:themeShade="BF"/>
           <w:sz w:val="20"/>
         </w:rPr>
-        <w:t>PC1</w:t>
+        <w:t>pop`</w:t>
       </w:r>
       <w:r>
         <w:rPr>
@@ -5127,19 +4716,19 @@
           <w:color w:val="2F5496" w:themeColor="accent5" w:themeShade="BF"/>
           <w:sz w:val="20"/>
         </w:rPr>
-        <w:t xml:space="preserve"> </w:t>
-      </w:r>
-      <w:proofErr w:type="spellStart"/>
-      <w:r>
-        <w:rPr>
-          <w:rFonts w:ascii="Times New Roman" w:eastAsia="Times New Roman" w:hAnsi="Times New Roman" w:cs="Times New Roman"/>
+        <w:t xml:space="preserve"> confirms their strong positive correlation and their dominant contribution to PC1. Graphic </w:t>
+      </w:r>
+      <w:r>
+        <w:rPr>
+          <w:rFonts w:ascii="Times New Roman" w:eastAsia="Times New Roman" w:hAnsi="Times New Roman" w:cs="Times New Roman"/>
+          <w:b/>
+          <w:bCs/>
           <w:i/>
           <w:color w:val="2F5496" w:themeColor="accent5" w:themeShade="BF"/>
           <w:sz w:val="20"/>
         </w:rPr>
-        <w:t>vs</w:t>
-      </w:r>
-      <w:proofErr w:type="spellEnd"/>
+        <w:t>(b)</w:t>
+      </w:r>
       <w:r>
         <w:rPr>
           <w:rFonts w:ascii="Times New Roman" w:eastAsia="Times New Roman" w:hAnsi="Times New Roman" w:cs="Times New Roman"/>
@@ -5147,7 +4736,7 @@
           <w:color w:val="2F5496" w:themeColor="accent5" w:themeShade="BF"/>
           <w:sz w:val="20"/>
         </w:rPr>
-        <w:t xml:space="preserve"> </w:t>
+        <w:t xml:space="preserve"> and </w:t>
       </w:r>
       <w:r>
         <w:rPr>
@@ -5158,7 +4747,7 @@
           <w:color w:val="2F5496" w:themeColor="accent5" w:themeShade="BF"/>
           <w:sz w:val="20"/>
         </w:rPr>
-        <w:t>PC3</w:t>
+        <w:t>(c)</w:t>
       </w:r>
       <w:r>
         <w:rPr>
@@ -5167,119 +4756,6 @@
           <w:color w:val="2F5496" w:themeColor="accent5" w:themeShade="BF"/>
           <w:sz w:val="20"/>
         </w:rPr>
-        <w:t xml:space="preserve"> with variable loadings. Variable vectors originate at the origin; their direction indicates correlation with the components, and their length indicates the strength of the contribution. In panel </w:t>
-      </w:r>
-      <w:r>
-        <w:rPr>
-          <w:rFonts w:ascii="Times New Roman" w:eastAsia="Times New Roman" w:hAnsi="Times New Roman" w:cs="Times New Roman"/>
-          <w:b/>
-          <w:bCs/>
-          <w:i/>
-          <w:color w:val="2F5496" w:themeColor="accent5" w:themeShade="BF"/>
-          <w:sz w:val="20"/>
-        </w:rPr>
-        <w:t>(a)</w:t>
-      </w:r>
-      <w:r>
-        <w:rPr>
-          <w:rFonts w:ascii="Times New Roman" w:eastAsia="Times New Roman" w:hAnsi="Times New Roman" w:cs="Times New Roman"/>
-          <w:i/>
-          <w:color w:val="2F5496" w:themeColor="accent5" w:themeShade="BF"/>
-          <w:sz w:val="20"/>
-        </w:rPr>
-        <w:t xml:space="preserve"> the small angle between `</w:t>
-      </w:r>
-      <w:proofErr w:type="spellStart"/>
-      <w:r>
-        <w:rPr>
-          <w:rFonts w:ascii="Times New Roman" w:eastAsia="Times New Roman" w:hAnsi="Times New Roman" w:cs="Times New Roman"/>
-          <w:b/>
-          <w:bCs/>
-          <w:i/>
-          <w:color w:val="2F5496" w:themeColor="accent5" w:themeShade="BF"/>
-          <w:sz w:val="20"/>
-        </w:rPr>
-        <w:t>manuf</w:t>
-      </w:r>
-      <w:proofErr w:type="spellEnd"/>
-      <w:r>
-        <w:rPr>
-          <w:rFonts w:ascii="Times New Roman" w:eastAsia="Times New Roman" w:hAnsi="Times New Roman" w:cs="Times New Roman"/>
-          <w:b/>
-          <w:bCs/>
-          <w:i/>
-          <w:color w:val="2F5496" w:themeColor="accent5" w:themeShade="BF"/>
-          <w:sz w:val="20"/>
-        </w:rPr>
-        <w:t>`</w:t>
-      </w:r>
-      <w:r>
-        <w:rPr>
-          <w:rFonts w:ascii="Times New Roman" w:eastAsia="Times New Roman" w:hAnsi="Times New Roman" w:cs="Times New Roman"/>
-          <w:i/>
-          <w:color w:val="2F5496" w:themeColor="accent5" w:themeShade="BF"/>
-          <w:sz w:val="20"/>
-        </w:rPr>
-        <w:t xml:space="preserve"> and `</w:t>
-      </w:r>
-      <w:r>
-        <w:rPr>
-          <w:rFonts w:ascii="Times New Roman" w:eastAsia="Times New Roman" w:hAnsi="Times New Roman" w:cs="Times New Roman"/>
-          <w:b/>
-          <w:bCs/>
-          <w:i/>
-          <w:color w:val="2F5496" w:themeColor="accent5" w:themeShade="BF"/>
-          <w:sz w:val="20"/>
-        </w:rPr>
-        <w:t>pop`</w:t>
-      </w:r>
-      <w:r>
-        <w:rPr>
-          <w:rFonts w:ascii="Times New Roman" w:eastAsia="Times New Roman" w:hAnsi="Times New Roman" w:cs="Times New Roman"/>
-          <w:i/>
-          <w:color w:val="2F5496" w:themeColor="accent5" w:themeShade="BF"/>
-          <w:sz w:val="20"/>
-        </w:rPr>
-        <w:t xml:space="preserve"> confirms their strong positive correlation and their dominant contribution to PC1. Graphic </w:t>
-      </w:r>
-      <w:r>
-        <w:rPr>
-          <w:rFonts w:ascii="Times New Roman" w:eastAsia="Times New Roman" w:hAnsi="Times New Roman" w:cs="Times New Roman"/>
-          <w:b/>
-          <w:bCs/>
-          <w:i/>
-          <w:color w:val="2F5496" w:themeColor="accent5" w:themeShade="BF"/>
-          <w:sz w:val="20"/>
-        </w:rPr>
-        <w:t>(b)</w:t>
-      </w:r>
-      <w:r>
-        <w:rPr>
-          <w:rFonts w:ascii="Times New Roman" w:eastAsia="Times New Roman" w:hAnsi="Times New Roman" w:cs="Times New Roman"/>
-          <w:i/>
-          <w:color w:val="2F5496" w:themeColor="accent5" w:themeShade="BF"/>
-          <w:sz w:val="20"/>
-        </w:rPr>
-        <w:t xml:space="preserve"> and </w:t>
-      </w:r>
-      <w:r>
-        <w:rPr>
-          <w:rFonts w:ascii="Times New Roman" w:eastAsia="Times New Roman" w:hAnsi="Times New Roman" w:cs="Times New Roman"/>
-          <w:b/>
-          <w:bCs/>
-          <w:i/>
-          <w:color w:val="2F5496" w:themeColor="accent5" w:themeShade="BF"/>
-          <w:sz w:val="20"/>
-        </w:rPr>
-        <w:t>(c)</w:t>
-      </w:r>
-      <w:r>
-        <w:rPr>
-          <w:rFonts w:ascii="Times New Roman" w:eastAsia="Times New Roman" w:hAnsi="Times New Roman" w:cs="Times New Roman"/>
-          <w:i/>
-          <w:color w:val="2F5496" w:themeColor="accent5" w:themeShade="BF"/>
-          <w:sz w:val="20"/>
-        </w:rPr>
         <w:t xml:space="preserve"> reveal additional structure: PC3 captures variance not visible in PC1–PC2 and clarifies relationships such as the (near) negative alignment of temp and wind</w:t>
       </w:r>
     </w:p>
@@ -5369,23 +4845,7 @@
           <w:rFonts w:ascii="Times New Roman" w:eastAsia="Times New Roman" w:hAnsi="Times New Roman" w:cs="Times New Roman"/>
           <w:color w:val="1F1F1F"/>
         </w:rPr>
-        <w:t xml:space="preserve">PC1 </w:t>
-      </w:r>
-      <w:proofErr w:type="spellStart"/>
-      <w:r>
-        <w:rPr>
-          <w:rFonts w:ascii="Times New Roman" w:eastAsia="Times New Roman" w:hAnsi="Times New Roman" w:cs="Times New Roman"/>
-          <w:color w:val="1F1F1F"/>
-        </w:rPr>
-        <w:t>vs</w:t>
-      </w:r>
-      <w:proofErr w:type="spellEnd"/>
-      <w:r>
-        <w:rPr>
-          <w:rFonts w:ascii="Times New Roman" w:eastAsia="Times New Roman" w:hAnsi="Times New Roman" w:cs="Times New Roman"/>
-          <w:color w:val="1F1F1F"/>
-        </w:rPr>
-        <w:t xml:space="preserve"> PC2, shows some outliers; there are some cities like Chicago, that in the x-axis have a value of 7.5 and that positions it as an outlier. In the context of our PC1, identified as </w:t>
+        <w:t xml:space="preserve">PC1 vs PC2, shows some outliers; there are some cities like Chicago, that in the x-axis have a value of 7.5 and that positions it as an outlier. In the context of our PC1, identified as </w:t>
       </w:r>
       <w:r>
         <w:rPr>
@@ -5464,25 +4924,14 @@
         </w:rPr>
         <w:t>, `</w:t>
       </w:r>
-      <w:proofErr w:type="spellStart"/>
-      <w:r>
-        <w:rPr>
-          <w:rFonts w:ascii="Times New Roman" w:eastAsia="Times New Roman" w:hAnsi="Times New Roman" w:cs="Times New Roman"/>
-          <w:b/>
-          <w:bCs/>
-          <w:color w:val="1F1F1F"/>
-        </w:rPr>
-        <w:t>manuf</w:t>
-      </w:r>
-      <w:proofErr w:type="spellEnd"/>
-      <w:r>
-        <w:rPr>
-          <w:rFonts w:ascii="Times New Roman" w:eastAsia="Times New Roman" w:hAnsi="Times New Roman" w:cs="Times New Roman"/>
-          <w:b/>
-          <w:bCs/>
-          <w:color w:val="1F1F1F"/>
-        </w:rPr>
-        <w:t>`</w:t>
+      <w:r>
+        <w:rPr>
+          <w:rFonts w:ascii="Times New Roman" w:eastAsia="Times New Roman" w:hAnsi="Times New Roman" w:cs="Times New Roman"/>
+          <w:b/>
+          <w:bCs/>
+          <w:color w:val="1F1F1F"/>
+        </w:rPr>
+        <w:t>manuf`</w:t>
       </w:r>
       <w:r>
         <w:rPr>
@@ -5491,25 +4940,14 @@
         </w:rPr>
         <w:t xml:space="preserve"> and `</w:t>
       </w:r>
-      <w:proofErr w:type="spellStart"/>
-      <w:r>
-        <w:rPr>
-          <w:rFonts w:ascii="Times New Roman" w:eastAsia="Times New Roman" w:hAnsi="Times New Roman" w:cs="Times New Roman"/>
-          <w:b/>
-          <w:bCs/>
-          <w:color w:val="1F1F1F"/>
-        </w:rPr>
-        <w:t>precip</w:t>
-      </w:r>
-      <w:proofErr w:type="spellEnd"/>
-      <w:r>
-        <w:rPr>
-          <w:rFonts w:ascii="Times New Roman" w:eastAsia="Times New Roman" w:hAnsi="Times New Roman" w:cs="Times New Roman"/>
-          <w:b/>
-          <w:bCs/>
-          <w:color w:val="1F1F1F"/>
-        </w:rPr>
-        <w:t>`</w:t>
+      <w:r>
+        <w:rPr>
+          <w:rFonts w:ascii="Times New Roman" w:eastAsia="Times New Roman" w:hAnsi="Times New Roman" w:cs="Times New Roman"/>
+          <w:b/>
+          <w:bCs/>
+          <w:color w:val="1F1F1F"/>
+        </w:rPr>
+        <w:t>precip`</w:t>
       </w:r>
       <w:r>
         <w:rPr>
@@ -5557,25 +4995,14 @@
         </w:rPr>
         <w:t>Other important cities in this case for the PC2 were Miami, Charleston, Norfolk and Buffalo. Their score regarding the PC1 was negative, implying that these cities were less populated and with a low industrial complex. However, their high score in PC2 near 2 means a high value of `</w:t>
       </w:r>
-      <w:proofErr w:type="spellStart"/>
-      <w:r>
-        <w:rPr>
-          <w:rFonts w:ascii="Times New Roman" w:eastAsia="Times New Roman" w:hAnsi="Times New Roman" w:cs="Times New Roman"/>
-          <w:b/>
-          <w:bCs/>
-          <w:color w:val="1F1F1F"/>
-        </w:rPr>
-        <w:t>precip</w:t>
-      </w:r>
-      <w:proofErr w:type="spellEnd"/>
-      <w:r>
-        <w:rPr>
-          <w:rFonts w:ascii="Times New Roman" w:eastAsia="Times New Roman" w:hAnsi="Times New Roman" w:cs="Times New Roman"/>
-          <w:b/>
-          <w:bCs/>
-          <w:color w:val="1F1F1F"/>
-        </w:rPr>
-        <w:t>`</w:t>
+      <w:r>
+        <w:rPr>
+          <w:rFonts w:ascii="Times New Roman" w:eastAsia="Times New Roman" w:hAnsi="Times New Roman" w:cs="Times New Roman"/>
+          <w:b/>
+          <w:bCs/>
+          <w:color w:val="1F1F1F"/>
+        </w:rPr>
+        <w:t>precip`</w:t>
       </w:r>
       <w:r>
         <w:rPr>
@@ -5654,23 +5081,7 @@
           <w:rFonts w:ascii="Times New Roman" w:eastAsia="Times New Roman" w:hAnsi="Times New Roman" w:cs="Times New Roman"/>
           <w:color w:val="1F1F1F"/>
         </w:rPr>
-        <w:t xml:space="preserve"> PC1 </w:t>
-      </w:r>
-      <w:proofErr w:type="spellStart"/>
-      <w:r>
-        <w:rPr>
-          <w:rFonts w:ascii="Times New Roman" w:eastAsia="Times New Roman" w:hAnsi="Times New Roman" w:cs="Times New Roman"/>
-          <w:color w:val="1F1F1F"/>
-        </w:rPr>
-        <w:t>vs</w:t>
-      </w:r>
-      <w:proofErr w:type="spellEnd"/>
-      <w:r>
-        <w:rPr>
-          <w:rFonts w:ascii="Times New Roman" w:eastAsia="Times New Roman" w:hAnsi="Times New Roman" w:cs="Times New Roman"/>
-          <w:color w:val="1F1F1F"/>
-        </w:rPr>
-        <w:t xml:space="preserve"> PC3 (Temperature), we have a positive score close to 3, for cities like Miami, being one of the main outliers for PC3. Followed by Chicago, New Orleans and Houston. Based on this, a high value in PC3 scores means high </w:t>
+        <w:t xml:space="preserve"> PC1 vs PC3 (Temperature), we have a positive score close to 3, for cities like Miami, being one of the main outliers for PC3. Followed by Chicago, New Orleans and Houston. Based on this, a high value in PC3 scores means high </w:t>
       </w:r>
       <w:r>
         <w:rPr>
@@ -5695,27 +5106,7 @@
           <w:bCs/>
           <w:color w:val="1F1F1F"/>
         </w:rPr>
-        <w:t xml:space="preserve"> `</w:t>
-      </w:r>
-      <w:proofErr w:type="spellStart"/>
-      <w:r>
-        <w:rPr>
-          <w:rFonts w:ascii="Times New Roman" w:eastAsia="Times New Roman" w:hAnsi="Times New Roman" w:cs="Times New Roman"/>
-          <w:b/>
-          <w:bCs/>
-          <w:color w:val="1F1F1F"/>
-        </w:rPr>
-        <w:t>precip</w:t>
-      </w:r>
-      <w:proofErr w:type="spellEnd"/>
-      <w:r>
-        <w:rPr>
-          <w:rFonts w:ascii="Times New Roman" w:eastAsia="Times New Roman" w:hAnsi="Times New Roman" w:cs="Times New Roman"/>
-          <w:b/>
-          <w:bCs/>
-          <w:color w:val="1F1F1F"/>
-        </w:rPr>
-        <w:t>`</w:t>
+        <w:t xml:space="preserve"> `precip`</w:t>
       </w:r>
       <w:r>
         <w:rPr>
@@ -5724,25 +5115,14 @@
         </w:rPr>
         <w:t>. There is a notorious difference between the weather of Miami, New Orleans, Houston and Chicago; the difference in their climates makes it strange that all of them share a high score in the PC3 axis. It seems to be a contradiction that can be explained due to the fact of the other two more important variables of the PC3, which are `</w:t>
       </w:r>
-      <w:proofErr w:type="spellStart"/>
-      <w:r>
-        <w:rPr>
-          <w:rFonts w:ascii="Times New Roman" w:eastAsia="Times New Roman" w:hAnsi="Times New Roman" w:cs="Times New Roman"/>
-          <w:b/>
-          <w:bCs/>
-          <w:color w:val="1F1F1F"/>
-        </w:rPr>
-        <w:t>manuf</w:t>
-      </w:r>
-      <w:proofErr w:type="spellEnd"/>
-      <w:r>
-        <w:rPr>
-          <w:rFonts w:ascii="Times New Roman" w:eastAsia="Times New Roman" w:hAnsi="Times New Roman" w:cs="Times New Roman"/>
-          <w:b/>
-          <w:bCs/>
-          <w:color w:val="1F1F1F"/>
-        </w:rPr>
-        <w:t>`</w:t>
+      <w:r>
+        <w:rPr>
+          <w:rFonts w:ascii="Times New Roman" w:eastAsia="Times New Roman" w:hAnsi="Times New Roman" w:cs="Times New Roman"/>
+          <w:b/>
+          <w:bCs/>
+          <w:color w:val="1F1F1F"/>
+        </w:rPr>
+        <w:t>manuf`</w:t>
       </w:r>
       <w:r>
         <w:rPr>
@@ -5873,27 +5253,7 @@
           <w:bCs/>
           <w:color w:val="1F1F1F"/>
         </w:rPr>
-        <w:t xml:space="preserve"> PC2 </w:t>
-      </w:r>
-      <w:proofErr w:type="spellStart"/>
-      <w:r>
-        <w:rPr>
-          <w:rFonts w:ascii="Times New Roman" w:eastAsia="Times New Roman" w:hAnsi="Times New Roman" w:cs="Times New Roman"/>
-          <w:b/>
-          <w:bCs/>
-          <w:color w:val="1F1F1F"/>
-        </w:rPr>
-        <w:t>vs</w:t>
-      </w:r>
-      <w:proofErr w:type="spellEnd"/>
-      <w:r>
-        <w:rPr>
-          <w:rFonts w:ascii="Times New Roman" w:eastAsia="Times New Roman" w:hAnsi="Times New Roman" w:cs="Times New Roman"/>
-          <w:b/>
-          <w:bCs/>
-          <w:color w:val="1F1F1F"/>
-        </w:rPr>
-        <w:t xml:space="preserve"> PC3</w:t>
+        <w:t xml:space="preserve"> PC2 vs PC3</w:t>
       </w:r>
       <w:r>
         <w:rPr>
@@ -5916,23 +5276,7 @@
           <w:rFonts w:ascii="Times New Roman" w:eastAsia="Times New Roman" w:hAnsi="Times New Roman" w:cs="Times New Roman"/>
           <w:color w:val="1F1F1F"/>
         </w:rPr>
-        <w:t xml:space="preserve">Other important groups that we can make are Cold &amp; Wet: (Low PC3, High PC2) and Cities like Buffalo and Albany. Another important group that we can form is Hot &amp; Dry cities, which have High PC3, Low PC2. In this group, the most representative city is Phoenix. Nevertheless, the last group formed was </w:t>
-      </w:r>
-      <w:proofErr w:type="gramStart"/>
-      <w:r>
-        <w:rPr>
-          <w:rFonts w:ascii="Times New Roman" w:eastAsia="Times New Roman" w:hAnsi="Times New Roman" w:cs="Times New Roman"/>
-          <w:color w:val="1F1F1F"/>
-        </w:rPr>
-        <w:t>Cold</w:t>
-      </w:r>
-      <w:proofErr w:type="gramEnd"/>
-      <w:r>
-        <w:rPr>
-          <w:rFonts w:ascii="Times New Roman" w:eastAsia="Times New Roman" w:hAnsi="Times New Roman" w:cs="Times New Roman"/>
-          <w:color w:val="1F1F1F"/>
-        </w:rPr>
-        <w:t xml:space="preserve"> and Dry cities, with low PC2 and PC3. In this group, we have cities, like Albuquerque, Denver, Salt Lake City are more desert-like and very dry areas.</w:t>
+        <w:t>Other important groups that we can make are Cold &amp; Wet: (Low PC3, High PC2) and Cities like Buffalo and Albany. Another important group that we can form is Hot &amp; Dry cities, which have High PC3, Low PC2. In this group, the most representative city is Phoenix. Nevertheless, the last group formed was Cold and Dry cities, with low PC2 and PC3. In this group, we have cities, like Albuquerque, Denver, Salt Lake City are more desert-like and very dry areas.</w:t>
       </w:r>
     </w:p>
     <w:p>
@@ -6218,25 +5562,14 @@
         </w:rPr>
         <w:t xml:space="preserve"> and `</w:t>
       </w:r>
-      <w:proofErr w:type="spellStart"/>
-      <w:r>
-        <w:rPr>
-          <w:rFonts w:ascii="Times New Roman" w:eastAsia="Times New Roman" w:hAnsi="Times New Roman" w:cs="Times New Roman"/>
-          <w:b/>
-          <w:bCs/>
-          <w:color w:val="1F1F1F"/>
-        </w:rPr>
-        <w:t>manuf</w:t>
-      </w:r>
-      <w:proofErr w:type="spellEnd"/>
-      <w:r>
-        <w:rPr>
-          <w:rFonts w:ascii="Times New Roman" w:eastAsia="Times New Roman" w:hAnsi="Times New Roman" w:cs="Times New Roman"/>
-          <w:b/>
-          <w:bCs/>
-          <w:color w:val="1F1F1F"/>
-        </w:rPr>
-        <w:t>`</w:t>
+      <w:r>
+        <w:rPr>
+          <w:rFonts w:ascii="Times New Roman" w:eastAsia="Times New Roman" w:hAnsi="Times New Roman" w:cs="Times New Roman"/>
+          <w:b/>
+          <w:bCs/>
+          <w:color w:val="1F1F1F"/>
+        </w:rPr>
+        <w:t>manuf`</w:t>
       </w:r>
       <w:r>
         <w:rPr>
@@ -6314,7 +5647,7 @@
           <w:lang w:val="en-GB"/>
         </w:rPr>
       </w:pPr>
-      <w:bookmarkStart w:id="6" w:name="_Toc216253561"/>
+      <w:bookmarkStart w:id="5" w:name="_Toc216253561"/>
       <w:r>
         <w:rPr>
           <w:rFonts w:eastAsia="Times New Roman"/>
@@ -6323,7 +5656,7 @@
         <w:lastRenderedPageBreak/>
         <w:t>Comprehensive and Comparative Cluster Analysis</w:t>
       </w:r>
-      <w:bookmarkEnd w:id="6"/>
+      <w:bookmarkEnd w:id="5"/>
     </w:p>
     <w:p>
       <w:pPr>
@@ -6447,23 +5780,7 @@
           <w:rFonts w:ascii="Times New Roman" w:eastAsia="Times New Roman" w:hAnsi="Times New Roman" w:cs="Times New Roman"/>
           <w:color w:val="1F1F1F"/>
         </w:rPr>
-        <w:t xml:space="preserve">We will compare results from clustering on the original 7 standardized variables versus the 3 </w:t>
-      </w:r>
-      <w:proofErr w:type="spellStart"/>
-      <w:r>
-        <w:rPr>
-          <w:rFonts w:ascii="Times New Roman" w:eastAsia="Times New Roman" w:hAnsi="Times New Roman" w:cs="Times New Roman"/>
-          <w:color w:val="1F1F1F"/>
-        </w:rPr>
-        <w:t>decorrelated</w:t>
-      </w:r>
-      <w:proofErr w:type="spellEnd"/>
-      <w:r>
-        <w:rPr>
-          <w:rFonts w:ascii="Times New Roman" w:eastAsia="Times New Roman" w:hAnsi="Times New Roman" w:cs="Times New Roman"/>
-          <w:color w:val="1F1F1F"/>
-        </w:rPr>
-        <w:t xml:space="preserve"> PC</w:t>
+        <w:t>We will compare results from clustering on the original 7 standardized variables versus the 3 decorrelated PC</w:t>
       </w:r>
       <w:r>
         <w:rPr>
@@ -6477,23 +5794,7 @@
           <w:rFonts w:ascii="Times New Roman" w:eastAsia="Times New Roman" w:hAnsi="Times New Roman" w:cs="Times New Roman"/>
           <w:color w:val="1F1F1F"/>
         </w:rPr>
-        <w:t xml:space="preserve"> scores. This will test our hypothesis that PCA-based clustering yields superior results by reducing noise and handling </w:t>
-      </w:r>
-      <w:proofErr w:type="spellStart"/>
-      <w:r>
-        <w:rPr>
-          <w:rFonts w:ascii="Times New Roman" w:eastAsia="Times New Roman" w:hAnsi="Times New Roman" w:cs="Times New Roman"/>
-          <w:color w:val="1F1F1F"/>
-        </w:rPr>
-        <w:t>multicollinearity</w:t>
-      </w:r>
-      <w:proofErr w:type="spellEnd"/>
-      <w:r>
-        <w:rPr>
-          <w:rFonts w:ascii="Times New Roman" w:eastAsia="Times New Roman" w:hAnsi="Times New Roman" w:cs="Times New Roman"/>
-          <w:color w:val="1F1F1F"/>
-        </w:rPr>
-        <w:t>.</w:t>
+        <w:t xml:space="preserve"> scores. This will test our hypothesis that PCA-based clustering yields superior results by reducing noise and handling multicollinearity.</w:t>
       </w:r>
     </w:p>
     <w:p>
@@ -6555,23 +5856,7 @@
           <w:rFonts w:ascii="Times New Roman" w:eastAsia="Times New Roman" w:hAnsi="Times New Roman" w:cs="Times New Roman"/>
           <w:color w:val="1F1F1F"/>
         </w:rPr>
-        <w:t xml:space="preserve"> We will compare 3 different linkage criteria (Ward, Complete, </w:t>
-      </w:r>
-      <w:proofErr w:type="gramStart"/>
-      <w:r>
-        <w:rPr>
-          <w:rFonts w:ascii="Times New Roman" w:eastAsia="Times New Roman" w:hAnsi="Times New Roman" w:cs="Times New Roman"/>
-          <w:color w:val="1F1F1F"/>
-        </w:rPr>
-        <w:t>Single</w:t>
-      </w:r>
-      <w:proofErr w:type="gramEnd"/>
-      <w:r>
-        <w:rPr>
-          <w:rFonts w:ascii="Times New Roman" w:eastAsia="Times New Roman" w:hAnsi="Times New Roman" w:cs="Times New Roman"/>
-          <w:color w:val="1F1F1F"/>
-        </w:rPr>
-        <w:t>) to explore Hierarchical Clustering to understand how the definition of "cluster distance" impacts the results.</w:t>
+        <w:t xml:space="preserve"> We will compare 3 different linkage criteria (Ward, Complete, Single) to explore Hierarchical Clustering to understand how the definition of "cluster distance" impacts the results.</w:t>
       </w:r>
     </w:p>
     <w:p>
@@ -6652,15 +5937,7 @@
           <w:rFonts w:ascii="Times New Roman" w:eastAsia="Times New Roman" w:hAnsi="Times New Roman" w:cs="Times New Roman"/>
           <w:color w:val="1F1F1F"/>
         </w:rPr>
-        <w:t xml:space="preserve">Hierarchical clustering builds a nested hierarchy of clusters, visualized as a </w:t>
-      </w:r>
-      <w:proofErr w:type="spellStart"/>
-      <w:r>
-        <w:rPr>
-          <w:rFonts w:ascii="Times New Roman" w:eastAsia="Times New Roman" w:hAnsi="Times New Roman" w:cs="Times New Roman"/>
-          <w:color w:val="1F1F1F"/>
-        </w:rPr>
-        <w:t>dend</w:t>
+        <w:t>Hierarchical clustering builds a nested hierarchy of clusters, visualized as a dend</w:t>
       </w:r>
       <w:r>
         <w:rPr>
@@ -6674,23 +5951,7 @@
           <w:rFonts w:ascii="Times New Roman" w:eastAsia="Times New Roman" w:hAnsi="Times New Roman" w:cs="Times New Roman"/>
           <w:color w:val="1F1F1F"/>
         </w:rPr>
-        <w:t>ogram</w:t>
-      </w:r>
-      <w:proofErr w:type="spellEnd"/>
-      <w:r>
-        <w:rPr>
-          <w:rFonts w:ascii="Times New Roman" w:eastAsia="Times New Roman" w:hAnsi="Times New Roman" w:cs="Times New Roman"/>
-          <w:color w:val="1F1F1F"/>
-        </w:rPr>
-        <w:t xml:space="preserve">. The structure of this tree is highly dependent on the chosen distance metric and linkage criterion; it is a tree-like structure that captures the relationships among all data points in the system [5]. There is the advantage of not needing to specify a predefined number of clusters. The generated </w:t>
-      </w:r>
-      <w:proofErr w:type="spellStart"/>
-      <w:r>
-        <w:rPr>
-          <w:rFonts w:ascii="Times New Roman" w:eastAsia="Times New Roman" w:hAnsi="Times New Roman" w:cs="Times New Roman"/>
-          <w:color w:val="1F1F1F"/>
-        </w:rPr>
-        <w:t>dend</w:t>
+        <w:t>ogram. The structure of this tree is highly dependent on the chosen distance metric and linkage criterion; it is a tree-like structure that captures the relationships among all data points in the system [5]. There is the advantage of not needing to specify a predefined number of clusters. The generated dend</w:t>
       </w:r>
       <w:r>
         <w:rPr>
@@ -6704,15 +5965,7 @@
           <w:rFonts w:ascii="Times New Roman" w:eastAsia="Times New Roman" w:hAnsi="Times New Roman" w:cs="Times New Roman"/>
           <w:color w:val="1F1F1F"/>
         </w:rPr>
-        <w:t>ogram</w:t>
-      </w:r>
-      <w:proofErr w:type="spellEnd"/>
-      <w:r>
-        <w:rPr>
-          <w:rFonts w:ascii="Times New Roman" w:eastAsia="Times New Roman" w:hAnsi="Times New Roman" w:cs="Times New Roman"/>
-          <w:color w:val="1F1F1F"/>
-        </w:rPr>
-        <w:t xml:space="preserve"> can have a horizontal cut through the structure that defines individual clusters at the highest level in the system, as shown in </w:t>
+        <w:t xml:space="preserve">ogram can have a horizontal cut through the structure that defines individual clusters at the highest level in the system, as shown in </w:t>
       </w:r>
       <w:r>
         <w:rPr>
@@ -6790,6 +6043,15 @@
         </w:rPr>
         <w:t>Distance Metric for PCA</w:t>
       </w:r>
+      <w:r>
+        <w:rPr>
+          <w:rFonts w:ascii="Times New Roman" w:eastAsia="Times New Roman" w:hAnsi="Times New Roman" w:cs="Times New Roman"/>
+          <w:b/>
+          <w:bCs/>
+          <w:color w:val="1F1F1F"/>
+        </w:rPr>
+        <w:t xml:space="preserve"> Scores</w:t>
+      </w:r>
     </w:p>
     <w:p>
       <w:pPr>
@@ -6889,43 +6151,16 @@
           <w:color w:val="1F1F1F"/>
         </w:rPr>
         <w:lastRenderedPageBreak/>
-        <w:t>We decided to use the two types of data (</w:t>
-      </w:r>
-      <w:proofErr w:type="spellStart"/>
-      <w:r>
-        <w:rPr>
-          <w:rFonts w:ascii="Times New Roman" w:eastAsia="Times New Roman" w:hAnsi="Times New Roman" w:cs="Times New Roman"/>
-          <w:color w:val="1F1F1F"/>
-        </w:rPr>
-        <w:t>pca</w:t>
-      </w:r>
-      <w:proofErr w:type="spellEnd"/>
-      <w:r>
-        <w:rPr>
-          <w:rFonts w:ascii="Times New Roman" w:eastAsia="Times New Roman" w:hAnsi="Times New Roman" w:cs="Times New Roman"/>
-          <w:color w:val="1F1F1F"/>
-        </w:rPr>
-        <w:t xml:space="preserve"> scores and original variables) so we can compare clustering with (Euclidean on Raw Standardized Data) vs. (Euclidean on PC Scores). Adding up to this, we explicitly acknowledge the limitations of the Euclidean distance for the dataset provided, as there are some variables that show strong correlation, as is shown in the Pair Plot, like `</w:t>
-      </w:r>
-      <w:proofErr w:type="spellStart"/>
-      <w:r>
-        <w:rPr>
-          <w:rFonts w:ascii="Times New Roman" w:eastAsia="Times New Roman" w:hAnsi="Times New Roman" w:cs="Times New Roman"/>
-          <w:b/>
-          <w:bCs/>
-          <w:color w:val="1F1F1F"/>
-        </w:rPr>
-        <w:t>manuf</w:t>
-      </w:r>
-      <w:proofErr w:type="spellEnd"/>
-      <w:r>
-        <w:rPr>
-          <w:rFonts w:ascii="Times New Roman" w:eastAsia="Times New Roman" w:hAnsi="Times New Roman" w:cs="Times New Roman"/>
-          <w:b/>
-          <w:bCs/>
-          <w:color w:val="1F1F1F"/>
-        </w:rPr>
-        <w:t>`</w:t>
+        <w:t>We decided to use the two types of data (pca scores and original variables) so we can compare clustering with (Euclidean on Raw Standardized Data) vs. (Euclidean on PC Scores). Adding up to this, we explicitly acknowledge the limitations of the Euclidean distance for the dataset provided, as there are some variables that show strong correlation, as is shown in the Pair Plot, like `</w:t>
+      </w:r>
+      <w:r>
+        <w:rPr>
+          <w:rFonts w:ascii="Times New Roman" w:eastAsia="Times New Roman" w:hAnsi="Times New Roman" w:cs="Times New Roman"/>
+          <w:b/>
+          <w:bCs/>
+          <w:color w:val="1F1F1F"/>
+        </w:rPr>
+        <w:t>manuf`</w:t>
       </w:r>
       <w:r>
         <w:rPr>
@@ -6973,23 +6208,7 @@
           <w:rFonts w:ascii="Times New Roman" w:eastAsia="Times New Roman" w:hAnsi="Times New Roman" w:cs="Times New Roman"/>
           <w:color w:val="1F1F1F"/>
         </w:rPr>
-        <w:t xml:space="preserve">Nevertheless, the usage of other distances like </w:t>
-      </w:r>
-      <w:proofErr w:type="spellStart"/>
-      <w:r>
-        <w:rPr>
-          <w:rFonts w:ascii="Times New Roman" w:eastAsia="Times New Roman" w:hAnsi="Times New Roman" w:cs="Times New Roman"/>
-          <w:color w:val="1F1F1F"/>
-        </w:rPr>
-        <w:t>Mahalanobis</w:t>
-      </w:r>
-      <w:proofErr w:type="spellEnd"/>
-      <w:r>
-        <w:rPr>
-          <w:rFonts w:ascii="Times New Roman" w:eastAsia="Times New Roman" w:hAnsi="Times New Roman" w:cs="Times New Roman"/>
-          <w:color w:val="1F1F1F"/>
-        </w:rPr>
-        <w:t xml:space="preserve">, which uses the covariance matrix as the core of its calculation to correct these problems, is notoriously sensitive to outliers. Extreme observations like Chicago or Phoenix will affect the calculation. For this reason, we will discard it and we will move forward with the Euclidean Distance for </w:t>
+        <w:t xml:space="preserve">Nevertheless, the usage of other distances like Mahalanobis, which uses the covariance matrix as the core of its calculation to correct these problems, is notoriously sensitive to outliers. Extreme observations like Chicago or Phoenix will affect the calculation. For this reason, we will discard it and we will move forward with the Euclidean Distance for </w:t>
       </w:r>
       <w:r>
         <w:rPr>
@@ -7297,9 +6516,8 @@
           <w:sz w:val="20"/>
           <w:highlight w:val="white"/>
         </w:rPr>
-        <w:t xml:space="preserve"> This figure displays the </w:t>
-      </w:r>
-      <w:proofErr w:type="spellStart"/>
+        <w:t xml:space="preserve"> This figure displays the dend</w:t>
+      </w:r>
       <w:r>
         <w:rPr>
           <w:rFonts w:ascii="Times New Roman" w:eastAsia="Times New Roman" w:hAnsi="Times New Roman" w:cs="Times New Roman"/>
@@ -7309,7 +6527,7 @@
           <w:sz w:val="20"/>
           <w:highlight w:val="white"/>
         </w:rPr>
-        <w:t>dend</w:t>
+        <w:t>r</w:t>
       </w:r>
       <w:r>
         <w:rPr>
@@ -7320,20 +6538,21 @@
           <w:sz w:val="20"/>
           <w:highlight w:val="white"/>
         </w:rPr>
-        <w:t>r</w:t>
-      </w:r>
-      <w:r>
-        <w:rPr>
-          <w:rFonts w:ascii="Times New Roman" w:eastAsia="Times New Roman" w:hAnsi="Times New Roman" w:cs="Times New Roman"/>
+        <w:t xml:space="preserve">ograms of different linkage methods. We can see the use of Single Linkage, Complete Linkage and Ward. </w:t>
+      </w:r>
+      <w:r>
+        <w:rPr>
+          <w:rFonts w:ascii="Times New Roman" w:eastAsia="Times New Roman" w:hAnsi="Times New Roman" w:cs="Times New Roman"/>
+          <w:b/>
+          <w:bCs/>
           <w:i/>
           <w:iCs/>
           <w:color w:val="2F5496" w:themeColor="accent5" w:themeShade="BF"/>
           <w:sz w:val="20"/>
           <w:highlight w:val="white"/>
         </w:rPr>
-        <w:t>ograms</w:t>
-      </w:r>
-      <w:proofErr w:type="spellEnd"/>
+        <w:t>(a)</w:t>
+      </w:r>
       <w:r>
         <w:rPr>
           <w:rFonts w:ascii="Times New Roman" w:eastAsia="Times New Roman" w:hAnsi="Times New Roman" w:cs="Times New Roman"/>
@@ -7343,20 +6562,18 @@
           <w:sz w:val="20"/>
           <w:highlight w:val="white"/>
         </w:rPr>
-        <w:t xml:space="preserve"> of different linkage methods. We can see the use of Single Linkage, Complete Linkage and Ward. </w:t>
-      </w:r>
-      <w:r>
-        <w:rPr>
-          <w:rFonts w:ascii="Times New Roman" w:eastAsia="Times New Roman" w:hAnsi="Times New Roman" w:cs="Times New Roman"/>
-          <w:b/>
-          <w:bCs/>
+        <w:t xml:space="preserve"> The dataset used to build this dend</w:t>
+      </w:r>
+      <w:r>
+        <w:rPr>
+          <w:rFonts w:ascii="Times New Roman" w:eastAsia="Times New Roman" w:hAnsi="Times New Roman" w:cs="Times New Roman"/>
           <w:i/>
           <w:iCs/>
           <w:color w:val="2F5496" w:themeColor="accent5" w:themeShade="BF"/>
           <w:sz w:val="20"/>
           <w:highlight w:val="white"/>
         </w:rPr>
-        <w:t>(a)</w:t>
+        <w:t>r</w:t>
       </w:r>
       <w:r>
         <w:rPr>
@@ -7367,19 +6584,20 @@
           <w:sz w:val="20"/>
           <w:highlight w:val="white"/>
         </w:rPr>
-        <w:t xml:space="preserve"> The dataset used to build this </w:t>
-      </w:r>
-      <w:proofErr w:type="spellStart"/>
-      <w:r>
-        <w:rPr>
-          <w:rFonts w:ascii="Times New Roman" w:eastAsia="Times New Roman" w:hAnsi="Times New Roman" w:cs="Times New Roman"/>
+        <w:t xml:space="preserve">ogram was the standardized raw variables, using the Euclidean distance. On the other hand, part </w:t>
+      </w:r>
+      <w:r>
+        <w:rPr>
+          <w:rFonts w:ascii="Times New Roman" w:eastAsia="Times New Roman" w:hAnsi="Times New Roman" w:cs="Times New Roman"/>
+          <w:b/>
+          <w:bCs/>
           <w:i/>
           <w:iCs/>
           <w:color w:val="2F5496" w:themeColor="accent5" w:themeShade="BF"/>
           <w:sz w:val="20"/>
           <w:highlight w:val="white"/>
         </w:rPr>
-        <w:t>dend</w:t>
+        <w:t>(b)</w:t>
       </w:r>
       <w:r>
         <w:rPr>
@@ -7390,7 +6608,7 @@
           <w:sz w:val="20"/>
           <w:highlight w:val="white"/>
         </w:rPr>
-        <w:t>r</w:t>
+        <w:t xml:space="preserve"> shows the use of the PCA scores to build the dend</w:t>
       </w:r>
       <w:r>
         <w:rPr>
@@ -7401,9 +6619,8 @@
           <w:sz w:val="20"/>
           <w:highlight w:val="white"/>
         </w:rPr>
-        <w:t>ogram</w:t>
-      </w:r>
-      <w:proofErr w:type="spellEnd"/>
+        <w:t>r</w:t>
+      </w:r>
       <w:r>
         <w:rPr>
           <w:rFonts w:ascii="Times New Roman" w:eastAsia="Times New Roman" w:hAnsi="Times New Roman" w:cs="Times New Roman"/>
@@ -7413,7 +6630,53 @@
           <w:sz w:val="20"/>
           <w:highlight w:val="white"/>
         </w:rPr>
-        <w:t xml:space="preserve"> was the standardized raw variables, using the Euclidean distance. On the other hand, part </w:t>
+        <w:t xml:space="preserve">ograms. </w:t>
+      </w:r>
+    </w:p>
+    <w:p>
+      <w:pPr>
+        <w:jc w:val="both"/>
+        <w:rPr>
+          <w:rFonts w:ascii="Times New Roman" w:eastAsia="Times New Roman" w:hAnsi="Times New Roman" w:cs="Times New Roman"/>
+          <w:color w:val="333333"/>
+          <w:highlight w:val="white"/>
+        </w:rPr>
+      </w:pPr>
+    </w:p>
+    <w:p>
+      <w:pPr>
+        <w:jc w:val="both"/>
+        <w:rPr>
+          <w:rFonts w:ascii="Times New Roman" w:eastAsia="Times New Roman" w:hAnsi="Times New Roman" w:cs="Times New Roman"/>
+          <w:color w:val="333333"/>
+          <w:highlight w:val="white"/>
+        </w:rPr>
+      </w:pPr>
+      <w:r>
+        <w:rPr>
+          <w:rFonts w:ascii="Times New Roman" w:eastAsia="Times New Roman" w:hAnsi="Times New Roman" w:cs="Times New Roman"/>
+          <w:color w:val="333333"/>
+          <w:highlight w:val="white"/>
+        </w:rPr>
+        <w:t xml:space="preserve">To analyze </w:t>
+      </w:r>
+      <w:r>
+        <w:rPr>
+          <w:rFonts w:ascii="Times New Roman" w:eastAsia="Times New Roman" w:hAnsi="Times New Roman" w:cs="Times New Roman"/>
+          <w:b/>
+          <w:bCs/>
+          <w:color w:val="333333"/>
+          <w:highlight w:val="white"/>
+        </w:rPr>
+        <w:t>Figure 6</w:t>
+      </w:r>
+      <w:r>
+        <w:rPr>
+          <w:rFonts w:ascii="Times New Roman" w:eastAsia="Times New Roman" w:hAnsi="Times New Roman" w:cs="Times New Roman"/>
+          <w:color w:val="333333"/>
+          <w:highlight w:val="white"/>
+        </w:rPr>
+        <w:t xml:space="preserve"> and select the best linkage method, we can use different metrics; the most important in this case were the </w:t>
       </w:r>
       <w:r>
         <w:rPr>
@@ -7422,42 +6685,63 @@
           <w:bCs/>
           <w:i/>
           <w:iCs/>
-          <w:color w:val="2F5496" w:themeColor="accent5" w:themeShade="BF"/>
-          <w:sz w:val="20"/>
-          <w:highlight w:val="white"/>
-        </w:rPr>
-        <w:t>(b)</w:t>
-      </w:r>
-      <w:r>
-        <w:rPr>
-          <w:rFonts w:ascii="Times New Roman" w:eastAsia="Times New Roman" w:hAnsi="Times New Roman" w:cs="Times New Roman"/>
+          <w:color w:val="333333"/>
+          <w:highlight w:val="white"/>
+        </w:rPr>
+        <w:t>Agglomerative coefficient (AC)</w:t>
+      </w:r>
+      <w:r>
+        <w:rPr>
+          <w:rFonts w:ascii="Times New Roman" w:eastAsia="Times New Roman" w:hAnsi="Times New Roman" w:cs="Times New Roman"/>
+          <w:color w:val="333333"/>
+          <w:highlight w:val="white"/>
+        </w:rPr>
+        <w:t xml:space="preserve"> and the </w:t>
+      </w:r>
+      <w:r>
+        <w:rPr>
+          <w:rFonts w:ascii="Times New Roman" w:eastAsia="Times New Roman" w:hAnsi="Times New Roman" w:cs="Times New Roman"/>
+          <w:b/>
+          <w:bCs/>
           <w:i/>
           <w:iCs/>
-          <w:color w:val="2F5496" w:themeColor="accent5" w:themeShade="BF"/>
-          <w:sz w:val="20"/>
-          <w:highlight w:val="white"/>
-        </w:rPr>
-        <w:t xml:space="preserve"> shows the use of the PCA scores to build the </w:t>
-      </w:r>
-      <w:proofErr w:type="spellStart"/>
-      <w:r>
-        <w:rPr>
-          <w:rFonts w:ascii="Times New Roman" w:eastAsia="Times New Roman" w:hAnsi="Times New Roman" w:cs="Times New Roman"/>
+          <w:color w:val="333333"/>
+          <w:highlight w:val="white"/>
+        </w:rPr>
+        <w:t>Cophenetic Correlation Coefficient</w:t>
+      </w:r>
+      <w:r>
+        <w:rPr>
+          <w:rFonts w:ascii="Times New Roman" w:eastAsia="Times New Roman" w:hAnsi="Times New Roman" w:cs="Times New Roman"/>
+          <w:color w:val="333333"/>
+          <w:highlight w:val="white"/>
+        </w:rPr>
+        <w:t xml:space="preserve"> </w:t>
+      </w:r>
+      <w:r>
+        <w:rPr>
+          <w:rFonts w:ascii="Times New Roman" w:eastAsia="Times New Roman" w:hAnsi="Times New Roman" w:cs="Times New Roman"/>
+          <w:b/>
+          <w:bCs/>
           <w:i/>
           <w:iCs/>
-          <w:color w:val="2F5496" w:themeColor="accent5" w:themeShade="BF"/>
-          <w:sz w:val="20"/>
-          <w:highlight w:val="white"/>
-        </w:rPr>
-        <w:t>dend</w:t>
-      </w:r>
-      <w:r>
-        <w:rPr>
-          <w:rFonts w:ascii="Times New Roman" w:eastAsia="Times New Roman" w:hAnsi="Times New Roman" w:cs="Times New Roman"/>
-          <w:i/>
-          <w:iCs/>
-          <w:color w:val="2F5496" w:themeColor="accent5" w:themeShade="BF"/>
-          <w:sz w:val="20"/>
+          <w:color w:val="333333"/>
+          <w:highlight w:val="white"/>
+        </w:rPr>
+        <w:t>(CCC)</w:t>
+      </w:r>
+      <w:r>
+        <w:rPr>
+          <w:rFonts w:ascii="Times New Roman" w:eastAsia="Times New Roman" w:hAnsi="Times New Roman" w:cs="Times New Roman"/>
+          <w:color w:val="333333"/>
+          <w:highlight w:val="white"/>
+        </w:rPr>
+        <w:t>, both measure different things and can provide useful information about each method. The AC measures clustering structure produced for each clustering method, meaning the stronger clustering when its value gets closer to 1. On the other hand, the CCC measures how accurately a hierarchical clustering dend</w:t>
+      </w:r>
+      <w:r>
+        <w:rPr>
+          <w:rFonts w:ascii="Times New Roman" w:eastAsia="Times New Roman" w:hAnsi="Times New Roman" w:cs="Times New Roman"/>
+          <w:color w:val="333333"/>
           <w:highlight w:val="white"/>
         </w:rPr>
         <w:t>r</w:t>
@@ -7465,179 +6749,10 @@
       <w:r>
         <w:rPr>
           <w:rFonts w:ascii="Times New Roman" w:eastAsia="Times New Roman" w:hAnsi="Times New Roman" w:cs="Times New Roman"/>
-          <w:i/>
-          <w:iCs/>
-          <w:color w:val="2F5496" w:themeColor="accent5" w:themeShade="BF"/>
-          <w:sz w:val="20"/>
-          <w:highlight w:val="white"/>
-        </w:rPr>
-        <w:t>ograms</w:t>
-      </w:r>
-      <w:proofErr w:type="spellEnd"/>
-      <w:r>
-        <w:rPr>
-          <w:rFonts w:ascii="Times New Roman" w:eastAsia="Times New Roman" w:hAnsi="Times New Roman" w:cs="Times New Roman"/>
-          <w:i/>
-          <w:iCs/>
-          <w:color w:val="2F5496" w:themeColor="accent5" w:themeShade="BF"/>
-          <w:sz w:val="20"/>
-          <w:highlight w:val="white"/>
-        </w:rPr>
-        <w:t xml:space="preserve">. </w:t>
-      </w:r>
-    </w:p>
-    <w:p>
-      <w:pPr>
-        <w:jc w:val="both"/>
-        <w:rPr>
-          <w:rFonts w:ascii="Times New Roman" w:eastAsia="Times New Roman" w:hAnsi="Times New Roman" w:cs="Times New Roman"/>
-          <w:color w:val="333333"/>
-          <w:highlight w:val="white"/>
-        </w:rPr>
-      </w:pPr>
-    </w:p>
-    <w:p>
-      <w:pPr>
-        <w:jc w:val="both"/>
-        <w:rPr>
-          <w:rFonts w:ascii="Times New Roman" w:eastAsia="Times New Roman" w:hAnsi="Times New Roman" w:cs="Times New Roman"/>
-          <w:color w:val="333333"/>
-          <w:highlight w:val="white"/>
-        </w:rPr>
-      </w:pPr>
-      <w:r>
-        <w:rPr>
-          <w:rFonts w:ascii="Times New Roman" w:eastAsia="Times New Roman" w:hAnsi="Times New Roman" w:cs="Times New Roman"/>
-          <w:color w:val="333333"/>
-          <w:highlight w:val="white"/>
-        </w:rPr>
-        <w:t xml:space="preserve">To analyze </w:t>
-      </w:r>
-      <w:r>
-        <w:rPr>
-          <w:rFonts w:ascii="Times New Roman" w:eastAsia="Times New Roman" w:hAnsi="Times New Roman" w:cs="Times New Roman"/>
-          <w:b/>
-          <w:bCs/>
-          <w:color w:val="333333"/>
-          <w:highlight w:val="white"/>
-        </w:rPr>
-        <w:t>Figure 6</w:t>
-      </w:r>
-      <w:r>
-        <w:rPr>
-          <w:rFonts w:ascii="Times New Roman" w:eastAsia="Times New Roman" w:hAnsi="Times New Roman" w:cs="Times New Roman"/>
-          <w:color w:val="333333"/>
-          <w:highlight w:val="white"/>
-        </w:rPr>
-        <w:t xml:space="preserve"> and select the best linkage method, we can use different metrics; the most important in this case were the </w:t>
-      </w:r>
-      <w:r>
-        <w:rPr>
-          <w:rFonts w:ascii="Times New Roman" w:eastAsia="Times New Roman" w:hAnsi="Times New Roman" w:cs="Times New Roman"/>
-          <w:b/>
-          <w:bCs/>
-          <w:i/>
-          <w:iCs/>
-          <w:color w:val="333333"/>
-          <w:highlight w:val="white"/>
-        </w:rPr>
-        <w:t>Agglomerative coefficient (AC)</w:t>
-      </w:r>
-      <w:r>
-        <w:rPr>
-          <w:rFonts w:ascii="Times New Roman" w:eastAsia="Times New Roman" w:hAnsi="Times New Roman" w:cs="Times New Roman"/>
-          <w:color w:val="333333"/>
-          <w:highlight w:val="white"/>
-        </w:rPr>
-        <w:t xml:space="preserve"> and the </w:t>
-      </w:r>
-      <w:proofErr w:type="spellStart"/>
-      <w:r>
-        <w:rPr>
-          <w:rFonts w:ascii="Times New Roman" w:eastAsia="Times New Roman" w:hAnsi="Times New Roman" w:cs="Times New Roman"/>
-          <w:b/>
-          <w:bCs/>
-          <w:i/>
-          <w:iCs/>
-          <w:color w:val="333333"/>
-          <w:highlight w:val="white"/>
-        </w:rPr>
-        <w:t>Cophenetic</w:t>
-      </w:r>
-      <w:proofErr w:type="spellEnd"/>
-      <w:r>
-        <w:rPr>
-          <w:rFonts w:ascii="Times New Roman" w:eastAsia="Times New Roman" w:hAnsi="Times New Roman" w:cs="Times New Roman"/>
-          <w:b/>
-          <w:bCs/>
-          <w:i/>
-          <w:iCs/>
-          <w:color w:val="333333"/>
-          <w:highlight w:val="white"/>
-        </w:rPr>
-        <w:t xml:space="preserve"> Correlation Coefficient</w:t>
-      </w:r>
-      <w:r>
-        <w:rPr>
-          <w:rFonts w:ascii="Times New Roman" w:eastAsia="Times New Roman" w:hAnsi="Times New Roman" w:cs="Times New Roman"/>
-          <w:color w:val="333333"/>
-          <w:highlight w:val="white"/>
-        </w:rPr>
-        <w:t xml:space="preserve"> </w:t>
-      </w:r>
-      <w:r>
-        <w:rPr>
-          <w:rFonts w:ascii="Times New Roman" w:eastAsia="Times New Roman" w:hAnsi="Times New Roman" w:cs="Times New Roman"/>
-          <w:b/>
-          <w:bCs/>
-          <w:i/>
-          <w:iCs/>
-          <w:color w:val="333333"/>
-          <w:highlight w:val="white"/>
-        </w:rPr>
-        <w:t>(CCC)</w:t>
-      </w:r>
-      <w:r>
-        <w:rPr>
-          <w:rFonts w:ascii="Times New Roman" w:eastAsia="Times New Roman" w:hAnsi="Times New Roman" w:cs="Times New Roman"/>
-          <w:color w:val="333333"/>
-          <w:highlight w:val="white"/>
-        </w:rPr>
-        <w:t xml:space="preserve">, both measure different things and can provide useful information about each method. The AC measures clustering structure produced for each clustering method, meaning the stronger clustering when its value gets closer to 1. On the other hand, the CCC measures how accurately a hierarchical clustering </w:t>
-      </w:r>
-      <w:proofErr w:type="spellStart"/>
-      <w:r>
-        <w:rPr>
-          <w:rFonts w:ascii="Times New Roman" w:eastAsia="Times New Roman" w:hAnsi="Times New Roman" w:cs="Times New Roman"/>
-          <w:color w:val="333333"/>
-          <w:highlight w:val="white"/>
-        </w:rPr>
-        <w:t>dend</w:t>
-      </w:r>
-      <w:r>
-        <w:rPr>
-          <w:rFonts w:ascii="Times New Roman" w:eastAsia="Times New Roman" w:hAnsi="Times New Roman" w:cs="Times New Roman"/>
-          <w:color w:val="333333"/>
-          <w:highlight w:val="white"/>
-        </w:rPr>
-        <w:t>r</w:t>
-      </w:r>
-      <w:r>
-        <w:rPr>
-          <w:rFonts w:ascii="Times New Roman" w:eastAsia="Times New Roman" w:hAnsi="Times New Roman" w:cs="Times New Roman"/>
-          <w:color w:val="333333"/>
-          <w:highlight w:val="white"/>
-        </w:rPr>
-        <w:t>ogram</w:t>
-      </w:r>
-      <w:proofErr w:type="spellEnd"/>
-      <w:r>
-        <w:rPr>
-          <w:rFonts w:ascii="Times New Roman" w:eastAsia="Times New Roman" w:hAnsi="Times New Roman" w:cs="Times New Roman"/>
-          <w:color w:val="333333"/>
-          <w:highlight w:val="white"/>
-        </w:rPr>
-        <w:t xml:space="preserve"> preserves the original distance between data points [7]. </w:t>
+          <w:color w:val="333333"/>
+          <w:highlight w:val="white"/>
+        </w:rPr>
+        <w:t xml:space="preserve">ogram preserves the original distance between data points [7]. </w:t>
       </w:r>
     </w:p>
     <w:p>
@@ -7701,25 +6816,7 @@
           <w:color w:val="333333"/>
           <w:highlight w:val="white"/>
         </w:rPr>
-        <w:t xml:space="preserve">, we summarize the values of the AC and the CCC for the raw variables and the </w:t>
-      </w:r>
-      <w:proofErr w:type="spellStart"/>
-      <w:r>
-        <w:rPr>
-          <w:rFonts w:ascii="Times New Roman" w:eastAsia="Times New Roman" w:hAnsi="Times New Roman" w:cs="Times New Roman"/>
-          <w:color w:val="333333"/>
-          <w:highlight w:val="white"/>
-        </w:rPr>
-        <w:t>pca</w:t>
-      </w:r>
-      <w:proofErr w:type="spellEnd"/>
-      <w:r>
-        <w:rPr>
-          <w:rFonts w:ascii="Times New Roman" w:eastAsia="Times New Roman" w:hAnsi="Times New Roman" w:cs="Times New Roman"/>
-          <w:color w:val="333333"/>
-          <w:highlight w:val="white"/>
-        </w:rPr>
-        <w:t xml:space="preserve"> scores.</w:t>
+        <w:t>, we summarize the values of the AC and the CCC for the raw variables and the pca scores.</w:t>
       </w:r>
     </w:p>
     <w:p>
@@ -8066,7 +7163,6 @@
         </w:rPr>
         <w:t xml:space="preserve">, which measures the strength of the clustering structure, and the </w:t>
       </w:r>
-      <w:proofErr w:type="spellStart"/>
       <w:r>
         <w:rPr>
           <w:rFonts w:ascii="Times New Roman" w:eastAsia="Times New Roman" w:hAnsi="Times New Roman" w:cs="Times New Roman"/>
@@ -8078,21 +7174,18 @@
           <w:sz w:val="20"/>
           <w:highlight w:val="white"/>
         </w:rPr>
-        <w:t>Cophenetic</w:t>
-      </w:r>
-      <w:proofErr w:type="spellEnd"/>
-      <w:r>
-        <w:rPr>
-          <w:rFonts w:ascii="Times New Roman" w:eastAsia="Times New Roman" w:hAnsi="Times New Roman" w:cs="Times New Roman"/>
-          <w:b/>
-          <w:bCs/>
+        <w:t>Cophenetic Correlation Coefficient (CCC)</w:t>
+      </w:r>
+      <w:r>
+        <w:rPr>
+          <w:rFonts w:ascii="Times New Roman" w:eastAsia="Times New Roman" w:hAnsi="Times New Roman" w:cs="Times New Roman"/>
           <w:i/>
           <w:iCs/>
           <w:color w:val="2F5496" w:themeColor="accent5" w:themeShade="BF"/>
           <w:sz w:val="20"/>
           <w:highlight w:val="white"/>
         </w:rPr>
-        <w:t xml:space="preserve"> Correlation Coefficient (CCC)</w:t>
+        <w:t>, which measures how well the dend</w:t>
       </w:r>
       <w:r>
         <w:rPr>
@@ -8103,9 +7196,8 @@
           <w:sz w:val="20"/>
           <w:highlight w:val="white"/>
         </w:rPr>
-        <w:t xml:space="preserve">, which measures how well the </w:t>
-      </w:r>
-      <w:proofErr w:type="spellStart"/>
+        <w:t>r</w:t>
+      </w:r>
       <w:r>
         <w:rPr>
           <w:rFonts w:ascii="Times New Roman" w:eastAsia="Times New Roman" w:hAnsi="Times New Roman" w:cs="Times New Roman"/>
@@ -8115,15 +7207,618 @@
           <w:sz w:val="20"/>
           <w:highlight w:val="white"/>
         </w:rPr>
-        <w:t>dend</w:t>
+        <w:t xml:space="preserve">ogram preserves the original pairwise distances, respectively. </w:t>
+      </w:r>
+    </w:p>
+    <w:p>
+      <w:pPr>
+        <w:jc w:val="both"/>
+        <w:rPr>
+          <w:rFonts w:ascii="Times New Roman" w:eastAsia="Times New Roman" w:hAnsi="Times New Roman" w:cs="Times New Roman"/>
+          <w:color w:val="333333"/>
+          <w:highlight w:val="white"/>
+        </w:rPr>
+      </w:pPr>
+    </w:p>
+    <w:p>
+      <w:pPr>
+        <w:jc w:val="both"/>
+        <w:rPr>
+          <w:rFonts w:ascii="Times New Roman" w:eastAsia="Times New Roman" w:hAnsi="Times New Roman" w:cs="Times New Roman"/>
+          <w:color w:val="333333"/>
+          <w:highlight w:val="white"/>
+        </w:rPr>
+      </w:pPr>
+      <w:r>
+        <w:rPr>
+          <w:rFonts w:ascii="Times New Roman" w:eastAsia="Times New Roman" w:hAnsi="Times New Roman" w:cs="Times New Roman"/>
+          <w:color w:val="333333"/>
+          <w:highlight w:val="white"/>
+        </w:rPr>
+        <w:t>Based on a visual inspection of the dend</w:t>
+      </w:r>
+      <w:r>
+        <w:rPr>
+          <w:rFonts w:ascii="Times New Roman" w:eastAsia="Times New Roman" w:hAnsi="Times New Roman" w:cs="Times New Roman"/>
+          <w:color w:val="333333"/>
+          <w:highlight w:val="white"/>
+        </w:rPr>
+        <w:t>r</w:t>
+      </w:r>
+      <w:r>
+        <w:rPr>
+          <w:rFonts w:ascii="Times New Roman" w:eastAsia="Times New Roman" w:hAnsi="Times New Roman" w:cs="Times New Roman"/>
+          <w:color w:val="333333"/>
+          <w:highlight w:val="white"/>
+        </w:rPr>
+        <w:t xml:space="preserve">ograms of </w:t>
+      </w:r>
+      <w:r>
+        <w:rPr>
+          <w:rFonts w:ascii="Times New Roman" w:eastAsia="Times New Roman" w:hAnsi="Times New Roman" w:cs="Times New Roman"/>
+          <w:b/>
+          <w:bCs/>
+          <w:color w:val="333333"/>
+          <w:highlight w:val="white"/>
+        </w:rPr>
+        <w:t>Figure</w:t>
+      </w:r>
+      <w:r>
+        <w:rPr>
+          <w:rFonts w:ascii="Times New Roman" w:eastAsia="Times New Roman" w:hAnsi="Times New Roman" w:cs="Times New Roman"/>
+          <w:color w:val="333333"/>
+          <w:highlight w:val="white"/>
+        </w:rPr>
+        <w:t xml:space="preserve"> </w:t>
+      </w:r>
+      <w:r>
+        <w:rPr>
+          <w:rFonts w:ascii="Times New Roman" w:eastAsia="Times New Roman" w:hAnsi="Times New Roman" w:cs="Times New Roman"/>
+          <w:b/>
+          <w:bCs/>
+          <w:color w:val="333333"/>
+          <w:highlight w:val="white"/>
+        </w:rPr>
+        <w:t>6,</w:t>
+      </w:r>
+      <w:r>
+        <w:rPr>
+          <w:rFonts w:ascii="Times New Roman" w:eastAsia="Times New Roman" w:hAnsi="Times New Roman" w:cs="Times New Roman"/>
+          <w:color w:val="333333"/>
+          <w:highlight w:val="white"/>
+        </w:rPr>
+        <w:t xml:space="preserve"> and a quantitative analysis of the metrics in </w:t>
+      </w:r>
+      <w:r>
+        <w:rPr>
+          <w:rFonts w:ascii="Times New Roman" w:eastAsia="Times New Roman" w:hAnsi="Times New Roman" w:cs="Times New Roman"/>
+          <w:b/>
+          <w:bCs/>
+          <w:color w:val="333333"/>
+          <w:highlight w:val="white"/>
+        </w:rPr>
+        <w:t>Table 4</w:t>
+      </w:r>
+      <w:r>
+        <w:rPr>
+          <w:rFonts w:ascii="Times New Roman" w:eastAsia="Times New Roman" w:hAnsi="Times New Roman" w:cs="Times New Roman"/>
+          <w:color w:val="333333"/>
+          <w:highlight w:val="white"/>
+        </w:rPr>
+        <w:t xml:space="preserve">, </w:t>
+      </w:r>
+      <w:r>
+        <w:rPr>
+          <w:rFonts w:ascii="Times New Roman" w:eastAsia="Times New Roman" w:hAnsi="Times New Roman" w:cs="Times New Roman"/>
+          <w:b/>
+          <w:bCs/>
+          <w:color w:val="333333"/>
+          <w:highlight w:val="white"/>
+        </w:rPr>
+        <w:t>Complete Linkage</w:t>
+      </w:r>
+      <w:r>
+        <w:rPr>
+          <w:rFonts w:ascii="Times New Roman" w:eastAsia="Times New Roman" w:hAnsi="Times New Roman" w:cs="Times New Roman"/>
+          <w:color w:val="333333"/>
+          <w:highlight w:val="white"/>
+        </w:rPr>
+        <w:t xml:space="preserve"> is selected as the </w:t>
       </w:r>
       <w:r>
         <w:rPr>
           <w:rFonts w:ascii="Times New Roman" w:eastAsia="Times New Roman" w:hAnsi="Times New Roman" w:cs="Times New Roman"/>
           <w:i/>
           <w:iCs/>
-          <w:color w:val="2F5496" w:themeColor="accent5" w:themeShade="BF"/>
-          <w:sz w:val="20"/>
+          <w:color w:val="333333"/>
+          <w:highlight w:val="white"/>
+        </w:rPr>
+        <w:t>Best Linkage</w:t>
+      </w:r>
+      <w:r>
+        <w:rPr>
+          <w:rFonts w:ascii="Times New Roman" w:eastAsia="Times New Roman" w:hAnsi="Times New Roman" w:cs="Times New Roman"/>
+          <w:color w:val="333333"/>
+          <w:highlight w:val="white"/>
+        </w:rPr>
+        <w:t xml:space="preserve"> method for both the naive and robust approaches.</w:t>
+      </w:r>
+    </w:p>
+    <w:p>
+      <w:pPr>
+        <w:jc w:val="both"/>
+        <w:rPr>
+          <w:rFonts w:ascii="Times New Roman" w:eastAsia="Times New Roman" w:hAnsi="Times New Roman" w:cs="Times New Roman"/>
+          <w:color w:val="333333"/>
+          <w:highlight w:val="white"/>
+        </w:rPr>
+      </w:pPr>
+    </w:p>
+    <w:p>
+      <w:pPr>
+        <w:jc w:val="both"/>
+        <w:rPr>
+          <w:rFonts w:ascii="Times New Roman" w:eastAsia="Times New Roman" w:hAnsi="Times New Roman" w:cs="Times New Roman"/>
+          <w:color w:val="333333"/>
+          <w:highlight w:val="white"/>
+        </w:rPr>
+      </w:pPr>
+      <w:r>
+        <w:rPr>
+          <w:rFonts w:ascii="Times New Roman" w:eastAsia="Times New Roman" w:hAnsi="Times New Roman" w:cs="Times New Roman"/>
+          <w:color w:val="333333"/>
+          <w:highlight w:val="white"/>
+        </w:rPr>
+        <w:t xml:space="preserve">The decision is the result of a trade-off analysis. </w:t>
+      </w:r>
+      <w:r>
+        <w:rPr>
+          <w:rFonts w:ascii="Times New Roman" w:eastAsia="Times New Roman" w:hAnsi="Times New Roman" w:cs="Times New Roman"/>
+          <w:b/>
+          <w:bCs/>
+          <w:color w:val="333333"/>
+          <w:highlight w:val="white"/>
+        </w:rPr>
+        <w:t>Single Linkage</w:t>
+      </w:r>
+      <w:r>
+        <w:rPr>
+          <w:rFonts w:ascii="Times New Roman" w:eastAsia="Times New Roman" w:hAnsi="Times New Roman" w:cs="Times New Roman"/>
+          <w:color w:val="333333"/>
+          <w:highlight w:val="white"/>
+        </w:rPr>
+        <w:t xml:space="preserve">, while exhibiting the highest </w:t>
+      </w:r>
+      <w:r>
+        <w:rPr>
+          <w:rFonts w:ascii="Times New Roman" w:eastAsia="Times New Roman" w:hAnsi="Times New Roman" w:cs="Times New Roman"/>
+          <w:b/>
+          <w:bCs/>
+          <w:i/>
+          <w:iCs/>
+          <w:color w:val="333333"/>
+          <w:highlight w:val="white"/>
+        </w:rPr>
+        <w:t>Cophenetic Correlation Coefficient</w:t>
+      </w:r>
+      <w:r>
+        <w:rPr>
+          <w:rFonts w:ascii="Times New Roman" w:eastAsia="Times New Roman" w:hAnsi="Times New Roman" w:cs="Times New Roman"/>
+          <w:color w:val="333333"/>
+          <w:highlight w:val="white"/>
+        </w:rPr>
+        <w:t xml:space="preserve"> (0.8534), was discarded. Visually, it produces a heavily "chained" and uninterpretable structure, likely by following the path of least resistance along the strong `</w:t>
+      </w:r>
+      <w:r>
+        <w:rPr>
+          <w:rFonts w:ascii="Times New Roman" w:eastAsia="Times New Roman" w:hAnsi="Times New Roman" w:cs="Times New Roman"/>
+          <w:b/>
+          <w:bCs/>
+          <w:color w:val="333333"/>
+          <w:highlight w:val="white"/>
+        </w:rPr>
+        <w:t>pop`</w:t>
+      </w:r>
+      <w:r>
+        <w:rPr>
+          <w:rFonts w:ascii="Times New Roman" w:eastAsia="Times New Roman" w:hAnsi="Times New Roman" w:cs="Times New Roman"/>
+          <w:color w:val="333333"/>
+          <w:highlight w:val="white"/>
+        </w:rPr>
+        <w:t>/`</w:t>
+      </w:r>
+      <w:r>
+        <w:rPr>
+          <w:rFonts w:ascii="Times New Roman" w:eastAsia="Times New Roman" w:hAnsi="Times New Roman" w:cs="Times New Roman"/>
+          <w:b/>
+          <w:bCs/>
+          <w:color w:val="333333"/>
+          <w:highlight w:val="white"/>
+        </w:rPr>
+        <w:t>manuf`</w:t>
+      </w:r>
+      <w:r>
+        <w:rPr>
+          <w:rFonts w:ascii="Times New Roman" w:eastAsia="Times New Roman" w:hAnsi="Times New Roman" w:cs="Times New Roman"/>
+          <w:color w:val="333333"/>
+          <w:highlight w:val="white"/>
+        </w:rPr>
+        <w:t xml:space="preserve"> correlation. Its lower </w:t>
+      </w:r>
+      <w:r>
+        <w:rPr>
+          <w:rFonts w:ascii="Times New Roman" w:eastAsia="Times New Roman" w:hAnsi="Times New Roman" w:cs="Times New Roman"/>
+          <w:b/>
+          <w:bCs/>
+          <w:i/>
+          <w:iCs/>
+          <w:color w:val="333333"/>
+          <w:highlight w:val="white"/>
+        </w:rPr>
+        <w:t>Agglomerative Coefficient</w:t>
+      </w:r>
+      <w:r>
+        <w:rPr>
+          <w:rFonts w:ascii="Times New Roman" w:eastAsia="Times New Roman" w:hAnsi="Times New Roman" w:cs="Times New Roman"/>
+          <w:color w:val="333333"/>
+          <w:highlight w:val="white"/>
+        </w:rPr>
+        <w:t xml:space="preserve"> (0.7034) confirms it fails to find a strong clustering structure. </w:t>
+      </w:r>
+      <w:r>
+        <w:rPr>
+          <w:rFonts w:ascii="Times New Roman" w:eastAsia="Times New Roman" w:hAnsi="Times New Roman" w:cs="Times New Roman"/>
+          <w:b/>
+          <w:bCs/>
+          <w:color w:val="333333"/>
+          <w:highlight w:val="white"/>
+        </w:rPr>
+        <w:t>Ward's method</w:t>
+      </w:r>
+      <w:r>
+        <w:rPr>
+          <w:rFonts w:ascii="Times New Roman" w:eastAsia="Times New Roman" w:hAnsi="Times New Roman" w:cs="Times New Roman"/>
+          <w:color w:val="333333"/>
+          <w:highlight w:val="white"/>
+        </w:rPr>
+        <w:t>, conversely, prod</w:t>
+      </w:r>
+      <w:r>
+        <w:rPr>
+          <w:rFonts w:ascii="Times New Roman" w:eastAsia="Times New Roman" w:hAnsi="Times New Roman" w:cs="Times New Roman"/>
+          <w:color w:val="333333"/>
+          <w:highlight w:val="white"/>
+        </w:rPr>
+        <w:t>uces a visually clean cluster (</w:t>
+      </w:r>
+      <w:r>
+        <w:rPr>
+          <w:rFonts w:ascii="Times New Roman" w:eastAsia="Times New Roman" w:hAnsi="Times New Roman" w:cs="Times New Roman"/>
+          <w:b/>
+          <w:color w:val="333333"/>
+          <w:highlight w:val="white"/>
+        </w:rPr>
+        <w:t>F</w:t>
+      </w:r>
+      <w:r>
+        <w:rPr>
+          <w:rFonts w:ascii="Times New Roman" w:eastAsia="Times New Roman" w:hAnsi="Times New Roman" w:cs="Times New Roman"/>
+          <w:b/>
+          <w:color w:val="333333"/>
+          <w:highlight w:val="white"/>
+        </w:rPr>
+        <w:t>igure 6</w:t>
+      </w:r>
+      <w:r>
+        <w:rPr>
+          <w:rFonts w:ascii="Times New Roman" w:eastAsia="Times New Roman" w:hAnsi="Times New Roman" w:cs="Times New Roman"/>
+          <w:color w:val="333333"/>
+          <w:highlight w:val="white"/>
+        </w:rPr>
+        <w:t xml:space="preserve">) and has high </w:t>
+      </w:r>
+      <w:r>
+        <w:rPr>
+          <w:rFonts w:ascii="Times New Roman" w:eastAsia="Times New Roman" w:hAnsi="Times New Roman" w:cs="Times New Roman"/>
+          <w:b/>
+          <w:bCs/>
+          <w:i/>
+          <w:iCs/>
+          <w:color w:val="333333"/>
+          <w:highlight w:val="white"/>
+        </w:rPr>
+        <w:t>Agglomerative Coefficients</w:t>
+      </w:r>
+      <w:r>
+        <w:rPr>
+          <w:rFonts w:ascii="Times New Roman" w:eastAsia="Times New Roman" w:hAnsi="Times New Roman" w:cs="Times New Roman"/>
+          <w:color w:val="333333"/>
+          <w:highlight w:val="white"/>
+        </w:rPr>
+        <w:t xml:space="preserve"> (0.8553 and 0.8530) for raw data and PCA scores, respectively. However, this is achieved at the cost of a significantly lower </w:t>
+      </w:r>
+      <w:r>
+        <w:rPr>
+          <w:rFonts w:ascii="Times New Roman" w:eastAsia="Times New Roman" w:hAnsi="Times New Roman" w:cs="Times New Roman"/>
+          <w:b/>
+          <w:i/>
+          <w:color w:val="333333"/>
+          <w:highlight w:val="white"/>
+        </w:rPr>
+        <w:t>Cophenetic Correlation</w:t>
+      </w:r>
+      <w:r>
+        <w:rPr>
+          <w:rFonts w:ascii="Times New Roman" w:eastAsia="Times New Roman" w:hAnsi="Times New Roman" w:cs="Times New Roman"/>
+          <w:color w:val="333333"/>
+          <w:highlight w:val="white"/>
+        </w:rPr>
+        <w:t xml:space="preserve"> (0.4698) and (0.4519) for raw data </w:t>
+      </w:r>
+      <w:r>
+        <w:rPr>
+          <w:rFonts w:ascii="Times New Roman" w:eastAsia="Times New Roman" w:hAnsi="Times New Roman" w:cs="Times New Roman"/>
+          <w:color w:val="333333"/>
+          <w:highlight w:val="white"/>
+        </w:rPr>
+        <w:lastRenderedPageBreak/>
+        <w:t>and PCA scores, respectively, indicating that the dendrogram is a poor, distorted representation of the true pairwise distances.</w:t>
+      </w:r>
+    </w:p>
+    <w:p>
+      <w:pPr>
+        <w:jc w:val="both"/>
+        <w:rPr>
+          <w:rFonts w:ascii="Times New Roman" w:eastAsia="Times New Roman" w:hAnsi="Times New Roman" w:cs="Times New Roman"/>
+          <w:color w:val="333333"/>
+          <w:highlight w:val="white"/>
+        </w:rPr>
+      </w:pPr>
+    </w:p>
+    <w:p>
+      <w:pPr>
+        <w:jc w:val="both"/>
+        <w:rPr>
+          <w:rFonts w:ascii="Times New Roman" w:eastAsia="Times New Roman" w:hAnsi="Times New Roman" w:cs="Times New Roman"/>
+          <w:color w:val="333333"/>
+          <w:highlight w:val="white"/>
+        </w:rPr>
+      </w:pPr>
+      <w:r>
+        <w:rPr>
+          <w:rFonts w:ascii="Times New Roman" w:eastAsia="Times New Roman" w:hAnsi="Times New Roman" w:cs="Times New Roman"/>
+          <w:b/>
+          <w:bCs/>
+          <w:color w:val="333333"/>
+          <w:highlight w:val="white"/>
+        </w:rPr>
+        <w:t xml:space="preserve">Complete Linkage, </w:t>
+      </w:r>
+      <w:r>
+        <w:rPr>
+          <w:rFonts w:ascii="Times New Roman" w:eastAsia="Times New Roman" w:hAnsi="Times New Roman" w:cs="Times New Roman"/>
+          <w:color w:val="333333"/>
+          <w:highlight w:val="white"/>
+        </w:rPr>
+        <w:t xml:space="preserve">therefore, offers the best balance. It achieves a high </w:t>
+      </w:r>
+      <w:r>
+        <w:rPr>
+          <w:rFonts w:ascii="Times New Roman" w:eastAsia="Times New Roman" w:hAnsi="Times New Roman" w:cs="Times New Roman"/>
+          <w:b/>
+          <w:bCs/>
+          <w:i/>
+          <w:iCs/>
+          <w:color w:val="333333"/>
+          <w:highlight w:val="white"/>
+        </w:rPr>
+        <w:t>Agglomerative Coefficient</w:t>
+      </w:r>
+      <w:r>
+        <w:rPr>
+          <w:rFonts w:ascii="Times New Roman" w:eastAsia="Times New Roman" w:hAnsi="Times New Roman" w:cs="Times New Roman"/>
+          <w:color w:val="333333"/>
+          <w:highlight w:val="white"/>
+        </w:rPr>
+        <w:t xml:space="preserve"> in both cases, raw data and PCA scores (0.8376–0.9007), comparable to or even exceeding Ward's method, while maintaining a much higher </w:t>
+      </w:r>
+      <w:r>
+        <w:rPr>
+          <w:rFonts w:ascii="Times New Roman" w:eastAsia="Times New Roman" w:hAnsi="Times New Roman" w:cs="Times New Roman"/>
+          <w:b/>
+          <w:bCs/>
+          <w:i/>
+          <w:iCs/>
+          <w:color w:val="333333"/>
+          <w:highlight w:val="white"/>
+        </w:rPr>
+        <w:t>Cophenetic Correlation</w:t>
+      </w:r>
+      <w:r>
+        <w:rPr>
+          <w:rFonts w:ascii="Times New Roman" w:eastAsia="Times New Roman" w:hAnsi="Times New Roman" w:cs="Times New Roman"/>
+          <w:color w:val="333333"/>
+          <w:highlight w:val="white"/>
+        </w:rPr>
+        <w:t>. It successfully identifies a strong, compact clustering structure without excessively distorting the underlying data, making it the most reliable and defensible choice.</w:t>
+      </w:r>
+    </w:p>
+    <w:p>
+      <w:pPr>
+        <w:jc w:val="both"/>
+        <w:rPr>
+          <w:rFonts w:ascii="Times New Roman" w:eastAsia="Times New Roman" w:hAnsi="Times New Roman" w:cs="Times New Roman"/>
+          <w:color w:val="333333"/>
+          <w:highlight w:val="white"/>
+        </w:rPr>
+      </w:pPr>
+    </w:p>
+    <w:p>
+      <w:pPr>
+        <w:jc w:val="both"/>
+        <w:rPr>
+          <w:rFonts w:ascii="Times New Roman" w:eastAsia="Times New Roman" w:hAnsi="Times New Roman" w:cs="Times New Roman"/>
+          <w:b/>
+          <w:bCs/>
+          <w:color w:val="333333"/>
+          <w:highlight w:val="white"/>
+        </w:rPr>
+      </w:pPr>
+      <w:r>
+        <w:rPr>
+          <w:rFonts w:ascii="Times New Roman" w:eastAsia="Times New Roman" w:hAnsi="Times New Roman" w:cs="Times New Roman"/>
+          <w:b/>
+          <w:bCs/>
+          <w:color w:val="333333"/>
+          <w:highlight w:val="white"/>
+        </w:rPr>
+        <w:t>Determining the Optimal Number of Clusters (k)</w:t>
+      </w:r>
+    </w:p>
+    <w:p>
+      <w:pPr>
+        <w:jc w:val="both"/>
+        <w:rPr>
+          <w:rFonts w:ascii="Times New Roman" w:eastAsia="Times New Roman" w:hAnsi="Times New Roman" w:cs="Times New Roman"/>
+          <w:color w:val="333333"/>
+          <w:highlight w:val="white"/>
+        </w:rPr>
+      </w:pPr>
+    </w:p>
+    <w:p>
+      <w:pPr>
+        <w:jc w:val="both"/>
+        <w:rPr>
+          <w:rFonts w:ascii="Times New Roman" w:eastAsia="Times New Roman" w:hAnsi="Times New Roman" w:cs="Times New Roman"/>
+          <w:color w:val="333333"/>
+          <w:highlight w:val="white"/>
+        </w:rPr>
+      </w:pPr>
+      <w:r>
+        <w:rPr>
+          <w:rFonts w:ascii="Times New Roman" w:eastAsia="Times New Roman" w:hAnsi="Times New Roman" w:cs="Times New Roman"/>
+          <w:color w:val="333333"/>
+          <w:highlight w:val="white"/>
+        </w:rPr>
+        <w:t xml:space="preserve">After selecting the best linkage criterion, the </w:t>
+      </w:r>
+      <w:r>
+        <w:rPr>
+          <w:rFonts w:ascii="Times New Roman" w:eastAsia="Times New Roman" w:hAnsi="Times New Roman" w:cs="Times New Roman"/>
+          <w:b/>
+          <w:bCs/>
+          <w:color w:val="333333"/>
+          <w:highlight w:val="white"/>
+        </w:rPr>
+        <w:t>Complete Method</w:t>
+      </w:r>
+      <w:r>
+        <w:rPr>
+          <w:rFonts w:ascii="Times New Roman" w:eastAsia="Times New Roman" w:hAnsi="Times New Roman" w:cs="Times New Roman"/>
+          <w:color w:val="333333"/>
+          <w:highlight w:val="white"/>
+        </w:rPr>
+        <w:t>, for both approaches, we now proceed to determine the optimal number of clusters, `</w:t>
+      </w:r>
+      <w:r>
+        <w:rPr>
+          <w:rFonts w:ascii="Times New Roman" w:eastAsia="Times New Roman" w:hAnsi="Times New Roman" w:cs="Times New Roman"/>
+          <w:b/>
+          <w:bCs/>
+          <w:color w:val="333333"/>
+          <w:highlight w:val="white"/>
+        </w:rPr>
+        <w:t>k</w:t>
+      </w:r>
+      <w:r>
+        <w:rPr>
+          <w:rFonts w:ascii="Times New Roman" w:eastAsia="Times New Roman" w:hAnsi="Times New Roman" w:cs="Times New Roman"/>
+          <w:color w:val="333333"/>
+          <w:highlight w:val="white"/>
+        </w:rPr>
+        <w:t>`, for this specific method</w:t>
+      </w:r>
+      <w:r>
+        <w:rPr>
+          <w:rFonts w:ascii="Times New Roman" w:eastAsia="Times New Roman" w:hAnsi="Times New Roman" w:cs="Times New Roman"/>
+          <w:color w:val="333333"/>
+          <w:highlight w:val="white"/>
+        </w:rPr>
+        <w:t xml:space="preserve">, with the </w:t>
+      </w:r>
+      <w:r>
+        <w:rPr>
+          <w:rFonts w:ascii="Times New Roman" w:eastAsia="Times New Roman" w:hAnsi="Times New Roman" w:cs="Times New Roman"/>
+          <w:b/>
+          <w:color w:val="333333"/>
+          <w:highlight w:val="white"/>
+          <w:u w:val="single"/>
+        </w:rPr>
+        <w:t>estimation methods</w:t>
+      </w:r>
+      <w:r>
+        <w:rPr>
+          <w:rFonts w:ascii="Times New Roman" w:eastAsia="Times New Roman" w:hAnsi="Times New Roman" w:cs="Times New Roman"/>
+          <w:color w:val="333333"/>
+          <w:highlight w:val="white"/>
+        </w:rPr>
+        <w:t xml:space="preserve"> </w:t>
+      </w:r>
+      <w:r>
+        <w:rPr>
+          <w:rFonts w:ascii="Times New Roman" w:eastAsia="Times New Roman" w:hAnsi="Times New Roman" w:cs="Times New Roman"/>
+          <w:b/>
+          <w:color w:val="333333"/>
+          <w:highlight w:val="white"/>
+        </w:rPr>
+        <w:t>Elbow Method</w:t>
+      </w:r>
+      <w:r>
+        <w:rPr>
+          <w:rFonts w:ascii="Times New Roman" w:eastAsia="Times New Roman" w:hAnsi="Times New Roman" w:cs="Times New Roman"/>
+          <w:color w:val="333333"/>
+          <w:highlight w:val="white"/>
+        </w:rPr>
+        <w:t xml:space="preserve">, </w:t>
+      </w:r>
+      <w:r>
+        <w:rPr>
+          <w:rFonts w:ascii="Times New Roman" w:eastAsia="Times New Roman" w:hAnsi="Times New Roman" w:cs="Times New Roman"/>
+          <w:b/>
+          <w:color w:val="333333"/>
+          <w:highlight w:val="white"/>
+        </w:rPr>
+        <w:t>Gap Statistics</w:t>
+      </w:r>
+      <w:r>
+        <w:rPr>
+          <w:rFonts w:ascii="Times New Roman" w:eastAsia="Times New Roman" w:hAnsi="Times New Roman" w:cs="Times New Roman"/>
+          <w:color w:val="333333"/>
+          <w:highlight w:val="white"/>
+        </w:rPr>
+        <w:t xml:space="preserve"> and </w:t>
+      </w:r>
+      <w:r>
+        <w:rPr>
+          <w:rFonts w:ascii="Times New Roman" w:eastAsia="Times New Roman" w:hAnsi="Times New Roman" w:cs="Times New Roman"/>
+          <w:b/>
+          <w:color w:val="333333"/>
+          <w:highlight w:val="white"/>
+        </w:rPr>
+        <w:t>Silhouette Method</w:t>
+      </w:r>
+      <w:r>
+        <w:rPr>
+          <w:rFonts w:ascii="Times New Roman" w:eastAsia="Times New Roman" w:hAnsi="Times New Roman" w:cs="Times New Roman"/>
+          <w:color w:val="333333"/>
+          <w:highlight w:val="white"/>
+        </w:rPr>
+        <w:t>. While visual inspection of the dend</w:t>
+      </w:r>
+      <w:r>
+        <w:rPr>
+          <w:rFonts w:ascii="Times New Roman" w:eastAsia="Times New Roman" w:hAnsi="Times New Roman" w:cs="Times New Roman"/>
+          <w:color w:val="333333"/>
           <w:highlight w:val="white"/>
         </w:rPr>
         <w:t>r</w:t>
@@ -8131,719 +7826,10 @@
       <w:r>
         <w:rPr>
           <w:rFonts w:ascii="Times New Roman" w:eastAsia="Times New Roman" w:hAnsi="Times New Roman" w:cs="Times New Roman"/>
-          <w:i/>
-          <w:iCs/>
-          <w:color w:val="2F5496" w:themeColor="accent5" w:themeShade="BF"/>
-          <w:sz w:val="20"/>
-          <w:highlight w:val="white"/>
-        </w:rPr>
-        <w:t>ogram</w:t>
-      </w:r>
-      <w:proofErr w:type="spellEnd"/>
-      <w:r>
-        <w:rPr>
-          <w:rFonts w:ascii="Times New Roman" w:eastAsia="Times New Roman" w:hAnsi="Times New Roman" w:cs="Times New Roman"/>
-          <w:i/>
-          <w:iCs/>
-          <w:color w:val="2F5496" w:themeColor="accent5" w:themeShade="BF"/>
-          <w:sz w:val="20"/>
-          <w:highlight w:val="white"/>
-        </w:rPr>
-        <w:t xml:space="preserve"> preserves the original pairwise distances, respectively. </w:t>
-      </w:r>
-    </w:p>
-    <w:p>
-      <w:pPr>
-        <w:jc w:val="both"/>
-        <w:rPr>
-          <w:rFonts w:ascii="Times New Roman" w:eastAsia="Times New Roman" w:hAnsi="Times New Roman" w:cs="Times New Roman"/>
-          <w:color w:val="333333"/>
-          <w:highlight w:val="white"/>
-        </w:rPr>
-      </w:pPr>
-    </w:p>
-    <w:p>
-      <w:pPr>
-        <w:jc w:val="both"/>
-        <w:rPr>
-          <w:rFonts w:ascii="Times New Roman" w:eastAsia="Times New Roman" w:hAnsi="Times New Roman" w:cs="Times New Roman"/>
-          <w:color w:val="333333"/>
-          <w:highlight w:val="white"/>
-        </w:rPr>
-      </w:pPr>
-      <w:r>
-        <w:rPr>
-          <w:rFonts w:ascii="Times New Roman" w:eastAsia="Times New Roman" w:hAnsi="Times New Roman" w:cs="Times New Roman"/>
-          <w:color w:val="333333"/>
-          <w:highlight w:val="white"/>
-        </w:rPr>
-        <w:t xml:space="preserve">Based on a visual inspection of the </w:t>
-      </w:r>
-      <w:proofErr w:type="spellStart"/>
-      <w:r>
-        <w:rPr>
-          <w:rFonts w:ascii="Times New Roman" w:eastAsia="Times New Roman" w:hAnsi="Times New Roman" w:cs="Times New Roman"/>
-          <w:color w:val="333333"/>
-          <w:highlight w:val="white"/>
-        </w:rPr>
-        <w:t>dend</w:t>
-      </w:r>
-      <w:r>
-        <w:rPr>
-          <w:rFonts w:ascii="Times New Roman" w:eastAsia="Times New Roman" w:hAnsi="Times New Roman" w:cs="Times New Roman"/>
-          <w:color w:val="333333"/>
-          <w:highlight w:val="white"/>
-        </w:rPr>
-        <w:t>r</w:t>
-      </w:r>
-      <w:r>
-        <w:rPr>
-          <w:rFonts w:ascii="Times New Roman" w:eastAsia="Times New Roman" w:hAnsi="Times New Roman" w:cs="Times New Roman"/>
-          <w:color w:val="333333"/>
-          <w:highlight w:val="white"/>
-        </w:rPr>
-        <w:t>ograms</w:t>
-      </w:r>
-      <w:proofErr w:type="spellEnd"/>
-      <w:r>
-        <w:rPr>
-          <w:rFonts w:ascii="Times New Roman" w:eastAsia="Times New Roman" w:hAnsi="Times New Roman" w:cs="Times New Roman"/>
-          <w:color w:val="333333"/>
-          <w:highlight w:val="white"/>
-        </w:rPr>
-        <w:t xml:space="preserve"> of </w:t>
-      </w:r>
-      <w:r>
-        <w:rPr>
-          <w:rFonts w:ascii="Times New Roman" w:eastAsia="Times New Roman" w:hAnsi="Times New Roman" w:cs="Times New Roman"/>
-          <w:b/>
-          <w:bCs/>
-          <w:color w:val="333333"/>
-          <w:highlight w:val="white"/>
-        </w:rPr>
-        <w:t>Figure</w:t>
-      </w:r>
-      <w:r>
-        <w:rPr>
-          <w:rFonts w:ascii="Times New Roman" w:eastAsia="Times New Roman" w:hAnsi="Times New Roman" w:cs="Times New Roman"/>
-          <w:color w:val="333333"/>
-          <w:highlight w:val="white"/>
-        </w:rPr>
-        <w:t xml:space="preserve"> </w:t>
-      </w:r>
-      <w:r>
-        <w:rPr>
-          <w:rFonts w:ascii="Times New Roman" w:eastAsia="Times New Roman" w:hAnsi="Times New Roman" w:cs="Times New Roman"/>
-          <w:b/>
-          <w:bCs/>
-          <w:color w:val="333333"/>
-          <w:highlight w:val="white"/>
-        </w:rPr>
-        <w:t>6,</w:t>
-      </w:r>
-      <w:r>
-        <w:rPr>
-          <w:rFonts w:ascii="Times New Roman" w:eastAsia="Times New Roman" w:hAnsi="Times New Roman" w:cs="Times New Roman"/>
-          <w:color w:val="333333"/>
-          <w:highlight w:val="white"/>
-        </w:rPr>
-        <w:t xml:space="preserve"> and a quantitative analysis of the metrics in </w:t>
-      </w:r>
-      <w:r>
-        <w:rPr>
-          <w:rFonts w:ascii="Times New Roman" w:eastAsia="Times New Roman" w:hAnsi="Times New Roman" w:cs="Times New Roman"/>
-          <w:b/>
-          <w:bCs/>
-          <w:color w:val="333333"/>
-          <w:highlight w:val="white"/>
-        </w:rPr>
-        <w:t>Table 4</w:t>
-      </w:r>
-      <w:r>
-        <w:rPr>
-          <w:rFonts w:ascii="Times New Roman" w:eastAsia="Times New Roman" w:hAnsi="Times New Roman" w:cs="Times New Roman"/>
-          <w:color w:val="333333"/>
-          <w:highlight w:val="white"/>
-        </w:rPr>
-        <w:t xml:space="preserve">, </w:t>
-      </w:r>
-      <w:r>
-        <w:rPr>
-          <w:rFonts w:ascii="Times New Roman" w:eastAsia="Times New Roman" w:hAnsi="Times New Roman" w:cs="Times New Roman"/>
-          <w:b/>
-          <w:bCs/>
-          <w:color w:val="333333"/>
-          <w:highlight w:val="white"/>
-        </w:rPr>
-        <w:t>Complete Linkage</w:t>
-      </w:r>
-      <w:r>
-        <w:rPr>
-          <w:rFonts w:ascii="Times New Roman" w:eastAsia="Times New Roman" w:hAnsi="Times New Roman" w:cs="Times New Roman"/>
-          <w:color w:val="333333"/>
-          <w:highlight w:val="white"/>
-        </w:rPr>
-        <w:t xml:space="preserve"> is selected as the </w:t>
-      </w:r>
-      <w:r>
-        <w:rPr>
-          <w:rFonts w:ascii="Times New Roman" w:eastAsia="Times New Roman" w:hAnsi="Times New Roman" w:cs="Times New Roman"/>
-          <w:i/>
-          <w:iCs/>
-          <w:color w:val="333333"/>
-          <w:highlight w:val="white"/>
-        </w:rPr>
-        <w:t>Best Linkage</w:t>
-      </w:r>
-      <w:r>
-        <w:rPr>
-          <w:rFonts w:ascii="Times New Roman" w:eastAsia="Times New Roman" w:hAnsi="Times New Roman" w:cs="Times New Roman"/>
-          <w:color w:val="333333"/>
-          <w:highlight w:val="white"/>
-        </w:rPr>
-        <w:t xml:space="preserve"> method for both the naive and robust approaches.</w:t>
-      </w:r>
-    </w:p>
-    <w:p>
-      <w:pPr>
-        <w:jc w:val="both"/>
-        <w:rPr>
-          <w:rFonts w:ascii="Times New Roman" w:eastAsia="Times New Roman" w:hAnsi="Times New Roman" w:cs="Times New Roman"/>
-          <w:color w:val="333333"/>
-          <w:highlight w:val="white"/>
-        </w:rPr>
-      </w:pPr>
-    </w:p>
-    <w:p>
-      <w:pPr>
-        <w:jc w:val="both"/>
-        <w:rPr>
-          <w:rFonts w:ascii="Times New Roman" w:eastAsia="Times New Roman" w:hAnsi="Times New Roman" w:cs="Times New Roman"/>
-          <w:color w:val="333333"/>
-          <w:highlight w:val="white"/>
-        </w:rPr>
-      </w:pPr>
-      <w:r>
-        <w:rPr>
-          <w:rFonts w:ascii="Times New Roman" w:eastAsia="Times New Roman" w:hAnsi="Times New Roman" w:cs="Times New Roman"/>
-          <w:color w:val="333333"/>
-          <w:highlight w:val="white"/>
-        </w:rPr>
-        <w:t xml:space="preserve">The decision is the result of a trade-off analysis. </w:t>
-      </w:r>
-      <w:r>
-        <w:rPr>
-          <w:rFonts w:ascii="Times New Roman" w:eastAsia="Times New Roman" w:hAnsi="Times New Roman" w:cs="Times New Roman"/>
-          <w:b/>
-          <w:bCs/>
-          <w:color w:val="333333"/>
-          <w:highlight w:val="white"/>
-        </w:rPr>
-        <w:t>Single Linkage</w:t>
-      </w:r>
-      <w:r>
-        <w:rPr>
-          <w:rFonts w:ascii="Times New Roman" w:eastAsia="Times New Roman" w:hAnsi="Times New Roman" w:cs="Times New Roman"/>
-          <w:color w:val="333333"/>
-          <w:highlight w:val="white"/>
-        </w:rPr>
-        <w:t xml:space="preserve">, while exhibiting the highest </w:t>
-      </w:r>
-      <w:proofErr w:type="spellStart"/>
-      <w:r>
-        <w:rPr>
-          <w:rFonts w:ascii="Times New Roman" w:eastAsia="Times New Roman" w:hAnsi="Times New Roman" w:cs="Times New Roman"/>
-          <w:b/>
-          <w:bCs/>
-          <w:i/>
-          <w:iCs/>
-          <w:color w:val="333333"/>
-          <w:highlight w:val="white"/>
-        </w:rPr>
-        <w:t>Cophenetic</w:t>
-      </w:r>
-      <w:proofErr w:type="spellEnd"/>
-      <w:r>
-        <w:rPr>
-          <w:rFonts w:ascii="Times New Roman" w:eastAsia="Times New Roman" w:hAnsi="Times New Roman" w:cs="Times New Roman"/>
-          <w:b/>
-          <w:bCs/>
-          <w:i/>
-          <w:iCs/>
-          <w:color w:val="333333"/>
-          <w:highlight w:val="white"/>
-        </w:rPr>
-        <w:t xml:space="preserve"> Correlation Coefficient</w:t>
-      </w:r>
-      <w:r>
-        <w:rPr>
-          <w:rFonts w:ascii="Times New Roman" w:eastAsia="Times New Roman" w:hAnsi="Times New Roman" w:cs="Times New Roman"/>
-          <w:color w:val="333333"/>
-          <w:highlight w:val="white"/>
-        </w:rPr>
-        <w:t xml:space="preserve"> (0.8534), was discarded. Visually, it produces a heavily "chained" and uninterpretable structure, likely by following the path of least resistance along the strong `</w:t>
-      </w:r>
-      <w:r>
-        <w:rPr>
-          <w:rFonts w:ascii="Times New Roman" w:eastAsia="Times New Roman" w:hAnsi="Times New Roman" w:cs="Times New Roman"/>
-          <w:b/>
-          <w:bCs/>
-          <w:color w:val="333333"/>
-          <w:highlight w:val="white"/>
-        </w:rPr>
-        <w:t>pop`</w:t>
-      </w:r>
-      <w:r>
-        <w:rPr>
-          <w:rFonts w:ascii="Times New Roman" w:eastAsia="Times New Roman" w:hAnsi="Times New Roman" w:cs="Times New Roman"/>
-          <w:color w:val="333333"/>
-          <w:highlight w:val="white"/>
-        </w:rPr>
-        <w:t>/`</w:t>
-      </w:r>
-      <w:proofErr w:type="spellStart"/>
-      <w:r>
-        <w:rPr>
-          <w:rFonts w:ascii="Times New Roman" w:eastAsia="Times New Roman" w:hAnsi="Times New Roman" w:cs="Times New Roman"/>
-          <w:b/>
-          <w:bCs/>
-          <w:color w:val="333333"/>
-          <w:highlight w:val="white"/>
-        </w:rPr>
-        <w:t>manuf</w:t>
-      </w:r>
-      <w:proofErr w:type="spellEnd"/>
-      <w:r>
-        <w:rPr>
-          <w:rFonts w:ascii="Times New Roman" w:eastAsia="Times New Roman" w:hAnsi="Times New Roman" w:cs="Times New Roman"/>
-          <w:b/>
-          <w:bCs/>
-          <w:color w:val="333333"/>
-          <w:highlight w:val="white"/>
-        </w:rPr>
-        <w:t>`</w:t>
-      </w:r>
-      <w:r>
-        <w:rPr>
-          <w:rFonts w:ascii="Times New Roman" w:eastAsia="Times New Roman" w:hAnsi="Times New Roman" w:cs="Times New Roman"/>
-          <w:color w:val="333333"/>
-          <w:highlight w:val="white"/>
-        </w:rPr>
-        <w:t xml:space="preserve"> correlation. Its lower </w:t>
-      </w:r>
-      <w:r>
-        <w:rPr>
-          <w:rFonts w:ascii="Times New Roman" w:eastAsia="Times New Roman" w:hAnsi="Times New Roman" w:cs="Times New Roman"/>
-          <w:b/>
-          <w:bCs/>
-          <w:i/>
-          <w:iCs/>
-          <w:color w:val="333333"/>
-          <w:highlight w:val="white"/>
-        </w:rPr>
-        <w:t>Agglomerative Coefficient</w:t>
-      </w:r>
-      <w:r>
-        <w:rPr>
-          <w:rFonts w:ascii="Times New Roman" w:eastAsia="Times New Roman" w:hAnsi="Times New Roman" w:cs="Times New Roman"/>
-          <w:color w:val="333333"/>
-          <w:highlight w:val="white"/>
-        </w:rPr>
-        <w:t xml:space="preserve"> (0.7034) confirms it fails to find a strong clustering structure. </w:t>
-      </w:r>
-      <w:r>
-        <w:rPr>
-          <w:rFonts w:ascii="Times New Roman" w:eastAsia="Times New Roman" w:hAnsi="Times New Roman" w:cs="Times New Roman"/>
-          <w:b/>
-          <w:bCs/>
-          <w:color w:val="333333"/>
-          <w:highlight w:val="white"/>
-        </w:rPr>
-        <w:t>Ward's method</w:t>
-      </w:r>
-      <w:r>
-        <w:rPr>
-          <w:rFonts w:ascii="Times New Roman" w:eastAsia="Times New Roman" w:hAnsi="Times New Roman" w:cs="Times New Roman"/>
-          <w:color w:val="333333"/>
-          <w:highlight w:val="white"/>
-        </w:rPr>
-        <w:t xml:space="preserve">, conversely, produces a visually clean cluster (figure 6) and has high </w:t>
-      </w:r>
-      <w:r>
-        <w:rPr>
-          <w:rFonts w:ascii="Times New Roman" w:eastAsia="Times New Roman" w:hAnsi="Times New Roman" w:cs="Times New Roman"/>
-          <w:b/>
-          <w:bCs/>
-          <w:i/>
-          <w:iCs/>
-          <w:color w:val="333333"/>
-          <w:highlight w:val="white"/>
-        </w:rPr>
-        <w:t>Agglomerative Coefficients</w:t>
-      </w:r>
-      <w:r>
-        <w:rPr>
-          <w:rFonts w:ascii="Times New Roman" w:eastAsia="Times New Roman" w:hAnsi="Times New Roman" w:cs="Times New Roman"/>
-          <w:color w:val="333333"/>
-          <w:highlight w:val="white"/>
-        </w:rPr>
-        <w:t xml:space="preserve"> (0.8553 and 0.8530) for raw data and PCA scores, respectively. However, this is achieved at the cost of a significantly lower </w:t>
-      </w:r>
-      <w:proofErr w:type="spellStart"/>
-      <w:r>
-        <w:rPr>
-          <w:rFonts w:ascii="Times New Roman" w:eastAsia="Times New Roman" w:hAnsi="Times New Roman" w:cs="Times New Roman"/>
-          <w:b/>
-          <w:i/>
-          <w:color w:val="333333"/>
-          <w:highlight w:val="white"/>
-        </w:rPr>
-        <w:t>Cophenetic</w:t>
-      </w:r>
-      <w:proofErr w:type="spellEnd"/>
-      <w:r>
-        <w:rPr>
-          <w:rFonts w:ascii="Times New Roman" w:eastAsia="Times New Roman" w:hAnsi="Times New Roman" w:cs="Times New Roman"/>
-          <w:b/>
-          <w:i/>
-          <w:color w:val="333333"/>
-          <w:highlight w:val="white"/>
-        </w:rPr>
-        <w:t xml:space="preserve"> Correlation</w:t>
-      </w:r>
-      <w:r>
-        <w:rPr>
-          <w:rFonts w:ascii="Times New Roman" w:eastAsia="Times New Roman" w:hAnsi="Times New Roman" w:cs="Times New Roman"/>
-          <w:color w:val="333333"/>
-          <w:highlight w:val="white"/>
-        </w:rPr>
-        <w:t xml:space="preserve"> (0.4698) and (0.4519) for raw data </w:t>
-      </w:r>
-      <w:r>
-        <w:rPr>
-          <w:rFonts w:ascii="Times New Roman" w:eastAsia="Times New Roman" w:hAnsi="Times New Roman" w:cs="Times New Roman"/>
-          <w:color w:val="333333"/>
-          <w:highlight w:val="white"/>
-        </w:rPr>
-        <w:lastRenderedPageBreak/>
-        <w:t xml:space="preserve">and PCA scores, respectively, indicating that the </w:t>
-      </w:r>
-      <w:proofErr w:type="spellStart"/>
-      <w:r>
-        <w:rPr>
-          <w:rFonts w:ascii="Times New Roman" w:eastAsia="Times New Roman" w:hAnsi="Times New Roman" w:cs="Times New Roman"/>
-          <w:color w:val="333333"/>
-          <w:highlight w:val="white"/>
-        </w:rPr>
-        <w:t>dendrogram</w:t>
-      </w:r>
-      <w:proofErr w:type="spellEnd"/>
-      <w:r>
-        <w:rPr>
-          <w:rFonts w:ascii="Times New Roman" w:eastAsia="Times New Roman" w:hAnsi="Times New Roman" w:cs="Times New Roman"/>
-          <w:color w:val="333333"/>
-          <w:highlight w:val="white"/>
-        </w:rPr>
-        <w:t xml:space="preserve"> is a poor, distorted representation of the true pairwise distances.</w:t>
-      </w:r>
-    </w:p>
-    <w:p>
-      <w:pPr>
-        <w:jc w:val="both"/>
-        <w:rPr>
-          <w:rFonts w:ascii="Times New Roman" w:eastAsia="Times New Roman" w:hAnsi="Times New Roman" w:cs="Times New Roman"/>
-          <w:color w:val="333333"/>
-          <w:highlight w:val="white"/>
-        </w:rPr>
-      </w:pPr>
-    </w:p>
-    <w:p>
-      <w:pPr>
-        <w:jc w:val="both"/>
-        <w:rPr>
-          <w:rFonts w:ascii="Times New Roman" w:eastAsia="Times New Roman" w:hAnsi="Times New Roman" w:cs="Times New Roman"/>
-          <w:color w:val="333333"/>
-          <w:highlight w:val="white"/>
-        </w:rPr>
-      </w:pPr>
-      <w:r>
-        <w:rPr>
-          <w:rFonts w:ascii="Times New Roman" w:eastAsia="Times New Roman" w:hAnsi="Times New Roman" w:cs="Times New Roman"/>
-          <w:b/>
-          <w:bCs/>
-          <w:color w:val="333333"/>
-          <w:highlight w:val="white"/>
-        </w:rPr>
-        <w:t xml:space="preserve">Complete Linkage, </w:t>
-      </w:r>
-      <w:r>
-        <w:rPr>
-          <w:rFonts w:ascii="Times New Roman" w:eastAsia="Times New Roman" w:hAnsi="Times New Roman" w:cs="Times New Roman"/>
-          <w:color w:val="333333"/>
-          <w:highlight w:val="white"/>
-        </w:rPr>
-        <w:t xml:space="preserve">therefore, offers the best balance. It achieves a high </w:t>
-      </w:r>
-      <w:r>
-        <w:rPr>
-          <w:rFonts w:ascii="Times New Roman" w:eastAsia="Times New Roman" w:hAnsi="Times New Roman" w:cs="Times New Roman"/>
-          <w:b/>
-          <w:bCs/>
-          <w:i/>
-          <w:iCs/>
-          <w:color w:val="333333"/>
-          <w:highlight w:val="white"/>
-        </w:rPr>
-        <w:t>Agglomerative Coefficient</w:t>
-      </w:r>
-      <w:r>
-        <w:rPr>
-          <w:rFonts w:ascii="Times New Roman" w:eastAsia="Times New Roman" w:hAnsi="Times New Roman" w:cs="Times New Roman"/>
-          <w:color w:val="333333"/>
-          <w:highlight w:val="white"/>
-        </w:rPr>
-        <w:t xml:space="preserve"> in both cases, raw data and PCA scores (0.8376–0.9007), comparable to or even exceeding Ward's method, while maintaining a much higher </w:t>
-      </w:r>
-      <w:proofErr w:type="spellStart"/>
-      <w:r>
-        <w:rPr>
-          <w:rFonts w:ascii="Times New Roman" w:eastAsia="Times New Roman" w:hAnsi="Times New Roman" w:cs="Times New Roman"/>
-          <w:b/>
-          <w:bCs/>
-          <w:i/>
-          <w:iCs/>
-          <w:color w:val="333333"/>
-          <w:highlight w:val="white"/>
-        </w:rPr>
-        <w:t>Cophenetic</w:t>
-      </w:r>
-      <w:proofErr w:type="spellEnd"/>
-      <w:r>
-        <w:rPr>
-          <w:rFonts w:ascii="Times New Roman" w:eastAsia="Times New Roman" w:hAnsi="Times New Roman" w:cs="Times New Roman"/>
-          <w:b/>
-          <w:bCs/>
-          <w:i/>
-          <w:iCs/>
-          <w:color w:val="333333"/>
-          <w:highlight w:val="white"/>
-        </w:rPr>
-        <w:t xml:space="preserve"> Correlation</w:t>
-      </w:r>
-      <w:r>
-        <w:rPr>
-          <w:rFonts w:ascii="Times New Roman" w:eastAsia="Times New Roman" w:hAnsi="Times New Roman" w:cs="Times New Roman"/>
-          <w:color w:val="333333"/>
-          <w:highlight w:val="white"/>
-        </w:rPr>
-        <w:t>. It successfully identifies a strong, compact clustering structure without excessively distorting the underlying data, making it the most reliable and defensible choice.</w:t>
-      </w:r>
-    </w:p>
-    <w:p>
-      <w:pPr>
-        <w:jc w:val="both"/>
-        <w:rPr>
-          <w:rFonts w:ascii="Times New Roman" w:eastAsia="Times New Roman" w:hAnsi="Times New Roman" w:cs="Times New Roman"/>
-          <w:color w:val="333333"/>
-          <w:highlight w:val="white"/>
-        </w:rPr>
-      </w:pPr>
-    </w:p>
-    <w:p>
-      <w:pPr>
-        <w:jc w:val="both"/>
-        <w:rPr>
-          <w:rFonts w:ascii="Times New Roman" w:eastAsia="Times New Roman" w:hAnsi="Times New Roman" w:cs="Times New Roman"/>
-          <w:b/>
-          <w:bCs/>
-          <w:color w:val="333333"/>
-          <w:highlight w:val="white"/>
-        </w:rPr>
-      </w:pPr>
-      <w:r>
-        <w:rPr>
-          <w:rFonts w:ascii="Times New Roman" w:eastAsia="Times New Roman" w:hAnsi="Times New Roman" w:cs="Times New Roman"/>
-          <w:b/>
-          <w:bCs/>
-          <w:color w:val="333333"/>
-          <w:highlight w:val="white"/>
-        </w:rPr>
-        <w:t>Determining the Optimal Number of Clusters (k)</w:t>
-      </w:r>
-    </w:p>
-    <w:p>
-      <w:pPr>
-        <w:jc w:val="both"/>
-        <w:rPr>
-          <w:rFonts w:ascii="Times New Roman" w:eastAsia="Times New Roman" w:hAnsi="Times New Roman" w:cs="Times New Roman"/>
-          <w:color w:val="333333"/>
-          <w:highlight w:val="white"/>
-        </w:rPr>
-      </w:pPr>
-    </w:p>
-    <w:p>
-      <w:pPr>
-        <w:jc w:val="both"/>
-        <w:rPr>
-          <w:rFonts w:ascii="Times New Roman" w:eastAsia="Times New Roman" w:hAnsi="Times New Roman" w:cs="Times New Roman"/>
-          <w:color w:val="333333"/>
-          <w:highlight w:val="white"/>
-        </w:rPr>
-      </w:pPr>
-      <w:r>
-        <w:rPr>
-          <w:rFonts w:ascii="Times New Roman" w:eastAsia="Times New Roman" w:hAnsi="Times New Roman" w:cs="Times New Roman"/>
-          <w:color w:val="333333"/>
-          <w:highlight w:val="white"/>
-        </w:rPr>
-        <w:t xml:space="preserve">After selecting the best linkage criterion, the </w:t>
-      </w:r>
-      <w:r>
-        <w:rPr>
-          <w:rFonts w:ascii="Times New Roman" w:eastAsia="Times New Roman" w:hAnsi="Times New Roman" w:cs="Times New Roman"/>
-          <w:b/>
-          <w:bCs/>
-          <w:color w:val="333333"/>
-          <w:highlight w:val="white"/>
-        </w:rPr>
-        <w:t>Complete Method</w:t>
-      </w:r>
-      <w:r>
-        <w:rPr>
-          <w:rFonts w:ascii="Times New Roman" w:eastAsia="Times New Roman" w:hAnsi="Times New Roman" w:cs="Times New Roman"/>
-          <w:color w:val="333333"/>
-          <w:highlight w:val="white"/>
-        </w:rPr>
-        <w:t>, for both approaches, we now proceed to determine the optimal number of clusters, `</w:t>
-      </w:r>
-      <w:r>
-        <w:rPr>
-          <w:rFonts w:ascii="Times New Roman" w:eastAsia="Times New Roman" w:hAnsi="Times New Roman" w:cs="Times New Roman"/>
-          <w:b/>
-          <w:bCs/>
-          <w:color w:val="333333"/>
-          <w:highlight w:val="white"/>
-        </w:rPr>
-        <w:t>k</w:t>
-      </w:r>
-      <w:r>
-        <w:rPr>
-          <w:rFonts w:ascii="Times New Roman" w:eastAsia="Times New Roman" w:hAnsi="Times New Roman" w:cs="Times New Roman"/>
-          <w:color w:val="333333"/>
-          <w:highlight w:val="white"/>
-        </w:rPr>
-        <w:t>`, for this specific method</w:t>
-      </w:r>
-      <w:r>
-        <w:rPr>
-          <w:rFonts w:ascii="Times New Roman" w:eastAsia="Times New Roman" w:hAnsi="Times New Roman" w:cs="Times New Roman"/>
-          <w:color w:val="333333"/>
-          <w:highlight w:val="white"/>
-        </w:rPr>
-        <w:t xml:space="preserve">, with the </w:t>
-      </w:r>
-      <w:r>
-        <w:rPr>
-          <w:rFonts w:ascii="Times New Roman" w:eastAsia="Times New Roman" w:hAnsi="Times New Roman" w:cs="Times New Roman"/>
-          <w:b/>
-          <w:color w:val="333333"/>
-          <w:highlight w:val="white"/>
-          <w:u w:val="single"/>
-        </w:rPr>
-        <w:t>estimation methods</w:t>
-      </w:r>
-      <w:r>
-        <w:rPr>
-          <w:rFonts w:ascii="Times New Roman" w:eastAsia="Times New Roman" w:hAnsi="Times New Roman" w:cs="Times New Roman"/>
-          <w:color w:val="333333"/>
-          <w:highlight w:val="white"/>
-        </w:rPr>
-        <w:t xml:space="preserve"> </w:t>
-      </w:r>
-      <w:r>
-        <w:rPr>
-          <w:rFonts w:ascii="Times New Roman" w:eastAsia="Times New Roman" w:hAnsi="Times New Roman" w:cs="Times New Roman"/>
-          <w:b/>
-          <w:color w:val="333333"/>
-          <w:highlight w:val="white"/>
-        </w:rPr>
-        <w:t>Elbow Method</w:t>
-      </w:r>
-      <w:r>
-        <w:rPr>
-          <w:rFonts w:ascii="Times New Roman" w:eastAsia="Times New Roman" w:hAnsi="Times New Roman" w:cs="Times New Roman"/>
-          <w:color w:val="333333"/>
-          <w:highlight w:val="white"/>
-        </w:rPr>
-        <w:t xml:space="preserve">, </w:t>
-      </w:r>
-      <w:r>
-        <w:rPr>
-          <w:rFonts w:ascii="Times New Roman" w:eastAsia="Times New Roman" w:hAnsi="Times New Roman" w:cs="Times New Roman"/>
-          <w:b/>
-          <w:color w:val="333333"/>
-          <w:highlight w:val="white"/>
-        </w:rPr>
-        <w:t>Gap Statistics</w:t>
-      </w:r>
-      <w:r>
-        <w:rPr>
-          <w:rFonts w:ascii="Times New Roman" w:eastAsia="Times New Roman" w:hAnsi="Times New Roman" w:cs="Times New Roman"/>
-          <w:color w:val="333333"/>
-          <w:highlight w:val="white"/>
-        </w:rPr>
-        <w:t xml:space="preserve"> and </w:t>
-      </w:r>
-      <w:r>
-        <w:rPr>
-          <w:rFonts w:ascii="Times New Roman" w:eastAsia="Times New Roman" w:hAnsi="Times New Roman" w:cs="Times New Roman"/>
-          <w:b/>
-          <w:color w:val="333333"/>
-          <w:highlight w:val="white"/>
-        </w:rPr>
-        <w:t>Silhouette Method</w:t>
-      </w:r>
-      <w:r>
-        <w:rPr>
-          <w:rFonts w:ascii="Times New Roman" w:eastAsia="Times New Roman" w:hAnsi="Times New Roman" w:cs="Times New Roman"/>
-          <w:color w:val="333333"/>
-          <w:highlight w:val="white"/>
-        </w:rPr>
-        <w:t xml:space="preserve">. While visual inspection of the </w:t>
-      </w:r>
-      <w:proofErr w:type="spellStart"/>
-      <w:r>
-        <w:rPr>
-          <w:rFonts w:ascii="Times New Roman" w:eastAsia="Times New Roman" w:hAnsi="Times New Roman" w:cs="Times New Roman"/>
-          <w:color w:val="333333"/>
-          <w:highlight w:val="white"/>
-        </w:rPr>
-        <w:t>dend</w:t>
-      </w:r>
-      <w:r>
-        <w:rPr>
-          <w:rFonts w:ascii="Times New Roman" w:eastAsia="Times New Roman" w:hAnsi="Times New Roman" w:cs="Times New Roman"/>
-          <w:color w:val="333333"/>
-          <w:highlight w:val="white"/>
-        </w:rPr>
-        <w:t>r</w:t>
-      </w:r>
-      <w:r>
-        <w:rPr>
-          <w:rFonts w:ascii="Times New Roman" w:eastAsia="Times New Roman" w:hAnsi="Times New Roman" w:cs="Times New Roman"/>
-          <w:color w:val="333333"/>
-          <w:highlight w:val="white"/>
-        </w:rPr>
-        <w:t>ogram</w:t>
-      </w:r>
-      <w:proofErr w:type="spellEnd"/>
-      <w:r>
-        <w:rPr>
-          <w:rFonts w:ascii="Times New Roman" w:eastAsia="Times New Roman" w:hAnsi="Times New Roman" w:cs="Times New Roman"/>
-          <w:color w:val="333333"/>
-          <w:highlight w:val="white"/>
-        </w:rPr>
-        <w:t xml:space="preserve"> can be suggestive, we used robust quantitative methods to make a better choice. We used the </w:t>
+          <w:color w:val="333333"/>
+          <w:highlight w:val="white"/>
+        </w:rPr>
+        <w:t xml:space="preserve">ogram can be suggestive, we used robust quantitative methods to make a better choice. We used the </w:t>
       </w:r>
       <w:r>
         <w:rPr>
@@ -9073,69 +8059,27 @@
           <w:sz w:val="20"/>
           <w:highlight w:val="white"/>
         </w:rPr>
-        <w:t xml:space="preserve">Figure 7 – Graphics to determine the optimal number of clusters in both raw data as well as </w:t>
-      </w:r>
-      <w:proofErr w:type="spellStart"/>
-      <w:r>
-        <w:rPr>
-          <w:rFonts w:ascii="Times New Roman" w:eastAsia="Times New Roman" w:hAnsi="Times New Roman" w:cs="Times New Roman"/>
-          <w:i/>
-          <w:color w:val="2F5496" w:themeColor="accent5" w:themeShade="BF"/>
-          <w:sz w:val="20"/>
-          <w:highlight w:val="white"/>
-        </w:rPr>
-        <w:t>pca</w:t>
-      </w:r>
-      <w:proofErr w:type="spellEnd"/>
-      <w:r>
-        <w:rPr>
-          <w:rFonts w:ascii="Times New Roman" w:eastAsia="Times New Roman" w:hAnsi="Times New Roman" w:cs="Times New Roman"/>
-          <w:i/>
-          <w:color w:val="2F5496" w:themeColor="accent5" w:themeShade="BF"/>
-          <w:sz w:val="20"/>
-          <w:highlight w:val="white"/>
-        </w:rPr>
-        <w:t xml:space="preserve"> scores</w:t>
-      </w:r>
-    </w:p>
-    <w:p>
-      <w:pPr>
-        <w:jc w:val="both"/>
-        <w:rPr>
-          <w:rFonts w:ascii="Times New Roman" w:eastAsia="Times New Roman" w:hAnsi="Times New Roman" w:cs="Times New Roman"/>
-          <w:i/>
-          <w:color w:val="333333"/>
-          <w:highlight w:val="white"/>
-        </w:rPr>
-      </w:pPr>
-      <w:r>
-        <w:rPr>
-          <w:rFonts w:ascii="Times New Roman" w:eastAsia="Times New Roman" w:hAnsi="Times New Roman" w:cs="Times New Roman"/>
-          <w:i/>
-          <w:color w:val="333333"/>
-          <w:highlight w:val="white"/>
-        </w:rPr>
-        <w:t xml:space="preserve">(Note: The gap statistic graphic is only on the </w:t>
-      </w:r>
-      <w:proofErr w:type="spellStart"/>
-      <w:r>
-        <w:rPr>
-          <w:rFonts w:ascii="Times New Roman" w:eastAsia="Times New Roman" w:hAnsi="Times New Roman" w:cs="Times New Roman"/>
-          <w:i/>
-          <w:color w:val="333333"/>
-          <w:highlight w:val="white"/>
-        </w:rPr>
-        <w:t>RMarkdown</w:t>
-      </w:r>
-      <w:proofErr w:type="spellEnd"/>
-      <w:r>
-        <w:rPr>
-          <w:rFonts w:ascii="Times New Roman" w:eastAsia="Times New Roman" w:hAnsi="Times New Roman" w:cs="Times New Roman"/>
-          <w:i/>
-          <w:color w:val="333333"/>
-          <w:highlight w:val="white"/>
-        </w:rPr>
-        <w:t xml:space="preserve"> file as </w:t>
+        <w:t>Figure 7 – Graphics to determine the optimal number of clusters in both raw data as well as pca scores</w:t>
+      </w:r>
+    </w:p>
+    <w:p>
+      <w:pPr>
+        <w:jc w:val="both"/>
+        <w:rPr>
+          <w:rFonts w:ascii="Times New Roman" w:eastAsia="Times New Roman" w:hAnsi="Times New Roman" w:cs="Times New Roman"/>
+          <w:i/>
+          <w:color w:val="333333"/>
+          <w:highlight w:val="white"/>
+        </w:rPr>
+      </w:pPr>
+      <w:r>
+        <w:rPr>
+          <w:rFonts w:ascii="Times New Roman" w:eastAsia="Times New Roman" w:hAnsi="Times New Roman" w:cs="Times New Roman"/>
+          <w:i/>
+          <w:color w:val="333333"/>
+          <w:highlight w:val="white"/>
+        </w:rPr>
+        <w:t xml:space="preserve">(Note: The gap statistic graphic is only on the RMarkdown file as </w:t>
       </w:r>
       <w:r>
         <w:rPr>
@@ -9484,9 +8428,8 @@
           <w:highlight w:val="white"/>
           <w:lang w:val="en-GB"/>
         </w:rPr>
-        <w:t xml:space="preserve">Figure 8 – </w:t>
-      </w:r>
-      <w:proofErr w:type="spellStart"/>
+        <w:t>Figure 8 – Dend</w:t>
+      </w:r>
       <w:r>
         <w:rPr>
           <w:rFonts w:ascii="Times New Roman" w:eastAsia="Times New Roman" w:hAnsi="Times New Roman" w:cs="Times New Roman"/>
@@ -9496,7 +8439,7 @@
           <w:highlight w:val="white"/>
           <w:lang w:val="en-GB"/>
         </w:rPr>
-        <w:t>Dend</w:t>
+        <w:t>r</w:t>
       </w:r>
       <w:r>
         <w:rPr>
@@ -9507,30 +8450,7 @@
           <w:highlight w:val="white"/>
           <w:lang w:val="en-GB"/>
         </w:rPr>
-        <w:t>r</w:t>
-      </w:r>
-      <w:r>
-        <w:rPr>
-          <w:rFonts w:ascii="Times New Roman" w:eastAsia="Times New Roman" w:hAnsi="Times New Roman" w:cs="Times New Roman"/>
-          <w:i/>
-          <w:color w:val="2F5496" w:themeColor="accent5" w:themeShade="BF"/>
-          <w:sz w:val="20"/>
-          <w:highlight w:val="white"/>
-          <w:lang w:val="en-GB"/>
-        </w:rPr>
-        <w:t>ograms</w:t>
-      </w:r>
-      <w:proofErr w:type="spellEnd"/>
-      <w:r>
-        <w:rPr>
-          <w:rFonts w:ascii="Times New Roman" w:eastAsia="Times New Roman" w:hAnsi="Times New Roman" w:cs="Times New Roman"/>
-          <w:i/>
-          <w:color w:val="2F5496" w:themeColor="accent5" w:themeShade="BF"/>
-          <w:sz w:val="20"/>
-          <w:highlight w:val="white"/>
-          <w:lang w:val="en-GB"/>
-        </w:rPr>
-        <w:t xml:space="preserve"> done for the Complete Linkage Method with 2 clusters, the </w:t>
+        <w:t xml:space="preserve">ograms done for the Complete Linkage Method with 2 clusters, the </w:t>
       </w:r>
       <w:r>
         <w:rPr>
@@ -9921,7 +8841,7 @@
           <w:lang w:val="en-GB"/>
         </w:rPr>
       </w:pPr>
-      <w:bookmarkStart w:id="7" w:name="_Toc216253562"/>
+      <w:bookmarkStart w:id="6" w:name="_Toc216253562"/>
       <w:r>
         <w:rPr>
           <w:rFonts w:eastAsia="Times New Roman"/>
@@ -9931,7 +8851,7 @@
         <w:lastRenderedPageBreak/>
         <w:t>Conclusion</w:t>
       </w:r>
-      <w:bookmarkEnd w:id="7"/>
+      <w:bookmarkEnd w:id="6"/>
     </w:p>
     <w:p>
       <w:pPr>
@@ -10047,62 +8967,18 @@
           <w:highlight w:val="white"/>
           <w:lang w:val="en-GB"/>
         </w:rPr>
-        <w:t xml:space="preserve">In the PCA Analysis performed, we retained 3 principal components - PC1 </w:t>
-      </w:r>
-      <w:proofErr w:type="gramStart"/>
-      <w:r>
-        <w:rPr>
-          <w:rFonts w:ascii="Times New Roman" w:eastAsia="Times New Roman" w:hAnsi="Times New Roman" w:cs="Times New Roman"/>
-          <w:color w:val="333333"/>
-          <w:highlight w:val="white"/>
-          <w:lang w:val="en-GB"/>
-        </w:rPr>
-        <w:t>( that</w:t>
-      </w:r>
-      <w:proofErr w:type="gramEnd"/>
-      <w:r>
-        <w:rPr>
-          <w:rFonts w:ascii="Times New Roman" w:eastAsia="Times New Roman" w:hAnsi="Times New Roman" w:cs="Times New Roman"/>
-          <w:color w:val="333333"/>
-          <w:highlight w:val="white"/>
-          <w:lang w:val="en-GB"/>
-        </w:rPr>
-        <w:t xml:space="preserve"> represented </w:t>
-      </w:r>
-      <w:r>
-        <w:rPr>
-          <w:rFonts w:ascii="Times New Roman" w:eastAsia="Times New Roman" w:hAnsi="Times New Roman" w:cs="Times New Roman"/>
-          <w:b/>
-          <w:bCs/>
-          <w:color w:val="333333"/>
-          <w:highlight w:val="white"/>
-          <w:lang w:val="en-GB"/>
-        </w:rPr>
-        <w:t>`</w:t>
-      </w:r>
-      <w:proofErr w:type="spellStart"/>
-      <w:r>
-        <w:rPr>
-          <w:rFonts w:ascii="Times New Roman" w:eastAsia="Times New Roman" w:hAnsi="Times New Roman" w:cs="Times New Roman"/>
-          <w:b/>
-          <w:bCs/>
-          <w:color w:val="333333"/>
-          <w:highlight w:val="white"/>
-          <w:lang w:val="en-GB"/>
-        </w:rPr>
-        <w:t>manuf</w:t>
-      </w:r>
-      <w:proofErr w:type="spellEnd"/>
-      <w:r>
-        <w:rPr>
-          <w:rFonts w:ascii="Times New Roman" w:eastAsia="Times New Roman" w:hAnsi="Times New Roman" w:cs="Times New Roman"/>
-          <w:b/>
-          <w:bCs/>
-          <w:color w:val="333333"/>
-          <w:highlight w:val="white"/>
-          <w:lang w:val="en-GB"/>
-        </w:rPr>
-        <w:t>`</w:t>
+        <w:t xml:space="preserve">In the PCA Analysis performed, we retained 3 principal components - PC1 ( that represented </w:t>
+      </w:r>
+      <w:r>
+        <w:rPr>
+          <w:rFonts w:ascii="Times New Roman" w:eastAsia="Times New Roman" w:hAnsi="Times New Roman" w:cs="Times New Roman"/>
+          <w:b/>
+          <w:bCs/>
+          <w:color w:val="333333"/>
+          <w:highlight w:val="white"/>
+          <w:lang w:val="en-GB"/>
+        </w:rPr>
+        <w:t>`manuf`</w:t>
       </w:r>
       <w:r>
         <w:rPr>
@@ -10182,31 +9058,7 @@
           <w:highlight w:val="white"/>
           <w:lang w:val="en-GB"/>
         </w:rPr>
-        <w:t>`</w:t>
-      </w:r>
-      <w:proofErr w:type="spellStart"/>
-      <w:r>
-        <w:rPr>
-          <w:rFonts w:ascii="Times New Roman" w:eastAsia="Times New Roman" w:hAnsi="Times New Roman" w:cs="Times New Roman"/>
-          <w:b/>
-          <w:bCs/>
-          <w:color w:val="333333"/>
-          <w:highlight w:val="white"/>
-          <w:lang w:val="en-GB"/>
-        </w:rPr>
-        <w:t>precip</w:t>
-      </w:r>
-      <w:proofErr w:type="spellEnd"/>
-      <w:r>
-        <w:rPr>
-          <w:rFonts w:ascii="Times New Roman" w:eastAsia="Times New Roman" w:hAnsi="Times New Roman" w:cs="Times New Roman"/>
-          <w:b/>
-          <w:bCs/>
-          <w:color w:val="333333"/>
-          <w:highlight w:val="white"/>
-          <w:lang w:val="en-GB"/>
-        </w:rPr>
-        <w:t>`</w:t>
+        <w:t>`precip`</w:t>
       </w:r>
       <w:r>
         <w:rPr>
@@ -10289,7 +9141,6 @@
         </w:rPr>
         <w:t xml:space="preserve"> and the </w:t>
       </w:r>
-      <w:proofErr w:type="spellStart"/>
       <w:r>
         <w:rPr>
           <w:rFonts w:ascii="Times New Roman" w:eastAsia="Times New Roman" w:hAnsi="Times New Roman" w:cs="Times New Roman"/>
@@ -10300,9 +9151,35 @@
           <w:highlight w:val="white"/>
           <w:lang w:val="en-GB"/>
         </w:rPr>
-        <w:t>Cophenetic</w:t>
-      </w:r>
-      <w:proofErr w:type="spellEnd"/>
+        <w:t>Cophenetic Correlation Coefficient</w:t>
+      </w:r>
+      <w:r>
+        <w:rPr>
+          <w:rFonts w:ascii="Times New Roman" w:eastAsia="Times New Roman" w:hAnsi="Times New Roman" w:cs="Times New Roman"/>
+          <w:color w:val="333333"/>
+          <w:highlight w:val="white"/>
+          <w:lang w:val="en-GB"/>
+        </w:rPr>
+        <w:t xml:space="preserve"> and observing the dend</w:t>
+      </w:r>
+      <w:r>
+        <w:rPr>
+          <w:rFonts w:ascii="Times New Roman" w:eastAsia="Times New Roman" w:hAnsi="Times New Roman" w:cs="Times New Roman"/>
+          <w:color w:val="333333"/>
+          <w:highlight w:val="white"/>
+          <w:lang w:val="en-GB"/>
+        </w:rPr>
+        <w:t>r</w:t>
+      </w:r>
+      <w:r>
+        <w:rPr>
+          <w:rFonts w:ascii="Times New Roman" w:eastAsia="Times New Roman" w:hAnsi="Times New Roman" w:cs="Times New Roman"/>
+          <w:color w:val="333333"/>
+          <w:highlight w:val="white"/>
+          <w:lang w:val="en-GB"/>
+        </w:rPr>
+        <w:t xml:space="preserve">ograms, we concluded that the </w:t>
+      </w:r>
       <w:r>
         <w:rPr>
           <w:rFonts w:ascii="Times New Roman" w:eastAsia="Times New Roman" w:hAnsi="Times New Roman" w:cs="Times New Roman"/>
@@ -10313,75 +9190,27 @@
           <w:highlight w:val="white"/>
           <w:lang w:val="en-GB"/>
         </w:rPr>
-        <w:t xml:space="preserve"> Correlation Coefficient</w:t>
-      </w:r>
-      <w:r>
-        <w:rPr>
-          <w:rFonts w:ascii="Times New Roman" w:eastAsia="Times New Roman" w:hAnsi="Times New Roman" w:cs="Times New Roman"/>
-          <w:color w:val="333333"/>
-          <w:highlight w:val="white"/>
-          <w:lang w:val="en-GB"/>
-        </w:rPr>
-        <w:t xml:space="preserve"> and observing the </w:t>
-      </w:r>
-      <w:proofErr w:type="spellStart"/>
-      <w:r>
-        <w:rPr>
-          <w:rFonts w:ascii="Times New Roman" w:eastAsia="Times New Roman" w:hAnsi="Times New Roman" w:cs="Times New Roman"/>
-          <w:color w:val="333333"/>
-          <w:highlight w:val="white"/>
-          <w:lang w:val="en-GB"/>
-        </w:rPr>
-        <w:t>dend</w:t>
-      </w:r>
-      <w:r>
-        <w:rPr>
-          <w:rFonts w:ascii="Times New Roman" w:eastAsia="Times New Roman" w:hAnsi="Times New Roman" w:cs="Times New Roman"/>
-          <w:color w:val="333333"/>
-          <w:highlight w:val="white"/>
-          <w:lang w:val="en-GB"/>
-        </w:rPr>
-        <w:t>r</w:t>
-      </w:r>
-      <w:r>
-        <w:rPr>
-          <w:rFonts w:ascii="Times New Roman" w:eastAsia="Times New Roman" w:hAnsi="Times New Roman" w:cs="Times New Roman"/>
-          <w:color w:val="333333"/>
-          <w:highlight w:val="white"/>
-          <w:lang w:val="en-GB"/>
-        </w:rPr>
-        <w:t>ograms</w:t>
-      </w:r>
-      <w:proofErr w:type="spellEnd"/>
-      <w:r>
-        <w:rPr>
-          <w:rFonts w:ascii="Times New Roman" w:eastAsia="Times New Roman" w:hAnsi="Times New Roman" w:cs="Times New Roman"/>
-          <w:color w:val="333333"/>
-          <w:highlight w:val="white"/>
-          <w:lang w:val="en-GB"/>
-        </w:rPr>
-        <w:t xml:space="preserve">, we concluded that the </w:t>
-      </w:r>
-      <w:r>
-        <w:rPr>
-          <w:rFonts w:ascii="Times New Roman" w:eastAsia="Times New Roman" w:hAnsi="Times New Roman" w:cs="Times New Roman"/>
-          <w:b/>
+        <w:t>Complete Linkage</w:t>
+      </w:r>
+      <w:r>
+        <w:rPr>
+          <w:rFonts w:ascii="Times New Roman" w:eastAsia="Times New Roman" w:hAnsi="Times New Roman" w:cs="Times New Roman"/>
+          <w:color w:val="333333"/>
+          <w:highlight w:val="white"/>
+          <w:lang w:val="en-GB"/>
+        </w:rPr>
+        <w:t xml:space="preserve"> was the most adequate linkage method for our data types. After understanding this, we determined that the optimal number of clusters (k) in our case would be 2 clusters. This was decided using the </w:t>
+      </w:r>
+      <w:r>
+        <w:rPr>
+          <w:rFonts w:ascii="Times New Roman" w:eastAsia="Times New Roman" w:hAnsi="Times New Roman" w:cs="Times New Roman"/>
           <w:i/>
           <w:iCs/>
           <w:color w:val="333333"/>
           <w:highlight w:val="white"/>
           <w:lang w:val="en-GB"/>
         </w:rPr>
-        <w:t>Complete Linkage</w:t>
-      </w:r>
-      <w:r>
-        <w:rPr>
-          <w:rFonts w:ascii="Times New Roman" w:eastAsia="Times New Roman" w:hAnsi="Times New Roman" w:cs="Times New Roman"/>
-          <w:color w:val="333333"/>
-          <w:highlight w:val="white"/>
-          <w:lang w:val="en-GB"/>
-        </w:rPr>
-        <w:t xml:space="preserve"> was the most adequate linkage method for our data types. After understanding this, we determined that the optimal number of clusters (k) in our case would be 2 clusters. This was decided using the average </w:t>
+        <w:t xml:space="preserve">Silhouette </w:t>
       </w:r>
       <w:r>
         <w:rPr>
@@ -10392,7 +9221,7 @@
           <w:highlight w:val="white"/>
           <w:lang w:val="en-GB"/>
         </w:rPr>
-        <w:t>Silhouette Scores</w:t>
+        <w:t>Method</w:t>
       </w:r>
       <w:r>
         <w:rPr>
@@ -10441,7 +9270,16 @@
           <w:highlight w:val="white"/>
           <w:lang w:val="en-GB"/>
         </w:rPr>
-        <w:t xml:space="preserve"> is the less reliable method, because it depends on our observation (ambiguous) and the </w:t>
+        <w:t xml:space="preserve"> is the least</w:t>
+      </w:r>
+      <w:r>
+        <w:rPr>
+          <w:rFonts w:ascii="Times New Roman" w:eastAsia="Times New Roman" w:hAnsi="Times New Roman" w:cs="Times New Roman"/>
+          <w:color w:val="333333"/>
+          <w:highlight w:val="white"/>
+          <w:lang w:val="en-GB"/>
+        </w:rPr>
+        <w:t xml:space="preserve"> reliable method, because it depends on our observation (ambiguous) and the </w:t>
       </w:r>
       <w:r>
         <w:rPr>
@@ -10461,27 +9299,7 @@
           <w:highlight w:val="white"/>
           <w:lang w:val="en-GB"/>
         </w:rPr>
-        <w:t xml:space="preserve">, although more efficient, it showed that, in our case, the cities in the </w:t>
-      </w:r>
-      <w:proofErr w:type="spellStart"/>
-      <w:r>
-        <w:rPr>
-          <w:rFonts w:ascii="Times New Roman" w:eastAsia="Times New Roman" w:hAnsi="Times New Roman" w:cs="Times New Roman"/>
-          <w:color w:val="333333"/>
-          <w:highlight w:val="white"/>
-          <w:lang w:val="en-GB"/>
-        </w:rPr>
-        <w:t>dendrogram</w:t>
-      </w:r>
-      <w:proofErr w:type="spellEnd"/>
-      <w:r>
-        <w:rPr>
-          <w:rFonts w:ascii="Times New Roman" w:eastAsia="Times New Roman" w:hAnsi="Times New Roman" w:cs="Times New Roman"/>
-          <w:color w:val="333333"/>
-          <w:highlight w:val="white"/>
-          <w:lang w:val="en-GB"/>
-        </w:rPr>
-        <w:t xml:space="preserve"> would be clustered only in one group</w:t>
+        <w:t>, although more efficient, it showed that, in our case, the cities in the dendrogram would be clustered only in one group</w:t>
       </w:r>
       <w:r>
         <w:rPr>
@@ -10598,43 +9416,7 @@
           <w:color w:val="333333"/>
           <w:lang w:val="en-GB"/>
         </w:rPr>
-        <w:t xml:space="preserve">On another hand, Chicago and Philadelphia stood out together when analysing the clusters with PCA Scores. In the PC1-PC2 </w:t>
-      </w:r>
-      <w:proofErr w:type="spellStart"/>
-      <w:r>
-        <w:rPr>
-          <w:rFonts w:ascii="Times New Roman" w:eastAsia="Times New Roman" w:hAnsi="Times New Roman" w:cs="Times New Roman"/>
-          <w:color w:val="333333"/>
-          <w:lang w:val="en-GB"/>
-        </w:rPr>
-        <w:t>biplot</w:t>
-      </w:r>
-      <w:proofErr w:type="spellEnd"/>
-      <w:r>
-        <w:rPr>
-          <w:rFonts w:ascii="Times New Roman" w:eastAsia="Times New Roman" w:hAnsi="Times New Roman" w:cs="Times New Roman"/>
-          <w:color w:val="333333"/>
-          <w:lang w:val="en-GB"/>
-        </w:rPr>
-        <w:t xml:space="preserve">, both cities appeared as clear outliers due to their exceptionally high values of population and manufacturing industries, reflecting their status as the major industrial </w:t>
-      </w:r>
-      <w:proofErr w:type="spellStart"/>
-      <w:r>
-        <w:rPr>
-          <w:rFonts w:ascii="Times New Roman" w:eastAsia="Times New Roman" w:hAnsi="Times New Roman" w:cs="Times New Roman"/>
-          <w:color w:val="333333"/>
-          <w:lang w:val="en-GB"/>
-        </w:rPr>
-        <w:t>centers</w:t>
-      </w:r>
-      <w:proofErr w:type="spellEnd"/>
-      <w:r>
-        <w:rPr>
-          <w:rFonts w:ascii="Times New Roman" w:eastAsia="Times New Roman" w:hAnsi="Times New Roman" w:cs="Times New Roman"/>
-          <w:color w:val="333333"/>
-          <w:lang w:val="en-GB"/>
-        </w:rPr>
-        <w:t xml:space="preserve"> in the 70s.</w:t>
+        <w:t>On another hand, Chicago and Philadelphia stood out together when analysing the clusters with PCA Scores. In the PC1-PC2 biplot, both cities appeared as clear outliers due to their exceptionally high values of population and manufacturing industries, reflecting their status as the major industrial centers in the 70s.</w:t>
       </w:r>
     </w:p>
     <w:p>
@@ -10668,25 +9450,25 @@
           <w:color w:val="333333"/>
           <w:lang w:val="en-GB"/>
         </w:rPr>
-        <w:t xml:space="preserve">Across other PCA dimensions, Chicago continues to behave as an outlier.  </w:t>
-      </w:r>
-      <w:proofErr w:type="gramStart"/>
-      <w:r>
-        <w:rPr>
-          <w:rFonts w:ascii="Times New Roman" w:eastAsia="Times New Roman" w:hAnsi="Times New Roman" w:cs="Times New Roman"/>
-          <w:color w:val="333333"/>
-          <w:lang w:val="en-GB"/>
-        </w:rPr>
-        <w:t>high</w:t>
-      </w:r>
-      <w:proofErr w:type="gramEnd"/>
-      <w:r>
-        <w:rPr>
-          <w:rFonts w:ascii="Times New Roman" w:eastAsia="Times New Roman" w:hAnsi="Times New Roman" w:cs="Times New Roman"/>
-          <w:color w:val="333333"/>
-          <w:lang w:val="en-GB"/>
-        </w:rPr>
-        <w:t xml:space="preserve"> temperature, population and manufacturing industries values, reinforcing the idea that it had a unique profile compared with the rest of the cities.</w:t>
+        <w:t>Across other PCA dimensions, Chicago conti</w:t>
+      </w:r>
+      <w:r>
+        <w:rPr>
+          <w:rFonts w:ascii="Times New Roman" w:eastAsia="Times New Roman" w:hAnsi="Times New Roman" w:cs="Times New Roman"/>
+          <w:color w:val="333333"/>
+          <w:lang w:val="en-GB"/>
+        </w:rPr>
+        <w:t>nues to behave as an outlier.  H</w:t>
+      </w:r>
+      <w:bookmarkStart w:id="7" w:name="_GoBack"/>
+      <w:bookmarkEnd w:id="7"/>
+      <w:r>
+        <w:rPr>
+          <w:rFonts w:ascii="Times New Roman" w:eastAsia="Times New Roman" w:hAnsi="Times New Roman" w:cs="Times New Roman"/>
+          <w:color w:val="333333"/>
+          <w:lang w:val="en-GB"/>
+        </w:rPr>
+        <w:t>igh temperature, population and manufacturing industries values, reinforcing the idea that it had a unique profile compared with the rest of the cities.</w:t>
       </w:r>
     </w:p>
     <w:p>
@@ -10785,25 +9567,7 @@
           <w:color w:val="333333"/>
           <w:lang w:val="en-GB"/>
         </w:rPr>
-        <w:t xml:space="preserve">In terms climate-related patterns that are only visible in the </w:t>
-      </w:r>
-      <w:proofErr w:type="spellStart"/>
-      <w:r>
-        <w:rPr>
-          <w:rFonts w:ascii="Times New Roman" w:eastAsia="Times New Roman" w:hAnsi="Times New Roman" w:cs="Times New Roman"/>
-          <w:color w:val="333333"/>
-          <w:lang w:val="en-GB"/>
-        </w:rPr>
-        <w:t>biplot</w:t>
-      </w:r>
-      <w:proofErr w:type="spellEnd"/>
-      <w:r>
-        <w:rPr>
-          <w:rFonts w:ascii="Times New Roman" w:eastAsia="Times New Roman" w:hAnsi="Times New Roman" w:cs="Times New Roman"/>
-          <w:color w:val="333333"/>
-          <w:lang w:val="en-GB"/>
-        </w:rPr>
-        <w:t xml:space="preserve"> from PC2 and PC3, the cities get separated into four climatic groups:</w:t>
+        <w:t>In terms climate-related patterns that are only visible in the biplot from PC2 and PC3, the cities get separated into four climatic groups:</w:t>
       </w:r>
     </w:p>
     <w:p>
@@ -10990,7 +9754,6 @@
         </w:rPr>
         <w:t xml:space="preserve">Our whole project is on </w:t>
       </w:r>
-      <w:proofErr w:type="spellStart"/>
       <w:r>
         <w:rPr>
           <w:rFonts w:ascii="Times New Roman" w:hAnsi="Times New Roman" w:cs="Times New Roman"/>
@@ -11000,7 +9763,6 @@
         </w:rPr>
         <w:t>GitHub</w:t>
       </w:r>
-      <w:proofErr w:type="spellEnd"/>
       <w:r>
         <w:rPr>
           <w:rFonts w:ascii="Times New Roman" w:hAnsi="Times New Roman" w:cs="Times New Roman"/>
@@ -11032,34 +9794,16 @@
           <w:rFonts w:ascii="Times New Roman" w:hAnsi="Times New Roman" w:cs="Times New Roman"/>
           <w:lang w:val="en-GB"/>
         </w:rPr>
-        <w:t xml:space="preserve">. The correct </w:t>
-      </w:r>
-      <w:proofErr w:type="spellStart"/>
+        <w:t xml:space="preserve">. The correct RMarkdown file is </w:t>
+      </w:r>
       <w:r>
         <w:rPr>
           <w:rFonts w:ascii="Times New Roman" w:hAnsi="Times New Roman" w:cs="Times New Roman"/>
-          <w:lang w:val="en-GB"/>
-        </w:rPr>
-        <w:t>RMarkdown</w:t>
-      </w:r>
-      <w:proofErr w:type="spellEnd"/>
-      <w:r>
-        <w:rPr>
-          <w:rFonts w:ascii="Times New Roman" w:hAnsi="Times New Roman" w:cs="Times New Roman"/>
-          <w:lang w:val="en-GB"/>
-        </w:rPr>
-        <w:t xml:space="preserve"> file is </w:t>
-      </w:r>
-      <w:proofErr w:type="spellStart"/>
-      <w:r>
-        <w:rPr>
-          <w:rFonts w:ascii="Times New Roman" w:hAnsi="Times New Roman" w:cs="Times New Roman"/>
           <w:i/>
           <w:lang w:val="en-GB"/>
         </w:rPr>
         <w:t>Code_Project.Rmd</w:t>
       </w:r>
-      <w:proofErr w:type="spellEnd"/>
       <w:r>
         <w:rPr>
           <w:rFonts w:ascii="Times New Roman" w:hAnsi="Times New Roman" w:cs="Times New Roman"/>
@@ -11165,71 +9909,13 @@
           <w:lang w:val="pt-PT"/>
         </w:rPr>
       </w:pPr>
-      <w:proofErr w:type="spellStart"/>
       <w:r>
         <w:rPr>
           <w:rFonts w:ascii="Times New Roman" w:hAnsi="Times New Roman" w:cs="Times New Roman"/>
           <w:lang w:val="en-GB"/>
         </w:rPr>
-        <w:t>Hoekman</w:t>
-      </w:r>
-      <w:proofErr w:type="spellEnd"/>
-      <w:r>
-        <w:rPr>
-          <w:rFonts w:ascii="Times New Roman" w:hAnsi="Times New Roman" w:cs="Times New Roman"/>
-          <w:lang w:val="en-GB"/>
-        </w:rPr>
-        <w:t xml:space="preserve">, S. K., </w:t>
-      </w:r>
-      <w:proofErr w:type="spellStart"/>
-      <w:r>
-        <w:rPr>
-          <w:rFonts w:ascii="Times New Roman" w:hAnsi="Times New Roman" w:cs="Times New Roman"/>
-          <w:lang w:val="en-GB"/>
-        </w:rPr>
-        <w:t>Welstand</w:t>
-      </w:r>
-      <w:proofErr w:type="spellEnd"/>
-      <w:r>
-        <w:rPr>
-          <w:rFonts w:ascii="Times New Roman" w:hAnsi="Times New Roman" w:cs="Times New Roman"/>
-          <w:lang w:val="en-GB"/>
-        </w:rPr>
-        <w:t xml:space="preserve">, J. S., </w:t>
-      </w:r>
-      <w:proofErr w:type="spellStart"/>
-      <w:r>
-        <w:rPr>
-          <w:rFonts w:ascii="Times New Roman" w:hAnsi="Times New Roman" w:cs="Times New Roman"/>
-          <w:lang w:val="en-GB"/>
-        </w:rPr>
-        <w:t>Hoekman</w:t>
-      </w:r>
-      <w:proofErr w:type="spellEnd"/>
-      <w:r>
-        <w:rPr>
-          <w:rFonts w:ascii="Times New Roman" w:hAnsi="Times New Roman" w:cs="Times New Roman"/>
-          <w:lang w:val="en-GB"/>
-        </w:rPr>
-        <w:t xml:space="preserve">, S. K., &amp; </w:t>
-      </w:r>
-      <w:proofErr w:type="spellStart"/>
-      <w:r>
-        <w:rPr>
-          <w:rFonts w:ascii="Times New Roman" w:hAnsi="Times New Roman" w:cs="Times New Roman"/>
-          <w:lang w:val="en-GB"/>
-        </w:rPr>
-        <w:t>Welstand</w:t>
-      </w:r>
-      <w:proofErr w:type="spellEnd"/>
-      <w:r>
-        <w:rPr>
-          <w:rFonts w:ascii="Times New Roman" w:hAnsi="Times New Roman" w:cs="Times New Roman"/>
-          <w:lang w:val="en-GB"/>
-        </w:rPr>
-        <w:t xml:space="preserve">, J. S. (2021). Vehicle Emissions and Air Quality: The Early Years (1940s–1950s). </w:t>
-      </w:r>
-      <w:proofErr w:type="spellStart"/>
+        <w:t xml:space="preserve">Hoekman, S. K., Welstand, J. S., Hoekman, S. K., &amp; Welstand, J. S. (2021). Vehicle Emissions and Air Quality: The Early Years (1940s–1950s). </w:t>
+      </w:r>
       <w:r>
         <w:rPr>
           <w:rFonts w:ascii="Times New Roman" w:hAnsi="Times New Roman" w:cs="Times New Roman"/>
@@ -11237,9 +9923,15 @@
           <w:iCs/>
           <w:lang w:val="pt-PT"/>
         </w:rPr>
-        <w:t>Atmosphere</w:t>
-      </w:r>
-      <w:proofErr w:type="spellEnd"/>
+        <w:t>Atmosphere 2021, Vol. 12,</w:t>
+      </w:r>
+      <w:r>
+        <w:rPr>
+          <w:rFonts w:ascii="Times New Roman" w:hAnsi="Times New Roman" w:cs="Times New Roman"/>
+          <w:lang w:val="pt-PT"/>
+        </w:rPr>
+        <w:t xml:space="preserve"> </w:t>
+      </w:r>
       <w:r>
         <w:rPr>
           <w:rFonts w:ascii="Times New Roman" w:hAnsi="Times New Roman" w:cs="Times New Roman"/>
@@ -11247,39 +9939,14 @@
           <w:iCs/>
           <w:lang w:val="pt-PT"/>
         </w:rPr>
-        <w:t xml:space="preserve"> 2021, Vol. 12,</w:t>
+        <w:t>12</w:t>
       </w:r>
       <w:r>
         <w:rPr>
           <w:rFonts w:ascii="Times New Roman" w:hAnsi="Times New Roman" w:cs="Times New Roman"/>
           <w:lang w:val="pt-PT"/>
         </w:rPr>
-        <w:t xml:space="preserve"> </w:t>
-      </w:r>
-      <w:proofErr w:type="gramStart"/>
-      <w:r>
-        <w:rPr>
-          <w:rFonts w:ascii="Times New Roman" w:hAnsi="Times New Roman" w:cs="Times New Roman"/>
-          <w:i/>
-          <w:iCs/>
-          <w:lang w:val="pt-PT"/>
-        </w:rPr>
-        <w:t>12</w:t>
-      </w:r>
-      <w:r>
-        <w:rPr>
-          <w:rFonts w:ascii="Times New Roman" w:hAnsi="Times New Roman" w:cs="Times New Roman"/>
-          <w:lang w:val="pt-PT"/>
-        </w:rPr>
-        <w:t>(10</w:t>
-      </w:r>
-      <w:proofErr w:type="gramEnd"/>
-      <w:r>
-        <w:rPr>
-          <w:rFonts w:ascii="Times New Roman" w:hAnsi="Times New Roman" w:cs="Times New Roman"/>
-          <w:lang w:val="pt-PT"/>
-        </w:rPr>
-        <w:t xml:space="preserve">). </w:t>
+        <w:t xml:space="preserve">(10). </w:t>
       </w:r>
       <w:hyperlink r:id="rId34" w:history="1">
         <w:r>
@@ -11384,64 +10051,8 @@
           <w:color w:val="222222"/>
           <w:highlight w:val="white"/>
         </w:rPr>
-        <w:t xml:space="preserve">Yin, H., </w:t>
-      </w:r>
-      <w:proofErr w:type="spellStart"/>
-      <w:r>
-        <w:rPr>
-          <w:rFonts w:ascii="Times New Roman" w:eastAsia="Times New Roman" w:hAnsi="Times New Roman" w:cs="Times New Roman"/>
-          <w:color w:val="222222"/>
-          <w:highlight w:val="white"/>
-        </w:rPr>
-        <w:t>Aryani</w:t>
-      </w:r>
-      <w:proofErr w:type="spellEnd"/>
-      <w:r>
-        <w:rPr>
-          <w:rFonts w:ascii="Times New Roman" w:eastAsia="Times New Roman" w:hAnsi="Times New Roman" w:cs="Times New Roman"/>
-          <w:color w:val="222222"/>
-          <w:highlight w:val="white"/>
-        </w:rPr>
-        <w:t xml:space="preserve">, A., Petrie, S., </w:t>
-      </w:r>
-      <w:proofErr w:type="spellStart"/>
-      <w:r>
-        <w:rPr>
-          <w:rFonts w:ascii="Times New Roman" w:eastAsia="Times New Roman" w:hAnsi="Times New Roman" w:cs="Times New Roman"/>
-          <w:color w:val="222222"/>
-          <w:highlight w:val="white"/>
-        </w:rPr>
-        <w:t>Nambissan</w:t>
-      </w:r>
-      <w:proofErr w:type="spellEnd"/>
-      <w:r>
-        <w:rPr>
-          <w:rFonts w:ascii="Times New Roman" w:eastAsia="Times New Roman" w:hAnsi="Times New Roman" w:cs="Times New Roman"/>
-          <w:color w:val="222222"/>
-          <w:highlight w:val="white"/>
-        </w:rPr>
-        <w:t xml:space="preserve">, A., </w:t>
-      </w:r>
-      <w:proofErr w:type="spellStart"/>
-      <w:r>
-        <w:rPr>
-          <w:rFonts w:ascii="Times New Roman" w:eastAsia="Times New Roman" w:hAnsi="Times New Roman" w:cs="Times New Roman"/>
-          <w:color w:val="222222"/>
-          <w:highlight w:val="white"/>
-        </w:rPr>
-        <w:t>Astudillo</w:t>
-      </w:r>
-      <w:proofErr w:type="spellEnd"/>
-      <w:r>
-        <w:rPr>
-          <w:rFonts w:ascii="Times New Roman" w:eastAsia="Times New Roman" w:hAnsi="Times New Roman" w:cs="Times New Roman"/>
-          <w:color w:val="222222"/>
-          <w:highlight w:val="white"/>
-        </w:rPr>
-        <w:t xml:space="preserve">, A., &amp; Cao, S. (2024). A rapid review of clustering algorithms. </w:t>
-      </w:r>
-      <w:proofErr w:type="spellStart"/>
-      <w:proofErr w:type="gramStart"/>
+        <w:t xml:space="preserve">Yin, H., Aryani, A., Petrie, S., Nambissan, A., Astudillo, A., &amp; Cao, S. (2024). A rapid review of clustering algorithms. </w:t>
+      </w:r>
       <w:r>
         <w:rPr>
           <w:rFonts w:ascii="Times New Roman" w:eastAsia="Times New Roman" w:hAnsi="Times New Roman" w:cs="Times New Roman"/>
@@ -11450,19 +10061,7 @@
           <w:color w:val="222222"/>
           <w:highlight w:val="white"/>
         </w:rPr>
-        <w:t>arXiv</w:t>
-      </w:r>
-      <w:proofErr w:type="spellEnd"/>
-      <w:proofErr w:type="gramEnd"/>
-      <w:r>
-        <w:rPr>
-          <w:rFonts w:ascii="Times New Roman" w:eastAsia="Times New Roman" w:hAnsi="Times New Roman" w:cs="Times New Roman"/>
-          <w:i/>
-          <w:iCs/>
-          <w:color w:val="222222"/>
-          <w:highlight w:val="white"/>
-        </w:rPr>
-        <w:t xml:space="preserve"> preprint arXiv:2401.07389</w:t>
+        <w:t>arXiv preprint arXiv:2401.07389</w:t>
       </w:r>
       <w:r>
         <w:rPr>
@@ -11522,81 +10121,21 @@
           <w:highlight w:val="white"/>
         </w:rPr>
       </w:pPr>
-      <w:proofErr w:type="spellStart"/>
       <w:r>
         <w:rPr>
           <w:rFonts w:ascii="Times New Roman" w:eastAsia="Times New Roman" w:hAnsi="Times New Roman" w:cs="Times New Roman"/>
           <w:szCs w:val="24"/>
         </w:rPr>
-        <w:t>Saraçli</w:t>
-      </w:r>
-      <w:proofErr w:type="spellEnd"/>
+        <w:t xml:space="preserve">Saraçli, S., Doǧan, N., &amp; Doǧan, I. (2013). </w:t>
+      </w:r>
       <w:r>
         <w:rPr>
           <w:rFonts w:ascii="Times New Roman" w:eastAsia="Times New Roman" w:hAnsi="Times New Roman" w:cs="Times New Roman"/>
           <w:szCs w:val="24"/>
-        </w:rPr>
-        <w:t xml:space="preserve">, S., </w:t>
-      </w:r>
-      <w:proofErr w:type="spellStart"/>
-      <w:r>
-        <w:rPr>
-          <w:rFonts w:ascii="Times New Roman" w:eastAsia="Times New Roman" w:hAnsi="Times New Roman" w:cs="Times New Roman"/>
-          <w:szCs w:val="24"/>
-        </w:rPr>
-        <w:t>Doǧan</w:t>
-      </w:r>
-      <w:proofErr w:type="spellEnd"/>
-      <w:r>
-        <w:rPr>
-          <w:rFonts w:ascii="Times New Roman" w:eastAsia="Times New Roman" w:hAnsi="Times New Roman" w:cs="Times New Roman"/>
-          <w:szCs w:val="24"/>
-        </w:rPr>
-        <w:t xml:space="preserve">, N., &amp; </w:t>
-      </w:r>
-      <w:proofErr w:type="spellStart"/>
-      <w:r>
-        <w:rPr>
-          <w:rFonts w:ascii="Times New Roman" w:eastAsia="Times New Roman" w:hAnsi="Times New Roman" w:cs="Times New Roman"/>
-          <w:szCs w:val="24"/>
-        </w:rPr>
-        <w:t>Doǧan</w:t>
-      </w:r>
-      <w:proofErr w:type="spellEnd"/>
-      <w:r>
-        <w:rPr>
-          <w:rFonts w:ascii="Times New Roman" w:eastAsia="Times New Roman" w:hAnsi="Times New Roman" w:cs="Times New Roman"/>
-          <w:szCs w:val="24"/>
-        </w:rPr>
-        <w:t xml:space="preserve">, I. (2013). </w:t>
-      </w:r>
-      <w:r>
-        <w:rPr>
-          <w:rFonts w:ascii="Times New Roman" w:eastAsia="Times New Roman" w:hAnsi="Times New Roman" w:cs="Times New Roman"/>
-          <w:szCs w:val="24"/>
-          <w:lang w:val="en-GB"/>
-        </w:rPr>
-        <w:t xml:space="preserve">Comparison of hierarchical cluster analysis methods by </w:t>
-      </w:r>
-      <w:proofErr w:type="spellStart"/>
-      <w:r>
-        <w:rPr>
-          <w:rFonts w:ascii="Times New Roman" w:eastAsia="Times New Roman" w:hAnsi="Times New Roman" w:cs="Times New Roman"/>
-          <w:szCs w:val="24"/>
-          <w:lang w:val="en-GB"/>
-        </w:rPr>
-        <w:t>cophenetic</w:t>
-      </w:r>
-      <w:proofErr w:type="spellEnd"/>
-      <w:r>
-        <w:rPr>
-          <w:rFonts w:ascii="Times New Roman" w:eastAsia="Times New Roman" w:hAnsi="Times New Roman" w:cs="Times New Roman"/>
-          <w:szCs w:val="24"/>
-          <w:lang w:val="en-GB"/>
-        </w:rPr>
-        <w:t xml:space="preserve"> correlation. </w:t>
-      </w:r>
-      <w:proofErr w:type="spellStart"/>
+          <w:lang w:val="en-GB"/>
+        </w:rPr>
+        <w:t xml:space="preserve">Comparison of hierarchical cluster analysis methods by cophenetic correlation. </w:t>
+      </w:r>
       <w:r>
         <w:rPr>
           <w:rFonts w:ascii="Times New Roman" w:eastAsia="Times New Roman" w:hAnsi="Times New Roman" w:cs="Times New Roman"/>
@@ -11605,9 +10144,16 @@
           <w:szCs w:val="24"/>
           <w:lang w:val="pt-PT"/>
         </w:rPr>
-        <w:t>Journal</w:t>
-      </w:r>
-      <w:proofErr w:type="spellEnd"/>
+        <w:t>Journal of Inequalities and Applications 2013 2013:1</w:t>
+      </w:r>
+      <w:r>
+        <w:rPr>
+          <w:rFonts w:ascii="Times New Roman" w:eastAsia="Times New Roman" w:hAnsi="Times New Roman" w:cs="Times New Roman"/>
+          <w:szCs w:val="24"/>
+          <w:lang w:val="pt-PT"/>
+        </w:rPr>
+        <w:t xml:space="preserve">, </w:t>
+      </w:r>
       <w:r>
         <w:rPr>
           <w:rFonts w:ascii="Times New Roman" w:eastAsia="Times New Roman" w:hAnsi="Times New Roman" w:cs="Times New Roman"/>
@@ -11616,131 +10162,15 @@
           <w:szCs w:val="24"/>
           <w:lang w:val="pt-PT"/>
         </w:rPr>
-        <w:t xml:space="preserve"> </w:t>
-      </w:r>
-      <w:proofErr w:type="spellStart"/>
-      <w:r>
-        <w:rPr>
-          <w:rFonts w:ascii="Times New Roman" w:eastAsia="Times New Roman" w:hAnsi="Times New Roman" w:cs="Times New Roman"/>
-          <w:i/>
-          <w:iCs/>
+        <w:t>2013</w:t>
+      </w:r>
+      <w:r>
+        <w:rPr>
+          <w:rFonts w:ascii="Times New Roman" w:eastAsia="Times New Roman" w:hAnsi="Times New Roman" w:cs="Times New Roman"/>
           <w:szCs w:val="24"/>
           <w:lang w:val="pt-PT"/>
         </w:rPr>
-        <w:t>of</w:t>
-      </w:r>
-      <w:proofErr w:type="spellEnd"/>
-      <w:r>
-        <w:rPr>
-          <w:rFonts w:ascii="Times New Roman" w:eastAsia="Times New Roman" w:hAnsi="Times New Roman" w:cs="Times New Roman"/>
-          <w:i/>
-          <w:iCs/>
-          <w:szCs w:val="24"/>
-          <w:lang w:val="pt-PT"/>
-        </w:rPr>
-        <w:t xml:space="preserve"> </w:t>
-      </w:r>
-      <w:proofErr w:type="spellStart"/>
-      <w:r>
-        <w:rPr>
-          <w:rFonts w:ascii="Times New Roman" w:eastAsia="Times New Roman" w:hAnsi="Times New Roman" w:cs="Times New Roman"/>
-          <w:i/>
-          <w:iCs/>
-          <w:szCs w:val="24"/>
-          <w:lang w:val="pt-PT"/>
-        </w:rPr>
-        <w:t>Inequalities</w:t>
-      </w:r>
-      <w:proofErr w:type="spellEnd"/>
-      <w:r>
-        <w:rPr>
-          <w:rFonts w:ascii="Times New Roman" w:eastAsia="Times New Roman" w:hAnsi="Times New Roman" w:cs="Times New Roman"/>
-          <w:i/>
-          <w:iCs/>
-          <w:szCs w:val="24"/>
-          <w:lang w:val="pt-PT"/>
-        </w:rPr>
-        <w:t xml:space="preserve"> </w:t>
-      </w:r>
-      <w:proofErr w:type="spellStart"/>
-      <w:r>
-        <w:rPr>
-          <w:rFonts w:ascii="Times New Roman" w:eastAsia="Times New Roman" w:hAnsi="Times New Roman" w:cs="Times New Roman"/>
-          <w:i/>
-          <w:iCs/>
-          <w:szCs w:val="24"/>
-          <w:lang w:val="pt-PT"/>
-        </w:rPr>
-        <w:t>and</w:t>
-      </w:r>
-      <w:proofErr w:type="spellEnd"/>
-      <w:r>
-        <w:rPr>
-          <w:rFonts w:ascii="Times New Roman" w:eastAsia="Times New Roman" w:hAnsi="Times New Roman" w:cs="Times New Roman"/>
-          <w:i/>
-          <w:iCs/>
-          <w:szCs w:val="24"/>
-          <w:lang w:val="pt-PT"/>
-        </w:rPr>
-        <w:t xml:space="preserve"> </w:t>
-      </w:r>
-      <w:proofErr w:type="spellStart"/>
-      <w:r>
-        <w:rPr>
-          <w:rFonts w:ascii="Times New Roman" w:eastAsia="Times New Roman" w:hAnsi="Times New Roman" w:cs="Times New Roman"/>
-          <w:i/>
-          <w:iCs/>
-          <w:szCs w:val="24"/>
-          <w:lang w:val="pt-PT"/>
-        </w:rPr>
-        <w:t>Applications</w:t>
-      </w:r>
-      <w:proofErr w:type="spellEnd"/>
-      <w:r>
-        <w:rPr>
-          <w:rFonts w:ascii="Times New Roman" w:eastAsia="Times New Roman" w:hAnsi="Times New Roman" w:cs="Times New Roman"/>
-          <w:i/>
-          <w:iCs/>
-          <w:szCs w:val="24"/>
-          <w:lang w:val="pt-PT"/>
-        </w:rPr>
-        <w:t xml:space="preserve"> 2013 2013:1</w:t>
-      </w:r>
-      <w:r>
-        <w:rPr>
-          <w:rFonts w:ascii="Times New Roman" w:eastAsia="Times New Roman" w:hAnsi="Times New Roman" w:cs="Times New Roman"/>
-          <w:szCs w:val="24"/>
-          <w:lang w:val="pt-PT"/>
-        </w:rPr>
-        <w:t xml:space="preserve">, </w:t>
-      </w:r>
-      <w:proofErr w:type="gramStart"/>
-      <w:r>
-        <w:rPr>
-          <w:rFonts w:ascii="Times New Roman" w:eastAsia="Times New Roman" w:hAnsi="Times New Roman" w:cs="Times New Roman"/>
-          <w:i/>
-          <w:iCs/>
-          <w:szCs w:val="24"/>
-          <w:lang w:val="pt-PT"/>
-        </w:rPr>
-        <w:t>2013</w:t>
-      </w:r>
-      <w:r>
-        <w:rPr>
-          <w:rFonts w:ascii="Times New Roman" w:eastAsia="Times New Roman" w:hAnsi="Times New Roman" w:cs="Times New Roman"/>
-          <w:szCs w:val="24"/>
-          <w:lang w:val="pt-PT"/>
-        </w:rPr>
-        <w:t>(1</w:t>
-      </w:r>
-      <w:proofErr w:type="gramEnd"/>
-      <w:r>
-        <w:rPr>
-          <w:rFonts w:ascii="Times New Roman" w:eastAsia="Times New Roman" w:hAnsi="Times New Roman" w:cs="Times New Roman"/>
-          <w:szCs w:val="24"/>
-          <w:lang w:val="pt-PT"/>
-        </w:rPr>
-        <w:t xml:space="preserve">), 203-. </w:t>
+        <w:t xml:space="preserve">(1), 203-. </w:t>
       </w:r>
       <w:hyperlink r:id="rId38" w:history="1">
         <w:r>
@@ -11847,7 +10277,7 @@
             <w:noProof/>
             <w:lang w:val="pt-PT"/>
           </w:rPr>
-          <w:t>18</w:t>
+          <w:t>17</w:t>
         </w:r>
         <w:r>
           <w:fldChar w:fldCharType="end"/>
@@ -13356,6 +11786,7 @@
     <w:rsid w:val="00434003"/>
     <w:rsid w:val="00643747"/>
     <w:rsid w:val="0085669D"/>
+    <w:rsid w:val="00A9695B"/>
     <w:rsid w:val="00DB769D"/>
   </w:rsids>
   <m:mathPr>
@@ -14084,7 +12515,7 @@
 </file>
 
 <file path=customXml/itemProps1.xml><?xml version="1.0" encoding="utf-8"?>
-<ds:datastoreItem xmlns:ds="http://schemas.openxmlformats.org/officeDocument/2006/customXml" ds:itemID="{51AD3938-D65C-4F72-B0BE-CB263273745B}">
+<ds:datastoreItem xmlns:ds="http://schemas.openxmlformats.org/officeDocument/2006/customXml" ds:itemID="{260135C6-29E1-46B8-A4D7-7E89B37ECBE3}">
   <ds:schemaRefs>
     <ds:schemaRef ds:uri="http://schemas.openxmlformats.org/officeDocument/2006/bibliography"/>
   </ds:schemaRefs>

</xml_diff>